<commit_message>
task-2341: the Word plugin in the window, exports, kerning, and the Word oracle
- services::word: one Doc per tab (session, layout, view), the shared action list, and plugins run word
- components::word: the page view (glyphs from the window's atlas at Word's sizes), the format bar, the
  drill down panel, the slash menu, the Ctrl+/ search, the selection bubble, find, navigation, settings
- window hooks: .docx opens in a Word tab, Save and Save As, saving on close, the unsaved dot, and chords
  a Word tab claims kept from the menus
- unluminous-word: export to text, Markdown, HTML and PDF with embedded fonts, pictures, GPOS kerning
- the larger of two paragraph spacings, as Word does; page counts now match Word on every fixture and
  lines break where Word breaks them in Calibri, Times New Roman and Arial
- tools/word-oracle: Word COM inspect and the fixtures, made by a sub agent
</commit_message>
<xml_diff>
--- a/crates/unluminous-word/templates/builtin-styles.docx
+++ b/crates/unluminous-word/templates/builtin-styles.docx
@@ -2,6 +2,364 @@
 <file path=word/document.xml><?xml version="1.0" encoding="utf-8"?>
 <w:document xmlns:wpc="http://schemas.microsoft.com/office/word/2010/wordprocessingCanvas" xmlns:cx="http://schemas.microsoft.com/office/drawing/2014/chartex" xmlns:cx1="http://schemas.microsoft.com/office/drawing/2015/9/8/chartex" xmlns:cx2="http://schemas.microsoft.com/office/drawing/2015/10/21/chartex" xmlns:cx3="http://schemas.microsoft.com/office/drawing/2016/5/9/chartex" xmlns:cx4="http://schemas.microsoft.com/office/drawing/2016/5/10/chartex" xmlns:cx5="http://schemas.microsoft.com/office/drawing/2016/5/11/chartex" xmlns:cx6="http://schemas.microsoft.com/office/drawing/2016/5/12/chartex" xmlns:cx7="http://schemas.microsoft.com/office/drawing/2016/5/13/chartex" xmlns:cx8="http://schemas.microsoft.com/office/drawing/2016/5/14/chartex" xmlns:mc="http://schemas.openxmlformats.org/markup-compatibility/2006" xmlns:aink="http://schemas.microsoft.com/office/drawing/2016/ink" xmlns:am3d="http://schemas.microsoft.com/office/drawing/2017/model3d" xmlns:o="urn:schemas-microsoft-com:office:office" xmlns:oel="http://schemas.microsoft.com/office/2019/extlst" xmlns:r="http://schemas.openxmlformats.org/officeDocument/2006/relationships" xmlns:m="http://schemas.openxmlformats.org/officeDocument/2006/math" xmlns:v="urn:schemas-microsoft-com:vml" xmlns:wp14="http://schemas.microsoft.com/office/word/2010/wordprocessingDrawing" xmlns:wp="http://schemas.openxmlformats.org/drawingml/2006/wordprocessingDrawing" xmlns:w10="urn:schemas-microsoft-com:office:word" xmlns:w="http://schemas.openxmlformats.org/wordprocessingml/2006/main" xmlns:w14="http://schemas.microsoft.com/office/word/2010/wordml" xmlns:w15="http://schemas.microsoft.com/office/word/2012/wordml" xmlns:w16cex="http://schemas.microsoft.com/office/word/2018/wordml/cex" xmlns:w16cid="http://schemas.microsoft.com/office/word/2016/wordml/cid" xmlns:w16="http://schemas.microsoft.com/office/word/2018/wordml" xmlns:w16du="http://schemas.microsoft.com/office/word/2023/wordml/word16du" xmlns:w16sdtdh="http://schemas.microsoft.com/office/word/2020/wordml/sdtdatahash" xmlns:w16sdtfl="http://schemas.microsoft.com/office/word/2024/wordml/sdtformatlock" xmlns:w16se="http://schemas.microsoft.com/office/word/2015/wordml/symex" xmlns:wpg="http://schemas.microsoft.com/office/word/2010/wordprocessingGroup" xmlns:wpi="http://schemas.microsoft.com/office/word/2010/wordprocessingInk" xmlns:wne="http://schemas.microsoft.com/office/word/2006/wordml" xmlns:wps="http://schemas.microsoft.com/office/word/2010/wordprocessingShape" mc:Ignorable="w14 w15 w16se w16cid w16 w16cex w16sdtdh w16sdtfl w16du wp14">
   <w:body>
+    <w:p>
+      <w:r>
+        <w:t>Normal paragraph</w:t>
+      </w:r>
+    </w:p>
+    <w:p>
+      <w:pPr>
+        <w:pStyle w:val="Title"/>
+      </w:pPr>
+      <w:r>
+        <w:t>Title paragraph</w:t>
+      </w:r>
+    </w:p>
+    <w:p>
+      <w:pPr>
+        <w:pStyle w:val="Subtitle"/>
+      </w:pPr>
+      <w:r>
+        <w:t>Subtitle paragraph</w:t>
+      </w:r>
+    </w:p>
+    <w:p>
+      <w:pPr>
+        <w:pStyle w:val="Heading1"/>
+      </w:pPr>
+      <w:r>
+        <w:t>Heading 1 paragraph</w:t>
+      </w:r>
+    </w:p>
+    <w:p>
+      <w:pPr>
+        <w:pStyle w:val="Heading2"/>
+      </w:pPr>
+      <w:r>
+        <w:t>Heading 2 paragraph</w:t>
+      </w:r>
+    </w:p>
+    <w:p>
+      <w:pPr>
+        <w:pStyle w:val="Heading3"/>
+      </w:pPr>
+      <w:r>
+        <w:t>Heading 3 paragraph</w:t>
+      </w:r>
+    </w:p>
+    <w:p>
+      <w:pPr>
+        <w:pStyle w:val="Heading4"/>
+      </w:pPr>
+      <w:r>
+        <w:t xml:space="preserve">Heading </w:t>
+      </w:r>
+      <w:proofErr w:type="gramStart"/>
+      <w:r>
+        <w:t>4 paragraph</w:t>
+      </w:r>
+      <w:proofErr w:type="gramEnd"/>
+    </w:p>
+    <w:p>
+      <w:pPr>
+        <w:pStyle w:val="Heading5"/>
+      </w:pPr>
+      <w:r>
+        <w:t>Heading 5 paragraph</w:t>
+      </w:r>
+    </w:p>
+    <w:p>
+      <w:pPr>
+        <w:pStyle w:val="Heading6"/>
+      </w:pPr>
+      <w:r>
+        <w:t xml:space="preserve">Heading </w:t>
+      </w:r>
+      <w:proofErr w:type="gramStart"/>
+      <w:r>
+        <w:t>6 paragraph</w:t>
+      </w:r>
+      <w:proofErr w:type="gramEnd"/>
+    </w:p>
+    <w:p>
+      <w:pPr>
+        <w:pStyle w:val="Heading7"/>
+      </w:pPr>
+      <w:r>
+        <w:t>Heading 7 paragraph</w:t>
+      </w:r>
+    </w:p>
+    <w:p>
+      <w:pPr>
+        <w:pStyle w:val="Heading8"/>
+      </w:pPr>
+      <w:r>
+        <w:t xml:space="preserve">Heading </w:t>
+      </w:r>
+      <w:proofErr w:type="gramStart"/>
+      <w:r>
+        <w:t>8 paragraph</w:t>
+      </w:r>
+      <w:proofErr w:type="gramEnd"/>
+    </w:p>
+    <w:p>
+      <w:pPr>
+        <w:pStyle w:val="Heading9"/>
+      </w:pPr>
+      <w:r>
+        <w:t>Heading 9 paragraph</w:t>
+      </w:r>
+    </w:p>
+    <w:p>
+      <w:pPr>
+        <w:pStyle w:val="Quote"/>
+      </w:pPr>
+      <w:r>
+        <w:t>Quote paragraph</w:t>
+      </w:r>
+    </w:p>
+    <w:p>
+      <w:pPr>
+        <w:pStyle w:val="IntenseQuote"/>
+      </w:pPr>
+      <w:r>
+        <w:t>Intense Quote paragraph</w:t>
+      </w:r>
+    </w:p>
+    <w:p>
+      <w:pPr>
+        <w:pStyle w:val="NoSpacing"/>
+      </w:pPr>
+      <w:r>
+        <w:t>No Spacing paragraph</w:t>
+      </w:r>
+    </w:p>
+    <w:p>
+      <w:pPr>
+        <w:pStyle w:val="ListParagraph"/>
+      </w:pPr>
+      <w:r>
+        <w:t>List Paragraph paragraph</w:t>
+      </w:r>
+    </w:p>
+    <w:p>
+      <w:pPr>
+        <w:pStyle w:val="Caption"/>
+      </w:pPr>
+      <w:r>
+        <w:t>Caption paragraph</w:t>
+      </w:r>
+    </w:p>
+    <w:p>
+      <w:pPr>
+        <w:pStyle w:val="TOCHeading"/>
+      </w:pPr>
+      <w:r>
+        <w:t>TOC Heading paragraph</w:t>
+      </w:r>
+    </w:p>
+    <w:p>
+      <w:pPr>
+        <w:pStyle w:val="TOC1"/>
+      </w:pPr>
+      <w:r>
+        <w:t>TOC 1 paragraph</w:t>
+      </w:r>
+    </w:p>
+    <w:p>
+      <w:pPr>
+        <w:pStyle w:val="TOC2"/>
+      </w:pPr>
+      <w:r>
+        <w:t>TOC 2 paragraph</w:t>
+      </w:r>
+    </w:p>
+    <w:p>
+      <w:pPr>
+        <w:pStyle w:val="TOC3"/>
+      </w:pPr>
+      <w:r>
+        <w:t>TOC 3 paragraph</w:t>
+      </w:r>
+    </w:p>
+    <w:p>
+      <w:pPr>
+        <w:pStyle w:val="FootnoteText"/>
+      </w:pPr>
+      <w:r>
+        <w:t>Footnote Text paragraph</w:t>
+      </w:r>
+    </w:p>
+    <w:p>
+      <w:pPr>
+        <w:pStyle w:val="EndnoteText"/>
+      </w:pPr>
+      <w:r>
+        <w:t>Endnote Text paragraph</w:t>
+      </w:r>
+    </w:p>
+    <w:p>
+      <w:pPr>
+        <w:pStyle w:val="Header"/>
+      </w:pPr>
+      <w:r>
+        <w:t>Header paragraph</w:t>
+      </w:r>
+    </w:p>
+    <w:p>
+      <w:pPr>
+        <w:pStyle w:val="Footer"/>
+      </w:pPr>
+      <w:r>
+        <w:t>Footer paragraph</w:t>
+      </w:r>
+    </w:p>
+    <w:p>
+      <w:r>
+        <w:t xml:space="preserve">Sample </w:t>
+      </w:r>
+      <w:r>
+        <w:rPr>
+          <w:rStyle w:val="Strong"/>
+        </w:rPr>
+        <w:t>Strong</w:t>
+      </w:r>
+      <w:r>
+        <w:t xml:space="preserve"> text</w:t>
+      </w:r>
+    </w:p>
+    <w:p>
+      <w:r>
+        <w:t xml:space="preserve">Sample </w:t>
+      </w:r>
+      <w:r>
+        <w:rPr>
+          <w:rStyle w:val="Emphasis"/>
+        </w:rPr>
+        <w:t>Emphasis</w:t>
+      </w:r>
+      <w:r>
+        <w:t xml:space="preserve"> text</w:t>
+      </w:r>
+    </w:p>
+    <w:p>
+      <w:r>
+        <w:lastRenderedPageBreak/>
+        <w:t xml:space="preserve">Sample </w:t>
+      </w:r>
+      <w:r>
+        <w:rPr>
+          <w:rStyle w:val="IntenseEmphasis"/>
+        </w:rPr>
+        <w:t>Intense Emphasis</w:t>
+      </w:r>
+      <w:r>
+        <w:t xml:space="preserve"> text</w:t>
+      </w:r>
+    </w:p>
+    <w:p>
+      <w:r>
+        <w:t xml:space="preserve">Sample </w:t>
+      </w:r>
+      <w:r>
+        <w:rPr>
+          <w:rStyle w:val="SubtleEmphasis"/>
+        </w:rPr>
+        <w:t>Subtle Emphasis</w:t>
+      </w:r>
+      <w:r>
+        <w:t xml:space="preserve"> text</w:t>
+      </w:r>
+    </w:p>
+    <w:p>
+      <w:r>
+        <w:t xml:space="preserve">Sample </w:t>
+      </w:r>
+      <w:r>
+        <w:rPr>
+          <w:rStyle w:val="Hyperlink"/>
+        </w:rPr>
+        <w:t>Hyperlink</w:t>
+      </w:r>
+      <w:r>
+        <w:t xml:space="preserve"> text</w:t>
+      </w:r>
+    </w:p>
+    <w:p>
+      <w:r>
+        <w:t xml:space="preserve">Sample </w:t>
+      </w:r>
+      <w:r>
+        <w:rPr>
+          <w:rStyle w:val="FootnoteReference"/>
+        </w:rPr>
+        <w:t>Footnote Reference</w:t>
+      </w:r>
+      <w:r>
+        <w:t xml:space="preserve"> text</w:t>
+      </w:r>
+    </w:p>
+    <w:p>
+      <w:r>
+        <w:t>Table Grid style:</w:t>
+      </w:r>
+    </w:p>
+    <w:tbl>
+      <w:tblPr>
+        <w:tblStyle w:val="TableGrid"/>
+        <w:tblW w:w="0" w:type="auto"/>
+        <w:tblLayout w:type="fixed"/>
+        <w:tblLook w:val="04A0" w:firstRow="1" w:lastRow="0" w:firstColumn="1" w:lastColumn="0" w:noHBand="0" w:noVBand="1"/>
+      </w:tblPr>
+      <w:tblGrid>
+        <w:gridCol w:w="4680"/>
+        <w:gridCol w:w="4680"/>
+      </w:tblGrid>
+      <w:tr>
+        <w:tc>
+          <w:tcPr>
+            <w:tcW w:w="4680" w:type="dxa"/>
+          </w:tcPr>
+          <w:p>
+            <w:r>
+              <w:t>G11</w:t>
+            </w:r>
+          </w:p>
+        </w:tc>
+        <w:tc>
+          <w:tcPr>
+            <w:tcW w:w="4680" w:type="dxa"/>
+          </w:tcPr>
+          <w:p>
+            <w:r>
+              <w:t>G12</w:t>
+            </w:r>
+          </w:p>
+        </w:tc>
+      </w:tr>
+      <w:tr>
+        <w:tc>
+          <w:tcPr>
+            <w:tcW w:w="4680" w:type="dxa"/>
+          </w:tcPr>
+          <w:p>
+            <w:r>
+              <w:t>G21</w:t>
+            </w:r>
+          </w:p>
+        </w:tc>
+        <w:tc>
+          <w:tcPr>
+            <w:tcW w:w="4680" w:type="dxa"/>
+          </w:tcPr>
+          <w:p>
+            <w:r>
+              <w:t>G22</w:t>
+            </w:r>
+          </w:p>
+        </w:tc>
+      </w:tr>
+    </w:tbl>
     <w:p/>
     <w:sectPr>
       <w:pgSz w:w="12240" w:h="15840"/>
@@ -421,7 +779,7 @@
     <w:link w:val="Heading1Char"/>
     <w:uiPriority w:val="9"/>
     <w:qFormat/>
-    <w:rsid w:val="00E819AE"/>
+    <w:rsid w:val="00892F25"/>
     <w:pPr>
       <w:keepNext/>
       <w:keepLines/>
@@ -441,10 +799,9 @@
     <w:next w:val="Normal"/>
     <w:link w:val="Heading2Char"/>
     <w:uiPriority w:val="9"/>
-    <w:semiHidden/>
-    <w:unhideWhenUsed/>
-    <w:qFormat/>
-    <w:rsid w:val="00E819AE"/>
+    <w:unhideWhenUsed/>
+    <w:qFormat/>
+    <w:rsid w:val="00892F25"/>
     <w:pPr>
       <w:keepNext/>
       <w:keepLines/>
@@ -464,10 +821,9 @@
     <w:next w:val="Normal"/>
     <w:link w:val="Heading3Char"/>
     <w:uiPriority w:val="9"/>
-    <w:semiHidden/>
-    <w:unhideWhenUsed/>
-    <w:qFormat/>
-    <w:rsid w:val="00E819AE"/>
+    <w:unhideWhenUsed/>
+    <w:qFormat/>
+    <w:rsid w:val="00892F25"/>
     <w:pPr>
       <w:keepNext/>
       <w:keepLines/>
@@ -487,10 +843,9 @@
     <w:next w:val="Normal"/>
     <w:link w:val="Heading4Char"/>
     <w:uiPriority w:val="9"/>
-    <w:semiHidden/>
-    <w:unhideWhenUsed/>
-    <w:qFormat/>
-    <w:rsid w:val="00E819AE"/>
+    <w:unhideWhenUsed/>
+    <w:qFormat/>
+    <w:rsid w:val="00892F25"/>
     <w:pPr>
       <w:keepNext/>
       <w:keepLines/>
@@ -510,10 +865,9 @@
     <w:next w:val="Normal"/>
     <w:link w:val="Heading5Char"/>
     <w:uiPriority w:val="9"/>
-    <w:semiHidden/>
-    <w:unhideWhenUsed/>
-    <w:qFormat/>
-    <w:rsid w:val="00E819AE"/>
+    <w:unhideWhenUsed/>
+    <w:qFormat/>
+    <w:rsid w:val="00892F25"/>
     <w:pPr>
       <w:keepNext/>
       <w:keepLines/>
@@ -531,10 +885,9 @@
     <w:next w:val="Normal"/>
     <w:link w:val="Heading6Char"/>
     <w:uiPriority w:val="9"/>
-    <w:semiHidden/>
-    <w:unhideWhenUsed/>
-    <w:qFormat/>
-    <w:rsid w:val="00E819AE"/>
+    <w:unhideWhenUsed/>
+    <w:qFormat/>
+    <w:rsid w:val="00892F25"/>
     <w:pPr>
       <w:keepNext/>
       <w:keepLines/>
@@ -554,10 +907,9 @@
     <w:next w:val="Normal"/>
     <w:link w:val="Heading7Char"/>
     <w:uiPriority w:val="9"/>
-    <w:semiHidden/>
-    <w:unhideWhenUsed/>
-    <w:qFormat/>
-    <w:rsid w:val="00E819AE"/>
+    <w:unhideWhenUsed/>
+    <w:qFormat/>
+    <w:rsid w:val="00892F25"/>
     <w:pPr>
       <w:keepNext/>
       <w:keepLines/>
@@ -575,10 +927,9 @@
     <w:next w:val="Normal"/>
     <w:link w:val="Heading8Char"/>
     <w:uiPriority w:val="9"/>
-    <w:semiHidden/>
-    <w:unhideWhenUsed/>
-    <w:qFormat/>
-    <w:rsid w:val="00E819AE"/>
+    <w:unhideWhenUsed/>
+    <w:qFormat/>
+    <w:rsid w:val="00892F25"/>
     <w:pPr>
       <w:keepNext/>
       <w:keepLines/>
@@ -598,10 +949,9 @@
     <w:next w:val="Normal"/>
     <w:link w:val="Heading9Char"/>
     <w:uiPriority w:val="9"/>
-    <w:semiHidden/>
-    <w:unhideWhenUsed/>
-    <w:qFormat/>
-    <w:rsid w:val="00E819AE"/>
+    <w:unhideWhenUsed/>
+    <w:qFormat/>
+    <w:rsid w:val="00892F25"/>
     <w:pPr>
       <w:keepNext/>
       <w:keepLines/>
@@ -616,7 +966,6 @@
   <w:style w:type="character" w:default="1" w:styleId="DefaultParagraphFont">
     <w:name w:val="Default Paragraph Font"/>
     <w:uiPriority w:val="1"/>
-    <w:semiHidden/>
     <w:unhideWhenUsed/>
   </w:style>
   <w:style w:type="table" w:default="1" w:styleId="TableNormal">
@@ -645,7 +994,7 @@
     <w:basedOn w:val="DefaultParagraphFont"/>
     <w:link w:val="Heading1"/>
     <w:uiPriority w:val="9"/>
-    <w:rsid w:val="00E819AE"/>
+    <w:rsid w:val="00892F25"/>
     <w:rPr>
       <w:rFonts w:asciiTheme="majorHAnsi" w:eastAsiaTheme="majorEastAsia" w:hAnsiTheme="majorHAnsi" w:cstheme="majorBidi"/>
       <w:color w:val="0F4761" w:themeColor="accent1" w:themeShade="BF"/>
@@ -658,8 +1007,7 @@
     <w:basedOn w:val="DefaultParagraphFont"/>
     <w:link w:val="Heading2"/>
     <w:uiPriority w:val="9"/>
-    <w:semiHidden/>
-    <w:rsid w:val="00E819AE"/>
+    <w:rsid w:val="00892F25"/>
     <w:rPr>
       <w:rFonts w:asciiTheme="majorHAnsi" w:eastAsiaTheme="majorEastAsia" w:hAnsiTheme="majorHAnsi" w:cstheme="majorBidi"/>
       <w:color w:val="0F4761" w:themeColor="accent1" w:themeShade="BF"/>
@@ -672,8 +1020,7 @@
     <w:basedOn w:val="DefaultParagraphFont"/>
     <w:link w:val="Heading3"/>
     <w:uiPriority w:val="9"/>
-    <w:semiHidden/>
-    <w:rsid w:val="00E819AE"/>
+    <w:rsid w:val="00892F25"/>
     <w:rPr>
       <w:rFonts w:eastAsiaTheme="majorEastAsia" w:cstheme="majorBidi"/>
       <w:color w:val="0F4761" w:themeColor="accent1" w:themeShade="BF"/>
@@ -686,8 +1033,7 @@
     <w:basedOn w:val="DefaultParagraphFont"/>
     <w:link w:val="Heading4"/>
     <w:uiPriority w:val="9"/>
-    <w:semiHidden/>
-    <w:rsid w:val="00E819AE"/>
+    <w:rsid w:val="00892F25"/>
     <w:rPr>
       <w:rFonts w:eastAsiaTheme="majorEastAsia" w:cstheme="majorBidi"/>
       <w:i/>
@@ -700,8 +1046,7 @@
     <w:basedOn w:val="DefaultParagraphFont"/>
     <w:link w:val="Heading5"/>
     <w:uiPriority w:val="9"/>
-    <w:semiHidden/>
-    <w:rsid w:val="00E819AE"/>
+    <w:rsid w:val="00892F25"/>
     <w:rPr>
       <w:rFonts w:eastAsiaTheme="majorEastAsia" w:cstheme="majorBidi"/>
       <w:color w:val="0F4761" w:themeColor="accent1" w:themeShade="BF"/>
@@ -712,8 +1057,7 @@
     <w:basedOn w:val="DefaultParagraphFont"/>
     <w:link w:val="Heading6"/>
     <w:uiPriority w:val="9"/>
-    <w:semiHidden/>
-    <w:rsid w:val="00E819AE"/>
+    <w:rsid w:val="00892F25"/>
     <w:rPr>
       <w:rFonts w:eastAsiaTheme="majorEastAsia" w:cstheme="majorBidi"/>
       <w:i/>
@@ -726,8 +1070,7 @@
     <w:basedOn w:val="DefaultParagraphFont"/>
     <w:link w:val="Heading7"/>
     <w:uiPriority w:val="9"/>
-    <w:semiHidden/>
-    <w:rsid w:val="00E819AE"/>
+    <w:rsid w:val="00892F25"/>
     <w:rPr>
       <w:rFonts w:eastAsiaTheme="majorEastAsia" w:cstheme="majorBidi"/>
       <w:color w:val="595959" w:themeColor="text1" w:themeTint="A6"/>
@@ -738,8 +1081,7 @@
     <w:basedOn w:val="DefaultParagraphFont"/>
     <w:link w:val="Heading8"/>
     <w:uiPriority w:val="9"/>
-    <w:semiHidden/>
-    <w:rsid w:val="00E819AE"/>
+    <w:rsid w:val="00892F25"/>
     <w:rPr>
       <w:rFonts w:eastAsiaTheme="majorEastAsia" w:cstheme="majorBidi"/>
       <w:i/>
@@ -752,8 +1094,7 @@
     <w:basedOn w:val="DefaultParagraphFont"/>
     <w:link w:val="Heading9"/>
     <w:uiPriority w:val="9"/>
-    <w:semiHidden/>
-    <w:rsid w:val="00E819AE"/>
+    <w:rsid w:val="00892F25"/>
     <w:rPr>
       <w:rFonts w:eastAsiaTheme="majorEastAsia" w:cstheme="majorBidi"/>
       <w:color w:val="272727" w:themeColor="text1" w:themeTint="D8"/>
@@ -766,7 +1107,7 @@
     <w:link w:val="TitleChar"/>
     <w:uiPriority w:val="10"/>
     <w:qFormat/>
-    <w:rsid w:val="00E819AE"/>
+    <w:rsid w:val="00892F25"/>
     <w:pPr>
       <w:spacing w:after="80" w:line="240" w:lineRule="auto"/>
       <w:contextualSpacing/>
@@ -784,7 +1125,7 @@
     <w:basedOn w:val="DefaultParagraphFont"/>
     <w:link w:val="Title"/>
     <w:uiPriority w:val="10"/>
-    <w:rsid w:val="00E819AE"/>
+    <w:rsid w:val="00892F25"/>
     <w:rPr>
       <w:rFonts w:asciiTheme="majorHAnsi" w:eastAsiaTheme="majorEastAsia" w:hAnsiTheme="majorHAnsi" w:cstheme="majorBidi"/>
       <w:spacing w:val="-10"/>
@@ -800,7 +1141,7 @@
     <w:link w:val="SubtitleChar"/>
     <w:uiPriority w:val="11"/>
     <w:qFormat/>
-    <w:rsid w:val="00E819AE"/>
+    <w:rsid w:val="00892F25"/>
     <w:pPr>
       <w:numPr>
         <w:ilvl w:val="1"/>
@@ -819,7 +1160,7 @@
     <w:basedOn w:val="DefaultParagraphFont"/>
     <w:link w:val="Subtitle"/>
     <w:uiPriority w:val="11"/>
-    <w:rsid w:val="00E819AE"/>
+    <w:rsid w:val="00892F25"/>
     <w:rPr>
       <w:rFonts w:eastAsiaTheme="majorEastAsia" w:cstheme="majorBidi"/>
       <w:color w:val="595959" w:themeColor="text1" w:themeTint="A6"/>
@@ -835,7 +1176,7 @@
     <w:link w:val="QuoteChar"/>
     <w:uiPriority w:val="29"/>
     <w:qFormat/>
-    <w:rsid w:val="00E819AE"/>
+    <w:rsid w:val="00892F25"/>
     <w:pPr>
       <w:spacing w:before="160"/>
       <w:jc w:val="center"/>
@@ -851,7 +1192,7 @@
     <w:basedOn w:val="DefaultParagraphFont"/>
     <w:link w:val="Quote"/>
     <w:uiPriority w:val="29"/>
-    <w:rsid w:val="00E819AE"/>
+    <w:rsid w:val="00892F25"/>
     <w:rPr>
       <w:i/>
       <w:iCs/>
@@ -863,7 +1204,7 @@
     <w:basedOn w:val="Normal"/>
     <w:uiPriority w:val="34"/>
     <w:qFormat/>
-    <w:rsid w:val="00E819AE"/>
+    <w:rsid w:val="00892F25"/>
     <w:pPr>
       <w:ind w:left="720"/>
       <w:contextualSpacing/>
@@ -874,7 +1215,7 @@
     <w:basedOn w:val="DefaultParagraphFont"/>
     <w:uiPriority w:val="21"/>
     <w:qFormat/>
-    <w:rsid w:val="00E819AE"/>
+    <w:rsid w:val="00892F25"/>
     <w:rPr>
       <w:i/>
       <w:iCs/>
@@ -888,7 +1229,7 @@
     <w:link w:val="IntenseQuoteChar"/>
     <w:uiPriority w:val="30"/>
     <w:qFormat/>
-    <w:rsid w:val="00E819AE"/>
+    <w:rsid w:val="00892F25"/>
     <w:pPr>
       <w:pBdr>
         <w:top w:val="single" w:sz="4" w:space="10" w:color="0F4761" w:themeColor="accent1" w:themeShade="BF"/>
@@ -909,7 +1250,7 @@
     <w:basedOn w:val="DefaultParagraphFont"/>
     <w:link w:val="IntenseQuote"/>
     <w:uiPriority w:val="30"/>
-    <w:rsid w:val="00E819AE"/>
+    <w:rsid w:val="00892F25"/>
     <w:rPr>
       <w:i/>
       <w:iCs/>
@@ -921,7 +1262,7 @@
     <w:basedOn w:val="DefaultParagraphFont"/>
     <w:uiPriority w:val="32"/>
     <w:qFormat/>
-    <w:rsid w:val="00E819AE"/>
+    <w:rsid w:val="00892F25"/>
     <w:rPr>
       <w:b/>
       <w:bCs/>
@@ -929,6 +1270,259 @@
       <w:color w:val="0F4761" w:themeColor="accent1" w:themeShade="BF"/>
       <w:spacing w:val="5"/>
     </w:rPr>
+  </w:style>
+  <w:style w:type="paragraph" w:styleId="NoSpacing">
+    <w:name w:val="No Spacing"/>
+    <w:uiPriority w:val="1"/>
+    <w:qFormat/>
+    <w:rsid w:val="00892F25"/>
+    <w:pPr>
+      <w:spacing w:after="0" w:line="240" w:lineRule="auto"/>
+    </w:pPr>
+  </w:style>
+  <w:style w:type="paragraph" w:styleId="Caption">
+    <w:name w:val="caption"/>
+    <w:basedOn w:val="Normal"/>
+    <w:next w:val="Normal"/>
+    <w:uiPriority w:val="35"/>
+    <w:unhideWhenUsed/>
+    <w:qFormat/>
+    <w:rsid w:val="00892F25"/>
+    <w:pPr>
+      <w:spacing w:after="200" w:line="240" w:lineRule="auto"/>
+    </w:pPr>
+    <w:rPr>
+      <w:i/>
+      <w:iCs/>
+      <w:color w:val="0E2841" w:themeColor="text2"/>
+      <w:sz w:val="18"/>
+      <w:szCs w:val="18"/>
+    </w:rPr>
+  </w:style>
+  <w:style w:type="paragraph" w:styleId="TOCHeading">
+    <w:name w:val="TOC Heading"/>
+    <w:basedOn w:val="Heading1"/>
+    <w:next w:val="Normal"/>
+    <w:uiPriority w:val="39"/>
+    <w:unhideWhenUsed/>
+    <w:qFormat/>
+    <w:rsid w:val="00892F25"/>
+    <w:pPr>
+      <w:spacing w:before="240" w:after="0"/>
+      <w:outlineLvl w:val="9"/>
+    </w:pPr>
+    <w:rPr>
+      <w:sz w:val="32"/>
+      <w:szCs w:val="32"/>
+    </w:rPr>
+  </w:style>
+  <w:style w:type="paragraph" w:styleId="TOC1">
+    <w:name w:val="toc 1"/>
+    <w:basedOn w:val="Normal"/>
+    <w:next w:val="Normal"/>
+    <w:autoRedefine/>
+    <w:uiPriority w:val="39"/>
+    <w:unhideWhenUsed/>
+    <w:rsid w:val="00892F25"/>
+    <w:pPr>
+      <w:spacing w:after="100"/>
+    </w:pPr>
+  </w:style>
+  <w:style w:type="paragraph" w:styleId="TOC2">
+    <w:name w:val="toc 2"/>
+    <w:basedOn w:val="Normal"/>
+    <w:next w:val="Normal"/>
+    <w:autoRedefine/>
+    <w:uiPriority w:val="39"/>
+    <w:unhideWhenUsed/>
+    <w:rsid w:val="00892F25"/>
+    <w:pPr>
+      <w:spacing w:after="100"/>
+      <w:ind w:left="240"/>
+    </w:pPr>
+  </w:style>
+  <w:style w:type="paragraph" w:styleId="TOC3">
+    <w:name w:val="toc 3"/>
+    <w:basedOn w:val="Normal"/>
+    <w:next w:val="Normal"/>
+    <w:autoRedefine/>
+    <w:uiPriority w:val="39"/>
+    <w:unhideWhenUsed/>
+    <w:rsid w:val="00892F25"/>
+    <w:pPr>
+      <w:spacing w:after="100"/>
+      <w:ind w:left="480"/>
+    </w:pPr>
+  </w:style>
+  <w:style w:type="paragraph" w:styleId="FootnoteText">
+    <w:name w:val="footnote text"/>
+    <w:basedOn w:val="Normal"/>
+    <w:link w:val="FootnoteTextChar"/>
+    <w:uiPriority w:val="99"/>
+    <w:unhideWhenUsed/>
+    <w:rsid w:val="00892F25"/>
+    <w:pPr>
+      <w:spacing w:after="0" w:line="240" w:lineRule="auto"/>
+    </w:pPr>
+    <w:rPr>
+      <w:sz w:val="20"/>
+      <w:szCs w:val="20"/>
+    </w:rPr>
+  </w:style>
+  <w:style w:type="character" w:customStyle="1" w:styleId="FootnoteTextChar">
+    <w:name w:val="Footnote Text Char"/>
+    <w:basedOn w:val="DefaultParagraphFont"/>
+    <w:link w:val="FootnoteText"/>
+    <w:uiPriority w:val="99"/>
+    <w:rsid w:val="00892F25"/>
+    <w:rPr>
+      <w:sz w:val="20"/>
+      <w:szCs w:val="20"/>
+    </w:rPr>
+  </w:style>
+  <w:style w:type="paragraph" w:styleId="EndnoteText">
+    <w:name w:val="endnote text"/>
+    <w:basedOn w:val="Normal"/>
+    <w:link w:val="EndnoteTextChar"/>
+    <w:uiPriority w:val="99"/>
+    <w:unhideWhenUsed/>
+    <w:rsid w:val="00892F25"/>
+    <w:pPr>
+      <w:spacing w:after="0" w:line="240" w:lineRule="auto"/>
+    </w:pPr>
+    <w:rPr>
+      <w:sz w:val="20"/>
+      <w:szCs w:val="20"/>
+    </w:rPr>
+  </w:style>
+  <w:style w:type="character" w:customStyle="1" w:styleId="EndnoteTextChar">
+    <w:name w:val="Endnote Text Char"/>
+    <w:basedOn w:val="DefaultParagraphFont"/>
+    <w:link w:val="EndnoteText"/>
+    <w:uiPriority w:val="99"/>
+    <w:rsid w:val="00892F25"/>
+    <w:rPr>
+      <w:sz w:val="20"/>
+      <w:szCs w:val="20"/>
+    </w:rPr>
+  </w:style>
+  <w:style w:type="paragraph" w:styleId="Header">
+    <w:name w:val="header"/>
+    <w:basedOn w:val="Normal"/>
+    <w:link w:val="HeaderChar"/>
+    <w:uiPriority w:val="99"/>
+    <w:unhideWhenUsed/>
+    <w:rsid w:val="00892F25"/>
+    <w:pPr>
+      <w:tabs>
+        <w:tab w:val="center" w:pos="4680"/>
+        <w:tab w:val="right" w:pos="9360"/>
+      </w:tabs>
+      <w:spacing w:after="0" w:line="240" w:lineRule="auto"/>
+    </w:pPr>
+  </w:style>
+  <w:style w:type="character" w:customStyle="1" w:styleId="HeaderChar">
+    <w:name w:val="Header Char"/>
+    <w:basedOn w:val="DefaultParagraphFont"/>
+    <w:link w:val="Header"/>
+    <w:uiPriority w:val="99"/>
+    <w:rsid w:val="00892F25"/>
+  </w:style>
+  <w:style w:type="paragraph" w:styleId="Footer">
+    <w:name w:val="footer"/>
+    <w:basedOn w:val="Normal"/>
+    <w:link w:val="FooterChar"/>
+    <w:uiPriority w:val="99"/>
+    <w:unhideWhenUsed/>
+    <w:rsid w:val="00892F25"/>
+    <w:pPr>
+      <w:tabs>
+        <w:tab w:val="center" w:pos="4680"/>
+        <w:tab w:val="right" w:pos="9360"/>
+      </w:tabs>
+      <w:spacing w:after="0" w:line="240" w:lineRule="auto"/>
+    </w:pPr>
+  </w:style>
+  <w:style w:type="character" w:customStyle="1" w:styleId="FooterChar">
+    <w:name w:val="Footer Char"/>
+    <w:basedOn w:val="DefaultParagraphFont"/>
+    <w:link w:val="Footer"/>
+    <w:uiPriority w:val="99"/>
+    <w:rsid w:val="00892F25"/>
+  </w:style>
+  <w:style w:type="character" w:styleId="Strong">
+    <w:name w:val="Strong"/>
+    <w:basedOn w:val="DefaultParagraphFont"/>
+    <w:uiPriority w:val="22"/>
+    <w:qFormat/>
+    <w:rsid w:val="00892F25"/>
+    <w:rPr>
+      <w:b/>
+      <w:bCs/>
+    </w:rPr>
+  </w:style>
+  <w:style w:type="character" w:styleId="Emphasis">
+    <w:name w:val="Emphasis"/>
+    <w:basedOn w:val="DefaultParagraphFont"/>
+    <w:uiPriority w:val="20"/>
+    <w:qFormat/>
+    <w:rsid w:val="00892F25"/>
+    <w:rPr>
+      <w:i/>
+      <w:iCs/>
+    </w:rPr>
+  </w:style>
+  <w:style w:type="character" w:styleId="SubtleEmphasis">
+    <w:name w:val="Subtle Emphasis"/>
+    <w:basedOn w:val="DefaultParagraphFont"/>
+    <w:uiPriority w:val="19"/>
+    <w:qFormat/>
+    <w:rsid w:val="00892F25"/>
+    <w:rPr>
+      <w:i/>
+      <w:iCs/>
+      <w:color w:val="404040" w:themeColor="text1" w:themeTint="BF"/>
+    </w:rPr>
+  </w:style>
+  <w:style w:type="character" w:styleId="Hyperlink">
+    <w:name w:val="Hyperlink"/>
+    <w:basedOn w:val="DefaultParagraphFont"/>
+    <w:uiPriority w:val="99"/>
+    <w:unhideWhenUsed/>
+    <w:rsid w:val="00892F25"/>
+    <w:rPr>
+      <w:color w:val="467886" w:themeColor="hyperlink"/>
+      <w:u w:val="single"/>
+    </w:rPr>
+  </w:style>
+  <w:style w:type="character" w:styleId="FootnoteReference">
+    <w:name w:val="footnote reference"/>
+    <w:basedOn w:val="DefaultParagraphFont"/>
+    <w:uiPriority w:val="99"/>
+    <w:unhideWhenUsed/>
+    <w:rsid w:val="00892F25"/>
+    <w:rPr>
+      <w:vertAlign w:val="superscript"/>
+    </w:rPr>
+  </w:style>
+  <w:style w:type="table" w:styleId="TableGrid">
+    <w:name w:val="Table Grid"/>
+    <w:basedOn w:val="TableNormal"/>
+    <w:uiPriority w:val="39"/>
+    <w:rsid w:val="00892F25"/>
+    <w:pPr>
+      <w:spacing w:after="0" w:line="240" w:lineRule="auto"/>
+    </w:pPr>
+    <w:tblPr>
+      <w:tblBorders>
+        <w:top w:val="single" w:sz="4" w:space="0" w:color="auto"/>
+        <w:left w:val="single" w:sz="4" w:space="0" w:color="auto"/>
+        <w:bottom w:val="single" w:sz="4" w:space="0" w:color="auto"/>
+        <w:right w:val="single" w:sz="4" w:space="0" w:color="auto"/>
+        <w:insideH w:val="single" w:sz="4" w:space="0" w:color="auto"/>
+        <w:insideV w:val="single" w:sz="4" w:space="0" w:color="auto"/>
+      </w:tblBorders>
+    </w:tblPr>
   </w:style>
 </w:styles>
 </file>

</xml_diff>

<commit_message>
task-2359: list definitions and picture bullets, Word's list and table styles in the built in template with their numbering, an offline WordNet thesaurus, commentsExtended for new comments
</commit_message>
<xml_diff>
--- a/crates/unluminous-word/templates/builtin-styles.docx
+++ b/crates/unluminous-word/templates/builtin-styles.docx
@@ -184,6 +184,60 @@
     </w:p>
     <w:p>
       <w:pPr>
+        <w:pStyle w:val="TOC4"/>
+      </w:pPr>
+      <w:r>
+        <w:t>TOC 4 paragraph</w:t>
+      </w:r>
+    </w:p>
+    <w:p>
+      <w:pPr>
+        <w:pStyle w:val="TOC5"/>
+      </w:pPr>
+      <w:r>
+        <w:t xml:space="preserve">TOC </w:t>
+      </w:r>
+      <w:proofErr w:type="gramStart"/>
+      <w:r>
+        <w:t>5 paragraph</w:t>
+      </w:r>
+      <w:proofErr w:type="gramEnd"/>
+    </w:p>
+    <w:p>
+      <w:pPr>
+        <w:pStyle w:val="TOC6"/>
+      </w:pPr>
+      <w:r>
+        <w:t>TOC 6 paragraph</w:t>
+      </w:r>
+    </w:p>
+    <w:p>
+      <w:pPr>
+        <w:pStyle w:val="TOC7"/>
+      </w:pPr>
+      <w:r>
+        <w:t>TOC 7 paragraph</w:t>
+      </w:r>
+    </w:p>
+    <w:p>
+      <w:pPr>
+        <w:pStyle w:val="TOC8"/>
+      </w:pPr>
+      <w:r>
+        <w:lastRenderedPageBreak/>
+        <w:t>TOC 8 paragraph</w:t>
+      </w:r>
+    </w:p>
+    <w:p>
+      <w:pPr>
+        <w:pStyle w:val="TOC9"/>
+      </w:pPr>
+      <w:r>
+        <w:t>TOC 9 paragraph</w:t>
+      </w:r>
+    </w:p>
+    <w:p>
+      <w:pPr>
         <w:pStyle w:val="FootnoteText"/>
       </w:pPr>
       <w:r>
@@ -212,6 +266,167 @@
       </w:pPr>
       <w:r>
         <w:t>Footer paragraph</w:t>
+      </w:r>
+    </w:p>
+    <w:p>
+      <w:pPr>
+        <w:pStyle w:val="ListBullet"/>
+      </w:pPr>
+      <w:r>
+        <w:t>List Bullet paragraph</w:t>
+      </w:r>
+    </w:p>
+    <w:p>
+      <w:pPr>
+        <w:pStyle w:val="ListBullet2"/>
+      </w:pPr>
+      <w:r>
+        <w:t>List Bullet 2 paragraph</w:t>
+      </w:r>
+    </w:p>
+    <w:p>
+      <w:pPr>
+        <w:pStyle w:val="ListBullet3"/>
+      </w:pPr>
+      <w:r>
+        <w:t>List Bullet 3 paragraph</w:t>
+      </w:r>
+    </w:p>
+    <w:p>
+      <w:pPr>
+        <w:pStyle w:val="ListNumber"/>
+      </w:pPr>
+      <w:r>
+        <w:t>List Number paragraph</w:t>
+      </w:r>
+    </w:p>
+    <w:p>
+      <w:pPr>
+        <w:pStyle w:val="ListNumber2"/>
+      </w:pPr>
+      <w:r>
+        <w:t>List Number 2 paragraph</w:t>
+      </w:r>
+    </w:p>
+    <w:p>
+      <w:pPr>
+        <w:pStyle w:val="ListNumber3"/>
+      </w:pPr>
+      <w:r>
+        <w:t>List Number 3 paragraph</w:t>
+      </w:r>
+    </w:p>
+    <w:p>
+      <w:pPr>
+        <w:pStyle w:val="List"/>
+      </w:pPr>
+      <w:r>
+        <w:t>List paragraph</w:t>
+      </w:r>
+    </w:p>
+    <w:p>
+      <w:pPr>
+        <w:pStyle w:val="ListContinue"/>
+      </w:pPr>
+      <w:r>
+        <w:t>List Continue paragraph</w:t>
+      </w:r>
+    </w:p>
+    <w:p>
+      <w:pPr>
+        <w:pStyle w:val="TableofFigures"/>
+      </w:pPr>
+      <w:r>
+        <w:t>Table of Figures paragraph</w:t>
+      </w:r>
+    </w:p>
+    <w:p>
+      <w:pPr>
+        <w:pStyle w:val="HTMLPreformatted"/>
+      </w:pPr>
+      <w:r>
+        <w:t>HTML Preformatted paragraph</w:t>
+      </w:r>
+    </w:p>
+    <w:p>
+      <w:pPr>
+        <w:pStyle w:val="BlockText"/>
+      </w:pPr>
+      <w:r>
+        <w:t>Block Text paragraph</w:t>
+      </w:r>
+    </w:p>
+    <w:p>
+      <w:pPr>
+        <w:pStyle w:val="BodyText"/>
+      </w:pPr>
+      <w:r>
+        <w:t>Body Text paragraph</w:t>
+      </w:r>
+    </w:p>
+    <w:p>
+      <w:pPr>
+        <w:pStyle w:val="PlainText"/>
+      </w:pPr>
+      <w:r>
+        <w:t>Plain Text paragraph</w:t>
+      </w:r>
+    </w:p>
+    <w:p>
+      <w:pPr>
+        <w:pStyle w:val="Bibliography"/>
+      </w:pPr>
+      <w:r>
+        <w:t>Bibliography paragraph</w:t>
+      </w:r>
+    </w:p>
+    <w:p>
+      <w:pPr>
+        <w:pStyle w:val="Index1"/>
+      </w:pPr>
+      <w:r>
+        <w:t>Index 1 paragraph</w:t>
+      </w:r>
+    </w:p>
+    <w:p>
+      <w:pPr>
+        <w:pStyle w:val="EnvelopeAddress"/>
+        <w:framePr w:wrap="auto"/>
+      </w:pPr>
+      <w:r>
+        <w:t>Envelope Address paragraph</w:t>
+      </w:r>
+    </w:p>
+    <w:p>
+      <w:pPr>
+        <w:pStyle w:val="Signature"/>
+      </w:pPr>
+      <w:r>
+        <w:t>Signature paragraph</w:t>
+      </w:r>
+    </w:p>
+    <w:p>
+      <w:pPr>
+        <w:pStyle w:val="Salutation"/>
+      </w:pPr>
+      <w:r>
+        <w:t>Salutation paragraph</w:t>
+      </w:r>
+    </w:p>
+    <w:p>
+      <w:pPr>
+        <w:pStyle w:val="Closing"/>
+      </w:pPr>
+      <w:r>
+        <w:t>Closing paragraph</w:t>
+      </w:r>
+    </w:p>
+    <w:p>
+      <w:pPr>
+        <w:pStyle w:val="Date"/>
+      </w:pPr>
+      <w:r>
+        <w:t>Date paragraph</w:t>
       </w:r>
     </w:p>
     <w:p>
@@ -230,6 +445,7 @@
     </w:p>
     <w:p>
       <w:r>
+        <w:lastRenderedPageBreak/>
         <w:t xml:space="preserve">Sample </w:t>
       </w:r>
       <w:r>
@@ -244,7 +460,6 @@
     </w:p>
     <w:p>
       <w:r>
-        <w:lastRenderedPageBreak/>
         <w:t xml:space="preserve">Sample </w:t>
       </w:r>
       <w:r>
@@ -294,6 +509,132 @@
           <w:rStyle w:val="FootnoteReference"/>
         </w:rPr>
         <w:t>Footnote Reference</w:t>
+      </w:r>
+      <w:r>
+        <w:t xml:space="preserve"> text</w:t>
+      </w:r>
+    </w:p>
+    <w:p>
+      <w:r>
+        <w:t xml:space="preserve">Sample </w:t>
+      </w:r>
+      <w:r>
+        <w:rPr>
+          <w:rStyle w:val="EndnoteReference"/>
+        </w:rPr>
+        <w:t>Endnote Reference</w:t>
+      </w:r>
+      <w:r>
+        <w:t xml:space="preserve"> text</w:t>
+      </w:r>
+    </w:p>
+    <w:p>
+      <w:r>
+        <w:t xml:space="preserve">Sample </w:t>
+      </w:r>
+      <w:r>
+        <w:rPr>
+          <w:rStyle w:val="PlaceholderText"/>
+        </w:rPr>
+        <w:t>Placeholder Text</w:t>
+      </w:r>
+      <w:r>
+        <w:t xml:space="preserve"> text</w:t>
+      </w:r>
+    </w:p>
+    <w:p>
+      <w:r>
+        <w:t xml:space="preserve">Sample </w:t>
+      </w:r>
+      <w:r>
+        <w:rPr>
+          <w:rStyle w:val="BookTitle"/>
+        </w:rPr>
+        <w:t>Book Title</w:t>
+      </w:r>
+      <w:r>
+        <w:t xml:space="preserve"> text</w:t>
+      </w:r>
+    </w:p>
+    <w:p>
+      <w:r>
+        <w:t xml:space="preserve">Sample </w:t>
+      </w:r>
+      <w:r>
+        <w:rPr>
+          <w:rStyle w:val="SubtleReference"/>
+        </w:rPr>
+        <w:t>Subtle Reference</w:t>
+      </w:r>
+      <w:r>
+        <w:t xml:space="preserve"> text</w:t>
+      </w:r>
+    </w:p>
+    <w:p>
+      <w:r>
+        <w:t xml:space="preserve">Sample </w:t>
+      </w:r>
+      <w:r>
+        <w:rPr>
+          <w:rStyle w:val="IntenseReference"/>
+        </w:rPr>
+        <w:t>Intense Reference</w:t>
+      </w:r>
+      <w:r>
+        <w:t xml:space="preserve"> text</w:t>
+      </w:r>
+    </w:p>
+    <w:p>
+      <w:r>
+        <w:t xml:space="preserve">Sample </w:t>
+      </w:r>
+      <w:r>
+        <w:rPr>
+          <w:rStyle w:val="FollowedHyperlink"/>
+        </w:rPr>
+        <w:t>FollowedHyperlink</w:t>
+      </w:r>
+      <w:r>
+        <w:t xml:space="preserve"> text</w:t>
+      </w:r>
+    </w:p>
+    <w:p>
+      <w:r>
+        <w:t xml:space="preserve">Sample </w:t>
+      </w:r>
+      <w:r>
+        <w:rPr>
+          <w:rStyle w:val="HTMLCode"/>
+        </w:rPr>
+        <w:t>HTML Code</w:t>
+      </w:r>
+      <w:r>
+        <w:t xml:space="preserve"> text</w:t>
+      </w:r>
+    </w:p>
+    <w:p>
+      <w:r>
+        <w:t xml:space="preserve">Sample </w:t>
+      </w:r>
+      <w:r>
+        <w:rPr>
+          <w:rStyle w:val="PageNumber"/>
+        </w:rPr>
+        <w:t>Page Number</w:t>
+      </w:r>
+      <w:r>
+        <w:t xml:space="preserve"> text</w:t>
+      </w:r>
+    </w:p>
+    <w:p>
+      <w:r>
+        <w:t xml:space="preserve">Sample </w:t>
+      </w:r>
+      <w:r>
+        <w:rPr>
+          <w:rStyle w:val="LineNumber"/>
+        </w:rPr>
+        <w:t>Line Number</w:t>
       </w:r>
       <w:r>
         <w:t xml:space="preserve"> text</w:t>
@@ -360,6 +701,1115 @@
         </w:tc>
       </w:tr>
     </w:tbl>
+    <w:p>
+      <w:r>
+        <w:t>Table Grid Light style:</w:t>
+      </w:r>
+    </w:p>
+    <w:tbl>
+      <w:tblPr>
+        <w:tblStyle w:val="TableGridLight"/>
+        <w:tblW w:w="0" w:type="auto"/>
+        <w:tblLayout w:type="fixed"/>
+        <w:tblLook w:val="04A0" w:firstRow="1" w:lastRow="0" w:firstColumn="1" w:lastColumn="0" w:noHBand="0" w:noVBand="1"/>
+      </w:tblPr>
+      <w:tblGrid>
+        <w:gridCol w:w="4680"/>
+        <w:gridCol w:w="4680"/>
+      </w:tblGrid>
+      <w:tr>
+        <w:tc>
+          <w:tcPr>
+            <w:tcW w:w="4680" w:type="dxa"/>
+          </w:tcPr>
+          <w:p>
+            <w:r>
+              <w:t>11</w:t>
+            </w:r>
+          </w:p>
+        </w:tc>
+        <w:tc>
+          <w:tcPr>
+            <w:tcW w:w="4680" w:type="dxa"/>
+          </w:tcPr>
+          <w:p>
+            <w:r>
+              <w:t>12</w:t>
+            </w:r>
+          </w:p>
+        </w:tc>
+      </w:tr>
+      <w:tr>
+        <w:tc>
+          <w:tcPr>
+            <w:tcW w:w="4680" w:type="dxa"/>
+          </w:tcPr>
+          <w:p>
+            <w:r>
+              <w:t>21</w:t>
+            </w:r>
+          </w:p>
+        </w:tc>
+        <w:tc>
+          <w:tcPr>
+            <w:tcW w:w="4680" w:type="dxa"/>
+          </w:tcPr>
+          <w:p>
+            <w:r>
+              <w:t>22</w:t>
+            </w:r>
+          </w:p>
+        </w:tc>
+      </w:tr>
+    </w:tbl>
+    <w:p>
+      <w:r>
+        <w:t>Plain Table 1 style:</w:t>
+      </w:r>
+    </w:p>
+    <w:tbl>
+      <w:tblPr>
+        <w:tblStyle w:val="PlainTable1"/>
+        <w:tblW w:w="0" w:type="auto"/>
+        <w:tblLayout w:type="fixed"/>
+        <w:tblLook w:val="04A0" w:firstRow="1" w:lastRow="0" w:firstColumn="1" w:lastColumn="0" w:noHBand="0" w:noVBand="1"/>
+      </w:tblPr>
+      <w:tblGrid>
+        <w:gridCol w:w="4680"/>
+        <w:gridCol w:w="4680"/>
+      </w:tblGrid>
+      <w:tr>
+        <w:trPr>
+          <w:cnfStyle w:val="100000000000" w:firstRow="1" w:lastRow="0" w:firstColumn="0" w:lastColumn="0" w:oddVBand="0" w:evenVBand="0" w:oddHBand="0" w:evenHBand="0" w:firstRowFirstColumn="0" w:firstRowLastColumn="0" w:lastRowFirstColumn="0" w:lastRowLastColumn="0"/>
+        </w:trPr>
+        <w:tc>
+          <w:tcPr>
+            <w:cnfStyle w:val="001000000000" w:firstRow="0" w:lastRow="0" w:firstColumn="1" w:lastColumn="0" w:oddVBand="0" w:evenVBand="0" w:oddHBand="0" w:evenHBand="0" w:firstRowFirstColumn="0" w:firstRowLastColumn="0" w:lastRowFirstColumn="0" w:lastRowLastColumn="0"/>
+            <w:tcW w:w="4680" w:type="dxa"/>
+          </w:tcPr>
+          <w:p>
+            <w:r>
+              <w:t>11</w:t>
+            </w:r>
+          </w:p>
+        </w:tc>
+        <w:tc>
+          <w:tcPr>
+            <w:tcW w:w="4680" w:type="dxa"/>
+          </w:tcPr>
+          <w:p>
+            <w:pPr>
+              <w:cnfStyle w:val="100000000000" w:firstRow="1" w:lastRow="0" w:firstColumn="0" w:lastColumn="0" w:oddVBand="0" w:evenVBand="0" w:oddHBand="0" w:evenHBand="0" w:firstRowFirstColumn="0" w:firstRowLastColumn="0" w:lastRowFirstColumn="0" w:lastRowLastColumn="0"/>
+            </w:pPr>
+            <w:r>
+              <w:t>12</w:t>
+            </w:r>
+          </w:p>
+        </w:tc>
+      </w:tr>
+      <w:tr>
+        <w:trPr>
+          <w:cnfStyle w:val="000000100000" w:firstRow="0" w:lastRow="0" w:firstColumn="0" w:lastColumn="0" w:oddVBand="0" w:evenVBand="0" w:oddHBand="1" w:evenHBand="0" w:firstRowFirstColumn="0" w:firstRowLastColumn="0" w:lastRowFirstColumn="0" w:lastRowLastColumn="0"/>
+        </w:trPr>
+        <w:tc>
+          <w:tcPr>
+            <w:cnfStyle w:val="001000000000" w:firstRow="0" w:lastRow="0" w:firstColumn="1" w:lastColumn="0" w:oddVBand="0" w:evenVBand="0" w:oddHBand="0" w:evenHBand="0" w:firstRowFirstColumn="0" w:firstRowLastColumn="0" w:lastRowFirstColumn="0" w:lastRowLastColumn="0"/>
+            <w:tcW w:w="4680" w:type="dxa"/>
+          </w:tcPr>
+          <w:p>
+            <w:r>
+              <w:t>21</w:t>
+            </w:r>
+          </w:p>
+        </w:tc>
+        <w:tc>
+          <w:tcPr>
+            <w:tcW w:w="4680" w:type="dxa"/>
+          </w:tcPr>
+          <w:p>
+            <w:pPr>
+              <w:cnfStyle w:val="000000100000" w:firstRow="0" w:lastRow="0" w:firstColumn="0" w:lastColumn="0" w:oddVBand="0" w:evenVBand="0" w:oddHBand="1" w:evenHBand="0" w:firstRowFirstColumn="0" w:firstRowLastColumn="0" w:lastRowFirstColumn="0" w:lastRowLastColumn="0"/>
+            </w:pPr>
+            <w:r>
+              <w:t>22</w:t>
+            </w:r>
+          </w:p>
+        </w:tc>
+      </w:tr>
+    </w:tbl>
+    <w:p>
+      <w:r>
+        <w:t>Plain Table 2 style:</w:t>
+      </w:r>
+    </w:p>
+    <w:tbl>
+      <w:tblPr>
+        <w:tblStyle w:val="PlainTable2"/>
+        <w:tblW w:w="0" w:type="auto"/>
+        <w:tblLayout w:type="fixed"/>
+        <w:tblLook w:val="04A0" w:firstRow="1" w:lastRow="0" w:firstColumn="1" w:lastColumn="0" w:noHBand="0" w:noVBand="1"/>
+      </w:tblPr>
+      <w:tblGrid>
+        <w:gridCol w:w="4680"/>
+        <w:gridCol w:w="4680"/>
+      </w:tblGrid>
+      <w:tr>
+        <w:trPr>
+          <w:cnfStyle w:val="100000000000" w:firstRow="1" w:lastRow="0" w:firstColumn="0" w:lastColumn="0" w:oddVBand="0" w:evenVBand="0" w:oddHBand="0" w:evenHBand="0" w:firstRowFirstColumn="0" w:firstRowLastColumn="0" w:lastRowFirstColumn="0" w:lastRowLastColumn="0"/>
+        </w:trPr>
+        <w:tc>
+          <w:tcPr>
+            <w:cnfStyle w:val="001000000000" w:firstRow="0" w:lastRow="0" w:firstColumn="1" w:lastColumn="0" w:oddVBand="0" w:evenVBand="0" w:oddHBand="0" w:evenHBand="0" w:firstRowFirstColumn="0" w:firstRowLastColumn="0" w:lastRowFirstColumn="0" w:lastRowLastColumn="0"/>
+            <w:tcW w:w="4680" w:type="dxa"/>
+          </w:tcPr>
+          <w:p>
+            <w:r>
+              <w:t>11</w:t>
+            </w:r>
+          </w:p>
+        </w:tc>
+        <w:tc>
+          <w:tcPr>
+            <w:tcW w:w="4680" w:type="dxa"/>
+          </w:tcPr>
+          <w:p>
+            <w:pPr>
+              <w:cnfStyle w:val="100000000000" w:firstRow="1" w:lastRow="0" w:firstColumn="0" w:lastColumn="0" w:oddVBand="0" w:evenVBand="0" w:oddHBand="0" w:evenHBand="0" w:firstRowFirstColumn="0" w:firstRowLastColumn="0" w:lastRowFirstColumn="0" w:lastRowLastColumn="0"/>
+            </w:pPr>
+            <w:r>
+              <w:t>12</w:t>
+            </w:r>
+          </w:p>
+        </w:tc>
+      </w:tr>
+      <w:tr>
+        <w:trPr>
+          <w:cnfStyle w:val="000000100000" w:firstRow="0" w:lastRow="0" w:firstColumn="0" w:lastColumn="0" w:oddVBand="0" w:evenVBand="0" w:oddHBand="1" w:evenHBand="0" w:firstRowFirstColumn="0" w:firstRowLastColumn="0" w:lastRowFirstColumn="0" w:lastRowLastColumn="0"/>
+        </w:trPr>
+        <w:tc>
+          <w:tcPr>
+            <w:cnfStyle w:val="001000000000" w:firstRow="0" w:lastRow="0" w:firstColumn="1" w:lastColumn="0" w:oddVBand="0" w:evenVBand="0" w:oddHBand="0" w:evenHBand="0" w:firstRowFirstColumn="0" w:firstRowLastColumn="0" w:lastRowFirstColumn="0" w:lastRowLastColumn="0"/>
+            <w:tcW w:w="4680" w:type="dxa"/>
+          </w:tcPr>
+          <w:p>
+            <w:r>
+              <w:t>21</w:t>
+            </w:r>
+          </w:p>
+        </w:tc>
+        <w:tc>
+          <w:tcPr>
+            <w:tcW w:w="4680" w:type="dxa"/>
+          </w:tcPr>
+          <w:p>
+            <w:pPr>
+              <w:cnfStyle w:val="000000100000" w:firstRow="0" w:lastRow="0" w:firstColumn="0" w:lastColumn="0" w:oddVBand="0" w:evenVBand="0" w:oddHBand="1" w:evenHBand="0" w:firstRowFirstColumn="0" w:firstRowLastColumn="0" w:lastRowFirstColumn="0" w:lastRowLastColumn="0"/>
+            </w:pPr>
+            <w:r>
+              <w:t>22</w:t>
+            </w:r>
+          </w:p>
+        </w:tc>
+      </w:tr>
+    </w:tbl>
+    <w:p>
+      <w:r>
+        <w:t>Plain Table 3 style:</w:t>
+      </w:r>
+    </w:p>
+    <w:tbl>
+      <w:tblPr>
+        <w:tblStyle w:val="PlainTable3"/>
+        <w:tblW w:w="0" w:type="auto"/>
+        <w:tblLayout w:type="fixed"/>
+        <w:tblLook w:val="04A0" w:firstRow="1" w:lastRow="0" w:firstColumn="1" w:lastColumn="0" w:noHBand="0" w:noVBand="1"/>
+      </w:tblPr>
+      <w:tblGrid>
+        <w:gridCol w:w="4680"/>
+        <w:gridCol w:w="4680"/>
+      </w:tblGrid>
+      <w:tr>
+        <w:trPr>
+          <w:cnfStyle w:val="100000000000" w:firstRow="1" w:lastRow="0" w:firstColumn="0" w:lastColumn="0" w:oddVBand="0" w:evenVBand="0" w:oddHBand="0" w:evenHBand="0" w:firstRowFirstColumn="0" w:firstRowLastColumn="0" w:lastRowFirstColumn="0" w:lastRowLastColumn="0"/>
+        </w:trPr>
+        <w:tc>
+          <w:tcPr>
+            <w:cnfStyle w:val="001000000100" w:firstRow="0" w:lastRow="0" w:firstColumn="1" w:lastColumn="0" w:oddVBand="0" w:evenVBand="0" w:oddHBand="0" w:evenHBand="0" w:firstRowFirstColumn="1" w:firstRowLastColumn="0" w:lastRowFirstColumn="0" w:lastRowLastColumn="0"/>
+            <w:tcW w:w="4680" w:type="dxa"/>
+          </w:tcPr>
+          <w:p>
+            <w:r>
+              <w:t>11</w:t>
+            </w:r>
+          </w:p>
+        </w:tc>
+        <w:tc>
+          <w:tcPr>
+            <w:tcW w:w="4680" w:type="dxa"/>
+          </w:tcPr>
+          <w:p>
+            <w:pPr>
+              <w:cnfStyle w:val="100000000000" w:firstRow="1" w:lastRow="0" w:firstColumn="0" w:lastColumn="0" w:oddVBand="0" w:evenVBand="0" w:oddHBand="0" w:evenHBand="0" w:firstRowFirstColumn="0" w:firstRowLastColumn="0" w:lastRowFirstColumn="0" w:lastRowLastColumn="0"/>
+            </w:pPr>
+            <w:r>
+              <w:t>12</w:t>
+            </w:r>
+          </w:p>
+        </w:tc>
+      </w:tr>
+      <w:tr>
+        <w:trPr>
+          <w:cnfStyle w:val="000000100000" w:firstRow="0" w:lastRow="0" w:firstColumn="0" w:lastColumn="0" w:oddVBand="0" w:evenVBand="0" w:oddHBand="1" w:evenHBand="0" w:firstRowFirstColumn="0" w:firstRowLastColumn="0" w:lastRowFirstColumn="0" w:lastRowLastColumn="0"/>
+        </w:trPr>
+        <w:tc>
+          <w:tcPr>
+            <w:cnfStyle w:val="001000000000" w:firstRow="0" w:lastRow="0" w:firstColumn="1" w:lastColumn="0" w:oddVBand="0" w:evenVBand="0" w:oddHBand="0" w:evenHBand="0" w:firstRowFirstColumn="0" w:firstRowLastColumn="0" w:lastRowFirstColumn="0" w:lastRowLastColumn="0"/>
+            <w:tcW w:w="4680" w:type="dxa"/>
+          </w:tcPr>
+          <w:p>
+            <w:r>
+              <w:t>21</w:t>
+            </w:r>
+          </w:p>
+        </w:tc>
+        <w:tc>
+          <w:tcPr>
+            <w:tcW w:w="4680" w:type="dxa"/>
+          </w:tcPr>
+          <w:p>
+            <w:pPr>
+              <w:cnfStyle w:val="000000100000" w:firstRow="0" w:lastRow="0" w:firstColumn="0" w:lastColumn="0" w:oddVBand="0" w:evenVBand="0" w:oddHBand="1" w:evenHBand="0" w:firstRowFirstColumn="0" w:firstRowLastColumn="0" w:lastRowFirstColumn="0" w:lastRowLastColumn="0"/>
+            </w:pPr>
+            <w:r>
+              <w:t>22</w:t>
+            </w:r>
+          </w:p>
+        </w:tc>
+      </w:tr>
+    </w:tbl>
+    <w:p>
+      <w:r>
+        <w:t>Plain Table 4 style:</w:t>
+      </w:r>
+    </w:p>
+    <w:tbl>
+      <w:tblPr>
+        <w:tblStyle w:val="PlainTable4"/>
+        <w:tblW w:w="0" w:type="auto"/>
+        <w:tblLayout w:type="fixed"/>
+        <w:tblLook w:val="04A0" w:firstRow="1" w:lastRow="0" w:firstColumn="1" w:lastColumn="0" w:noHBand="0" w:noVBand="1"/>
+      </w:tblPr>
+      <w:tblGrid>
+        <w:gridCol w:w="4680"/>
+        <w:gridCol w:w="4680"/>
+      </w:tblGrid>
+      <w:tr>
+        <w:trPr>
+          <w:cnfStyle w:val="100000000000" w:firstRow="1" w:lastRow="0" w:firstColumn="0" w:lastColumn="0" w:oddVBand="0" w:evenVBand="0" w:oddHBand="0" w:evenHBand="0" w:firstRowFirstColumn="0" w:firstRowLastColumn="0" w:lastRowFirstColumn="0" w:lastRowLastColumn="0"/>
+        </w:trPr>
+        <w:tc>
+          <w:tcPr>
+            <w:cnfStyle w:val="001000000000" w:firstRow="0" w:lastRow="0" w:firstColumn="1" w:lastColumn="0" w:oddVBand="0" w:evenVBand="0" w:oddHBand="0" w:evenHBand="0" w:firstRowFirstColumn="0" w:firstRowLastColumn="0" w:lastRowFirstColumn="0" w:lastRowLastColumn="0"/>
+            <w:tcW w:w="4680" w:type="dxa"/>
+          </w:tcPr>
+          <w:p>
+            <w:r>
+              <w:lastRenderedPageBreak/>
+              <w:t>11</w:t>
+            </w:r>
+          </w:p>
+        </w:tc>
+        <w:tc>
+          <w:tcPr>
+            <w:tcW w:w="4680" w:type="dxa"/>
+          </w:tcPr>
+          <w:p>
+            <w:pPr>
+              <w:cnfStyle w:val="100000000000" w:firstRow="1" w:lastRow="0" w:firstColumn="0" w:lastColumn="0" w:oddVBand="0" w:evenVBand="0" w:oddHBand="0" w:evenHBand="0" w:firstRowFirstColumn="0" w:firstRowLastColumn="0" w:lastRowFirstColumn="0" w:lastRowLastColumn="0"/>
+            </w:pPr>
+            <w:r>
+              <w:t>12</w:t>
+            </w:r>
+          </w:p>
+        </w:tc>
+      </w:tr>
+      <w:tr>
+        <w:trPr>
+          <w:cnfStyle w:val="000000100000" w:firstRow="0" w:lastRow="0" w:firstColumn="0" w:lastColumn="0" w:oddVBand="0" w:evenVBand="0" w:oddHBand="1" w:evenHBand="0" w:firstRowFirstColumn="0" w:firstRowLastColumn="0" w:lastRowFirstColumn="0" w:lastRowLastColumn="0"/>
+        </w:trPr>
+        <w:tc>
+          <w:tcPr>
+            <w:cnfStyle w:val="001000000000" w:firstRow="0" w:lastRow="0" w:firstColumn="1" w:lastColumn="0" w:oddVBand="0" w:evenVBand="0" w:oddHBand="0" w:evenHBand="0" w:firstRowFirstColumn="0" w:firstRowLastColumn="0" w:lastRowFirstColumn="0" w:lastRowLastColumn="0"/>
+            <w:tcW w:w="4680" w:type="dxa"/>
+          </w:tcPr>
+          <w:p>
+            <w:r>
+              <w:t>21</w:t>
+            </w:r>
+          </w:p>
+        </w:tc>
+        <w:tc>
+          <w:tcPr>
+            <w:tcW w:w="4680" w:type="dxa"/>
+          </w:tcPr>
+          <w:p>
+            <w:pPr>
+              <w:cnfStyle w:val="000000100000" w:firstRow="0" w:lastRow="0" w:firstColumn="0" w:lastColumn="0" w:oddVBand="0" w:evenVBand="0" w:oddHBand="1" w:evenHBand="0" w:firstRowFirstColumn="0" w:firstRowLastColumn="0" w:lastRowFirstColumn="0" w:lastRowLastColumn="0"/>
+            </w:pPr>
+            <w:r>
+              <w:t>22</w:t>
+            </w:r>
+          </w:p>
+        </w:tc>
+      </w:tr>
+    </w:tbl>
+    <w:p>
+      <w:r>
+        <w:t>Plain Table 5 style:</w:t>
+      </w:r>
+    </w:p>
+    <w:tbl>
+      <w:tblPr>
+        <w:tblStyle w:val="PlainTable5"/>
+        <w:tblW w:w="0" w:type="auto"/>
+        <w:tblLayout w:type="fixed"/>
+        <w:tblLook w:val="04A0" w:firstRow="1" w:lastRow="0" w:firstColumn="1" w:lastColumn="0" w:noHBand="0" w:noVBand="1"/>
+      </w:tblPr>
+      <w:tblGrid>
+        <w:gridCol w:w="4680"/>
+        <w:gridCol w:w="4680"/>
+      </w:tblGrid>
+      <w:tr>
+        <w:trPr>
+          <w:cnfStyle w:val="100000000000" w:firstRow="1" w:lastRow="0" w:firstColumn="0" w:lastColumn="0" w:oddVBand="0" w:evenVBand="0" w:oddHBand="0" w:evenHBand="0" w:firstRowFirstColumn="0" w:firstRowLastColumn="0" w:lastRowFirstColumn="0" w:lastRowLastColumn="0"/>
+        </w:trPr>
+        <w:tc>
+          <w:tcPr>
+            <w:cnfStyle w:val="001000000100" w:firstRow="0" w:lastRow="0" w:firstColumn="1" w:lastColumn="0" w:oddVBand="0" w:evenVBand="0" w:oddHBand="0" w:evenHBand="0" w:firstRowFirstColumn="1" w:firstRowLastColumn="0" w:lastRowFirstColumn="0" w:lastRowLastColumn="0"/>
+            <w:tcW w:w="4680" w:type="dxa"/>
+          </w:tcPr>
+          <w:p>
+            <w:r>
+              <w:t>11</w:t>
+            </w:r>
+          </w:p>
+        </w:tc>
+        <w:tc>
+          <w:tcPr>
+            <w:tcW w:w="4680" w:type="dxa"/>
+          </w:tcPr>
+          <w:p>
+            <w:pPr>
+              <w:cnfStyle w:val="100000000000" w:firstRow="1" w:lastRow="0" w:firstColumn="0" w:lastColumn="0" w:oddVBand="0" w:evenVBand="0" w:oddHBand="0" w:evenHBand="0" w:firstRowFirstColumn="0" w:firstRowLastColumn="0" w:lastRowFirstColumn="0" w:lastRowLastColumn="0"/>
+            </w:pPr>
+            <w:r>
+              <w:t>12</w:t>
+            </w:r>
+          </w:p>
+        </w:tc>
+      </w:tr>
+      <w:tr>
+        <w:trPr>
+          <w:cnfStyle w:val="000000100000" w:firstRow="0" w:lastRow="0" w:firstColumn="0" w:lastColumn="0" w:oddVBand="0" w:evenVBand="0" w:oddHBand="1" w:evenHBand="0" w:firstRowFirstColumn="0" w:firstRowLastColumn="0" w:lastRowFirstColumn="0" w:lastRowLastColumn="0"/>
+        </w:trPr>
+        <w:tc>
+          <w:tcPr>
+            <w:cnfStyle w:val="001000000000" w:firstRow="0" w:lastRow="0" w:firstColumn="1" w:lastColumn="0" w:oddVBand="0" w:evenVBand="0" w:oddHBand="0" w:evenHBand="0" w:firstRowFirstColumn="0" w:firstRowLastColumn="0" w:lastRowFirstColumn="0" w:lastRowLastColumn="0"/>
+            <w:tcW w:w="4680" w:type="dxa"/>
+          </w:tcPr>
+          <w:p>
+            <w:r>
+              <w:t>21</w:t>
+            </w:r>
+          </w:p>
+        </w:tc>
+        <w:tc>
+          <w:tcPr>
+            <w:tcW w:w="4680" w:type="dxa"/>
+          </w:tcPr>
+          <w:p>
+            <w:pPr>
+              <w:cnfStyle w:val="000000100000" w:firstRow="0" w:lastRow="0" w:firstColumn="0" w:lastColumn="0" w:oddVBand="0" w:evenVBand="0" w:oddHBand="1" w:evenHBand="0" w:firstRowFirstColumn="0" w:firstRowLastColumn="0" w:lastRowFirstColumn="0" w:lastRowLastColumn="0"/>
+            </w:pPr>
+            <w:r>
+              <w:t>22</w:t>
+            </w:r>
+          </w:p>
+        </w:tc>
+      </w:tr>
+    </w:tbl>
+    <w:p>
+      <w:r>
+        <w:t>Grid Table 1 Light style:</w:t>
+      </w:r>
+    </w:p>
+    <w:tbl>
+      <w:tblPr>
+        <w:tblStyle w:val="GridTable1Light"/>
+        <w:tblW w:w="0" w:type="auto"/>
+        <w:tblLayout w:type="fixed"/>
+        <w:tblLook w:val="04A0" w:firstRow="1" w:lastRow="0" w:firstColumn="1" w:lastColumn="0" w:noHBand="0" w:noVBand="1"/>
+      </w:tblPr>
+      <w:tblGrid>
+        <w:gridCol w:w="4680"/>
+        <w:gridCol w:w="4680"/>
+      </w:tblGrid>
+      <w:tr>
+        <w:trPr>
+          <w:cnfStyle w:val="100000000000" w:firstRow="1" w:lastRow="0" w:firstColumn="0" w:lastColumn="0" w:oddVBand="0" w:evenVBand="0" w:oddHBand="0" w:evenHBand="0" w:firstRowFirstColumn="0" w:firstRowLastColumn="0" w:lastRowFirstColumn="0" w:lastRowLastColumn="0"/>
+        </w:trPr>
+        <w:tc>
+          <w:tcPr>
+            <w:cnfStyle w:val="001000000000" w:firstRow="0" w:lastRow="0" w:firstColumn="1" w:lastColumn="0" w:oddVBand="0" w:evenVBand="0" w:oddHBand="0" w:evenHBand="0" w:firstRowFirstColumn="0" w:firstRowLastColumn="0" w:lastRowFirstColumn="0" w:lastRowLastColumn="0"/>
+            <w:tcW w:w="4680" w:type="dxa"/>
+          </w:tcPr>
+          <w:p>
+            <w:r>
+              <w:t>11</w:t>
+            </w:r>
+          </w:p>
+        </w:tc>
+        <w:tc>
+          <w:tcPr>
+            <w:tcW w:w="4680" w:type="dxa"/>
+          </w:tcPr>
+          <w:p>
+            <w:pPr>
+              <w:cnfStyle w:val="100000000000" w:firstRow="1" w:lastRow="0" w:firstColumn="0" w:lastColumn="0" w:oddVBand="0" w:evenVBand="0" w:oddHBand="0" w:evenHBand="0" w:firstRowFirstColumn="0" w:firstRowLastColumn="0" w:lastRowFirstColumn="0" w:lastRowLastColumn="0"/>
+            </w:pPr>
+            <w:r>
+              <w:t>12</w:t>
+            </w:r>
+          </w:p>
+        </w:tc>
+      </w:tr>
+      <w:tr>
+        <w:tc>
+          <w:tcPr>
+            <w:cnfStyle w:val="001000000000" w:firstRow="0" w:lastRow="0" w:firstColumn="1" w:lastColumn="0" w:oddVBand="0" w:evenVBand="0" w:oddHBand="0" w:evenHBand="0" w:firstRowFirstColumn="0" w:firstRowLastColumn="0" w:lastRowFirstColumn="0" w:lastRowLastColumn="0"/>
+            <w:tcW w:w="4680" w:type="dxa"/>
+          </w:tcPr>
+          <w:p>
+            <w:r>
+              <w:t>21</w:t>
+            </w:r>
+          </w:p>
+        </w:tc>
+        <w:tc>
+          <w:tcPr>
+            <w:tcW w:w="4680" w:type="dxa"/>
+          </w:tcPr>
+          <w:p>
+            <w:pPr>
+              <w:cnfStyle w:val="000000000000" w:firstRow="0" w:lastRow="0" w:firstColumn="0" w:lastColumn="0" w:oddVBand="0" w:evenVBand="0" w:oddHBand="0" w:evenHBand="0" w:firstRowFirstColumn="0" w:firstRowLastColumn="0" w:lastRowFirstColumn="0" w:lastRowLastColumn="0"/>
+            </w:pPr>
+            <w:r>
+              <w:t>22</w:t>
+            </w:r>
+          </w:p>
+        </w:tc>
+      </w:tr>
+    </w:tbl>
+    <w:p>
+      <w:r>
+        <w:t>Grid Table 2 style:</w:t>
+      </w:r>
+    </w:p>
+    <w:tbl>
+      <w:tblPr>
+        <w:tblStyle w:val="GridTable2"/>
+        <w:tblW w:w="0" w:type="auto"/>
+        <w:tblLayout w:type="fixed"/>
+        <w:tblLook w:val="04A0" w:firstRow="1" w:lastRow="0" w:firstColumn="1" w:lastColumn="0" w:noHBand="0" w:noVBand="1"/>
+      </w:tblPr>
+      <w:tblGrid>
+        <w:gridCol w:w="4680"/>
+        <w:gridCol w:w="4680"/>
+      </w:tblGrid>
+      <w:tr>
+        <w:trPr>
+          <w:cnfStyle w:val="100000000000" w:firstRow="1" w:lastRow="0" w:firstColumn="0" w:lastColumn="0" w:oddVBand="0" w:evenVBand="0" w:oddHBand="0" w:evenHBand="0" w:firstRowFirstColumn="0" w:firstRowLastColumn="0" w:lastRowFirstColumn="0" w:lastRowLastColumn="0"/>
+        </w:trPr>
+        <w:tc>
+          <w:tcPr>
+            <w:cnfStyle w:val="001000000000" w:firstRow="0" w:lastRow="0" w:firstColumn="1" w:lastColumn="0" w:oddVBand="0" w:evenVBand="0" w:oddHBand="0" w:evenHBand="0" w:firstRowFirstColumn="0" w:firstRowLastColumn="0" w:lastRowFirstColumn="0" w:lastRowLastColumn="0"/>
+            <w:tcW w:w="4680" w:type="dxa"/>
+          </w:tcPr>
+          <w:p>
+            <w:r>
+              <w:t>11</w:t>
+            </w:r>
+          </w:p>
+        </w:tc>
+        <w:tc>
+          <w:tcPr>
+            <w:tcW w:w="4680" w:type="dxa"/>
+          </w:tcPr>
+          <w:p>
+            <w:pPr>
+              <w:cnfStyle w:val="100000000000" w:firstRow="1" w:lastRow="0" w:firstColumn="0" w:lastColumn="0" w:oddVBand="0" w:evenVBand="0" w:oddHBand="0" w:evenHBand="0" w:firstRowFirstColumn="0" w:firstRowLastColumn="0" w:lastRowFirstColumn="0" w:lastRowLastColumn="0"/>
+            </w:pPr>
+            <w:r>
+              <w:t>12</w:t>
+            </w:r>
+          </w:p>
+        </w:tc>
+      </w:tr>
+      <w:tr>
+        <w:trPr>
+          <w:cnfStyle w:val="000000100000" w:firstRow="0" w:lastRow="0" w:firstColumn="0" w:lastColumn="0" w:oddVBand="0" w:evenVBand="0" w:oddHBand="1" w:evenHBand="0" w:firstRowFirstColumn="0" w:firstRowLastColumn="0" w:lastRowFirstColumn="0" w:lastRowLastColumn="0"/>
+        </w:trPr>
+        <w:tc>
+          <w:tcPr>
+            <w:cnfStyle w:val="001000000000" w:firstRow="0" w:lastRow="0" w:firstColumn="1" w:lastColumn="0" w:oddVBand="0" w:evenVBand="0" w:oddHBand="0" w:evenHBand="0" w:firstRowFirstColumn="0" w:firstRowLastColumn="0" w:lastRowFirstColumn="0" w:lastRowLastColumn="0"/>
+            <w:tcW w:w="4680" w:type="dxa"/>
+          </w:tcPr>
+          <w:p>
+            <w:r>
+              <w:t>21</w:t>
+            </w:r>
+          </w:p>
+        </w:tc>
+        <w:tc>
+          <w:tcPr>
+            <w:tcW w:w="4680" w:type="dxa"/>
+          </w:tcPr>
+          <w:p>
+            <w:pPr>
+              <w:cnfStyle w:val="000000100000" w:firstRow="0" w:lastRow="0" w:firstColumn="0" w:lastColumn="0" w:oddVBand="0" w:evenVBand="0" w:oddHBand="1" w:evenHBand="0" w:firstRowFirstColumn="0" w:firstRowLastColumn="0" w:lastRowFirstColumn="0" w:lastRowLastColumn="0"/>
+            </w:pPr>
+            <w:r>
+              <w:t>22</w:t>
+            </w:r>
+          </w:p>
+        </w:tc>
+      </w:tr>
+    </w:tbl>
+    <w:p>
+      <w:r>
+        <w:t>Grid Table 4 style:</w:t>
+      </w:r>
+    </w:p>
+    <w:tbl>
+      <w:tblPr>
+        <w:tblStyle w:val="GridTable4"/>
+        <w:tblW w:w="0" w:type="auto"/>
+        <w:tblLayout w:type="fixed"/>
+        <w:tblLook w:val="04A0" w:firstRow="1" w:lastRow="0" w:firstColumn="1" w:lastColumn="0" w:noHBand="0" w:noVBand="1"/>
+      </w:tblPr>
+      <w:tblGrid>
+        <w:gridCol w:w="4680"/>
+        <w:gridCol w:w="4680"/>
+      </w:tblGrid>
+      <w:tr>
+        <w:trPr>
+          <w:cnfStyle w:val="100000000000" w:firstRow="1" w:lastRow="0" w:firstColumn="0" w:lastColumn="0" w:oddVBand="0" w:evenVBand="0" w:oddHBand="0" w:evenHBand="0" w:firstRowFirstColumn="0" w:firstRowLastColumn="0" w:lastRowFirstColumn="0" w:lastRowLastColumn="0"/>
+        </w:trPr>
+        <w:tc>
+          <w:tcPr>
+            <w:cnfStyle w:val="001000000000" w:firstRow="0" w:lastRow="0" w:firstColumn="1" w:lastColumn="0" w:oddVBand="0" w:evenVBand="0" w:oddHBand="0" w:evenHBand="0" w:firstRowFirstColumn="0" w:firstRowLastColumn="0" w:lastRowFirstColumn="0" w:lastRowLastColumn="0"/>
+            <w:tcW w:w="4680" w:type="dxa"/>
+          </w:tcPr>
+          <w:p>
+            <w:r>
+              <w:t>11</w:t>
+            </w:r>
+          </w:p>
+        </w:tc>
+        <w:tc>
+          <w:tcPr>
+            <w:tcW w:w="4680" w:type="dxa"/>
+          </w:tcPr>
+          <w:p>
+            <w:pPr>
+              <w:cnfStyle w:val="100000000000" w:firstRow="1" w:lastRow="0" w:firstColumn="0" w:lastColumn="0" w:oddVBand="0" w:evenVBand="0" w:oddHBand="0" w:evenHBand="0" w:firstRowFirstColumn="0" w:firstRowLastColumn="0" w:lastRowFirstColumn="0" w:lastRowLastColumn="0"/>
+            </w:pPr>
+            <w:r>
+              <w:t>12</w:t>
+            </w:r>
+          </w:p>
+        </w:tc>
+      </w:tr>
+      <w:tr>
+        <w:trPr>
+          <w:cnfStyle w:val="000000100000" w:firstRow="0" w:lastRow="0" w:firstColumn="0" w:lastColumn="0" w:oddVBand="0" w:evenVBand="0" w:oddHBand="1" w:evenHBand="0" w:firstRowFirstColumn="0" w:firstRowLastColumn="0" w:lastRowFirstColumn="0" w:lastRowLastColumn="0"/>
+        </w:trPr>
+        <w:tc>
+          <w:tcPr>
+            <w:cnfStyle w:val="001000000000" w:firstRow="0" w:lastRow="0" w:firstColumn="1" w:lastColumn="0" w:oddVBand="0" w:evenVBand="0" w:oddHBand="0" w:evenHBand="0" w:firstRowFirstColumn="0" w:firstRowLastColumn="0" w:lastRowFirstColumn="0" w:lastRowLastColumn="0"/>
+            <w:tcW w:w="4680" w:type="dxa"/>
+          </w:tcPr>
+          <w:p>
+            <w:r>
+              <w:t>21</w:t>
+            </w:r>
+          </w:p>
+        </w:tc>
+        <w:tc>
+          <w:tcPr>
+            <w:tcW w:w="4680" w:type="dxa"/>
+          </w:tcPr>
+          <w:p>
+            <w:pPr>
+              <w:cnfStyle w:val="000000100000" w:firstRow="0" w:lastRow="0" w:firstColumn="0" w:lastColumn="0" w:oddVBand="0" w:evenVBand="0" w:oddHBand="1" w:evenHBand="0" w:firstRowFirstColumn="0" w:firstRowLastColumn="0" w:lastRowFirstColumn="0" w:lastRowLastColumn="0"/>
+            </w:pPr>
+            <w:r>
+              <w:t>22</w:t>
+            </w:r>
+          </w:p>
+        </w:tc>
+      </w:tr>
+    </w:tbl>
+    <w:p>
+      <w:r>
+        <w:t>Grid Table 4 - Accent 1 style:</w:t>
+      </w:r>
+    </w:p>
+    <w:tbl>
+      <w:tblPr>
+        <w:tblStyle w:val="GridTable4-Accent1"/>
+        <w:tblW w:w="0" w:type="auto"/>
+        <w:tblLayout w:type="fixed"/>
+        <w:tblLook w:val="04A0" w:firstRow="1" w:lastRow="0" w:firstColumn="1" w:lastColumn="0" w:noHBand="0" w:noVBand="1"/>
+      </w:tblPr>
+      <w:tblGrid>
+        <w:gridCol w:w="4680"/>
+        <w:gridCol w:w="4680"/>
+      </w:tblGrid>
+      <w:tr>
+        <w:trPr>
+          <w:cnfStyle w:val="100000000000" w:firstRow="1" w:lastRow="0" w:firstColumn="0" w:lastColumn="0" w:oddVBand="0" w:evenVBand="0" w:oddHBand="0" w:evenHBand="0" w:firstRowFirstColumn="0" w:firstRowLastColumn="0" w:lastRowFirstColumn="0" w:lastRowLastColumn="0"/>
+        </w:trPr>
+        <w:tc>
+          <w:tcPr>
+            <w:cnfStyle w:val="001000000000" w:firstRow="0" w:lastRow="0" w:firstColumn="1" w:lastColumn="0" w:oddVBand="0" w:evenVBand="0" w:oddHBand="0" w:evenHBand="0" w:firstRowFirstColumn="0" w:firstRowLastColumn="0" w:lastRowFirstColumn="0" w:lastRowLastColumn="0"/>
+            <w:tcW w:w="4680" w:type="dxa"/>
+          </w:tcPr>
+          <w:p>
+            <w:r>
+              <w:t>11</w:t>
+            </w:r>
+          </w:p>
+        </w:tc>
+        <w:tc>
+          <w:tcPr>
+            <w:tcW w:w="4680" w:type="dxa"/>
+          </w:tcPr>
+          <w:p>
+            <w:pPr>
+              <w:cnfStyle w:val="100000000000" w:firstRow="1" w:lastRow="0" w:firstColumn="0" w:lastColumn="0" w:oddVBand="0" w:evenVBand="0" w:oddHBand="0" w:evenHBand="0" w:firstRowFirstColumn="0" w:firstRowLastColumn="0" w:lastRowFirstColumn="0" w:lastRowLastColumn="0"/>
+            </w:pPr>
+            <w:r>
+              <w:t>12</w:t>
+            </w:r>
+          </w:p>
+        </w:tc>
+      </w:tr>
+      <w:tr>
+        <w:trPr>
+          <w:cnfStyle w:val="000000100000" w:firstRow="0" w:lastRow="0" w:firstColumn="0" w:lastColumn="0" w:oddVBand="0" w:evenVBand="0" w:oddHBand="1" w:evenHBand="0" w:firstRowFirstColumn="0" w:firstRowLastColumn="0" w:lastRowFirstColumn="0" w:lastRowLastColumn="0"/>
+        </w:trPr>
+        <w:tc>
+          <w:tcPr>
+            <w:cnfStyle w:val="001000000000" w:firstRow="0" w:lastRow="0" w:firstColumn="1" w:lastColumn="0" w:oddVBand="0" w:evenVBand="0" w:oddHBand="0" w:evenHBand="0" w:firstRowFirstColumn="0" w:firstRowLastColumn="0" w:lastRowFirstColumn="0" w:lastRowLastColumn="0"/>
+            <w:tcW w:w="4680" w:type="dxa"/>
+          </w:tcPr>
+          <w:p>
+            <w:r>
+              <w:t>21</w:t>
+            </w:r>
+          </w:p>
+        </w:tc>
+        <w:tc>
+          <w:tcPr>
+            <w:tcW w:w="4680" w:type="dxa"/>
+          </w:tcPr>
+          <w:p>
+            <w:pPr>
+              <w:cnfStyle w:val="000000100000" w:firstRow="0" w:lastRow="0" w:firstColumn="0" w:lastColumn="0" w:oddVBand="0" w:evenVBand="0" w:oddHBand="1" w:evenHBand="0" w:firstRowFirstColumn="0" w:firstRowLastColumn="0" w:lastRowFirstColumn="0" w:lastRowLastColumn="0"/>
+            </w:pPr>
+            <w:r>
+              <w:t>22</w:t>
+            </w:r>
+          </w:p>
+        </w:tc>
+      </w:tr>
+    </w:tbl>
+    <w:p>
+      <w:r>
+        <w:t>Grid Table 5 Dark style:</w:t>
+      </w:r>
+    </w:p>
+    <w:tbl>
+      <w:tblPr>
+        <w:tblStyle w:val="GridTable5Dark"/>
+        <w:tblW w:w="0" w:type="auto"/>
+        <w:tblLayout w:type="fixed"/>
+        <w:tblLook w:val="04A0" w:firstRow="1" w:lastRow="0" w:firstColumn="1" w:lastColumn="0" w:noHBand="0" w:noVBand="1"/>
+      </w:tblPr>
+      <w:tblGrid>
+        <w:gridCol w:w="4680"/>
+        <w:gridCol w:w="4680"/>
+      </w:tblGrid>
+      <w:tr>
+        <w:trPr>
+          <w:cnfStyle w:val="100000000000" w:firstRow="1" w:lastRow="0" w:firstColumn="0" w:lastColumn="0" w:oddVBand="0" w:evenVBand="0" w:oddHBand="0" w:evenHBand="0" w:firstRowFirstColumn="0" w:firstRowLastColumn="0" w:lastRowFirstColumn="0" w:lastRowLastColumn="0"/>
+        </w:trPr>
+        <w:tc>
+          <w:tcPr>
+            <w:cnfStyle w:val="001000000000" w:firstRow="0" w:lastRow="0" w:firstColumn="1" w:lastColumn="0" w:oddVBand="0" w:evenVBand="0" w:oddHBand="0" w:evenHBand="0" w:firstRowFirstColumn="0" w:firstRowLastColumn="0" w:lastRowFirstColumn="0" w:lastRowLastColumn="0"/>
+            <w:tcW w:w="4680" w:type="dxa"/>
+          </w:tcPr>
+          <w:p>
+            <w:r>
+              <w:t>11</w:t>
+            </w:r>
+          </w:p>
+        </w:tc>
+        <w:tc>
+          <w:tcPr>
+            <w:tcW w:w="4680" w:type="dxa"/>
+          </w:tcPr>
+          <w:p>
+            <w:pPr>
+              <w:cnfStyle w:val="100000000000" w:firstRow="1" w:lastRow="0" w:firstColumn="0" w:lastColumn="0" w:oddVBand="0" w:evenVBand="0" w:oddHBand="0" w:evenHBand="0" w:firstRowFirstColumn="0" w:firstRowLastColumn="0" w:lastRowFirstColumn="0" w:lastRowLastColumn="0"/>
+            </w:pPr>
+            <w:r>
+              <w:t>12</w:t>
+            </w:r>
+          </w:p>
+        </w:tc>
+      </w:tr>
+      <w:tr>
+        <w:trPr>
+          <w:cnfStyle w:val="000000100000" w:firstRow="0" w:lastRow="0" w:firstColumn="0" w:lastColumn="0" w:oddVBand="0" w:evenVBand="0" w:oddHBand="1" w:evenHBand="0" w:firstRowFirstColumn="0" w:firstRowLastColumn="0" w:lastRowFirstColumn="0" w:lastRowLastColumn="0"/>
+        </w:trPr>
+        <w:tc>
+          <w:tcPr>
+            <w:cnfStyle w:val="001000000000" w:firstRow="0" w:lastRow="0" w:firstColumn="1" w:lastColumn="0" w:oddVBand="0" w:evenVBand="0" w:oddHBand="0" w:evenHBand="0" w:firstRowFirstColumn="0" w:firstRowLastColumn="0" w:lastRowFirstColumn="0" w:lastRowLastColumn="0"/>
+            <w:tcW w:w="4680" w:type="dxa"/>
+          </w:tcPr>
+          <w:p>
+            <w:r>
+              <w:t>21</w:t>
+            </w:r>
+          </w:p>
+        </w:tc>
+        <w:tc>
+          <w:tcPr>
+            <w:tcW w:w="4680" w:type="dxa"/>
+          </w:tcPr>
+          <w:p>
+            <w:pPr>
+              <w:cnfStyle w:val="000000100000" w:firstRow="0" w:lastRow="0" w:firstColumn="0" w:lastColumn="0" w:oddVBand="0" w:evenVBand="0" w:oddHBand="1" w:evenHBand="0" w:firstRowFirstColumn="0" w:firstRowLastColumn="0" w:lastRowFirstColumn="0" w:lastRowLastColumn="0"/>
+            </w:pPr>
+            <w:r>
+              <w:t>22</w:t>
+            </w:r>
+          </w:p>
+        </w:tc>
+      </w:tr>
+    </w:tbl>
+    <w:p>
+      <w:r>
+        <w:t>List Table 1 Light style:</w:t>
+      </w:r>
+    </w:p>
+    <w:tbl>
+      <w:tblPr>
+        <w:tblStyle w:val="ListTable1Light"/>
+        <w:tblW w:w="0" w:type="auto"/>
+        <w:tblLayout w:type="fixed"/>
+        <w:tblLook w:val="04A0" w:firstRow="1" w:lastRow="0" w:firstColumn="1" w:lastColumn="0" w:noHBand="0" w:noVBand="1"/>
+      </w:tblPr>
+      <w:tblGrid>
+        <w:gridCol w:w="4680"/>
+        <w:gridCol w:w="4680"/>
+      </w:tblGrid>
+      <w:tr>
+        <w:trPr>
+          <w:cnfStyle w:val="100000000000" w:firstRow="1" w:lastRow="0" w:firstColumn="0" w:lastColumn="0" w:oddVBand="0" w:evenVBand="0" w:oddHBand="0" w:evenHBand="0" w:firstRowFirstColumn="0" w:firstRowLastColumn="0" w:lastRowFirstColumn="0" w:lastRowLastColumn="0"/>
+        </w:trPr>
+        <w:tc>
+          <w:tcPr>
+            <w:cnfStyle w:val="001000000000" w:firstRow="0" w:lastRow="0" w:firstColumn="1" w:lastColumn="0" w:oddVBand="0" w:evenVBand="0" w:oddHBand="0" w:evenHBand="0" w:firstRowFirstColumn="0" w:firstRowLastColumn="0" w:lastRowFirstColumn="0" w:lastRowLastColumn="0"/>
+            <w:tcW w:w="4680" w:type="dxa"/>
+          </w:tcPr>
+          <w:p>
+            <w:r>
+              <w:t>11</w:t>
+            </w:r>
+          </w:p>
+        </w:tc>
+        <w:tc>
+          <w:tcPr>
+            <w:tcW w:w="4680" w:type="dxa"/>
+          </w:tcPr>
+          <w:p>
+            <w:pPr>
+              <w:cnfStyle w:val="100000000000" w:firstRow="1" w:lastRow="0" w:firstColumn="0" w:lastColumn="0" w:oddVBand="0" w:evenVBand="0" w:oddHBand="0" w:evenHBand="0" w:firstRowFirstColumn="0" w:firstRowLastColumn="0" w:lastRowFirstColumn="0" w:lastRowLastColumn="0"/>
+            </w:pPr>
+            <w:r>
+              <w:t>12</w:t>
+            </w:r>
+          </w:p>
+        </w:tc>
+      </w:tr>
+      <w:tr>
+        <w:trPr>
+          <w:cnfStyle w:val="000000100000" w:firstRow="0" w:lastRow="0" w:firstColumn="0" w:lastColumn="0" w:oddVBand="0" w:evenVBand="0" w:oddHBand="1" w:evenHBand="0" w:firstRowFirstColumn="0" w:firstRowLastColumn="0" w:lastRowFirstColumn="0" w:lastRowLastColumn="0"/>
+        </w:trPr>
+        <w:tc>
+          <w:tcPr>
+            <w:cnfStyle w:val="001000000000" w:firstRow="0" w:lastRow="0" w:firstColumn="1" w:lastColumn="0" w:oddVBand="0" w:evenVBand="0" w:oddHBand="0" w:evenHBand="0" w:firstRowFirstColumn="0" w:firstRowLastColumn="0" w:lastRowFirstColumn="0" w:lastRowLastColumn="0"/>
+            <w:tcW w:w="4680" w:type="dxa"/>
+          </w:tcPr>
+          <w:p>
+            <w:r>
+              <w:t>21</w:t>
+            </w:r>
+          </w:p>
+        </w:tc>
+        <w:tc>
+          <w:tcPr>
+            <w:tcW w:w="4680" w:type="dxa"/>
+          </w:tcPr>
+          <w:p>
+            <w:pPr>
+              <w:cnfStyle w:val="000000100000" w:firstRow="0" w:lastRow="0" w:firstColumn="0" w:lastColumn="0" w:oddVBand="0" w:evenVBand="0" w:oddHBand="1" w:evenHBand="0" w:firstRowFirstColumn="0" w:firstRowLastColumn="0" w:lastRowFirstColumn="0" w:lastRowLastColumn="0"/>
+            </w:pPr>
+            <w:r>
+              <w:t>22</w:t>
+            </w:r>
+          </w:p>
+        </w:tc>
+      </w:tr>
+    </w:tbl>
+    <w:p>
+      <w:r>
+        <w:t>List Table 2 style:</w:t>
+      </w:r>
+    </w:p>
+    <w:tbl>
+      <w:tblPr>
+        <w:tblStyle w:val="ListTable2"/>
+        <w:tblW w:w="0" w:type="auto"/>
+        <w:tblLayout w:type="fixed"/>
+        <w:tblLook w:val="04A0" w:firstRow="1" w:lastRow="0" w:firstColumn="1" w:lastColumn="0" w:noHBand="0" w:noVBand="1"/>
+      </w:tblPr>
+      <w:tblGrid>
+        <w:gridCol w:w="4680"/>
+        <w:gridCol w:w="4680"/>
+      </w:tblGrid>
+      <w:tr>
+        <w:trPr>
+          <w:cnfStyle w:val="100000000000" w:firstRow="1" w:lastRow="0" w:firstColumn="0" w:lastColumn="0" w:oddVBand="0" w:evenVBand="0" w:oddHBand="0" w:evenHBand="0" w:firstRowFirstColumn="0" w:firstRowLastColumn="0" w:lastRowFirstColumn="0" w:lastRowLastColumn="0"/>
+        </w:trPr>
+        <w:tc>
+          <w:tcPr>
+            <w:cnfStyle w:val="001000000000" w:firstRow="0" w:lastRow="0" w:firstColumn="1" w:lastColumn="0" w:oddVBand="0" w:evenVBand="0" w:oddHBand="0" w:evenHBand="0" w:firstRowFirstColumn="0" w:firstRowLastColumn="0" w:lastRowFirstColumn="0" w:lastRowLastColumn="0"/>
+            <w:tcW w:w="4680" w:type="dxa"/>
+          </w:tcPr>
+          <w:p>
+            <w:r>
+              <w:t>11</w:t>
+            </w:r>
+          </w:p>
+        </w:tc>
+        <w:tc>
+          <w:tcPr>
+            <w:tcW w:w="4680" w:type="dxa"/>
+          </w:tcPr>
+          <w:p>
+            <w:pPr>
+              <w:cnfStyle w:val="100000000000" w:firstRow="1" w:lastRow="0" w:firstColumn="0" w:lastColumn="0" w:oddVBand="0" w:evenVBand="0" w:oddHBand="0" w:evenHBand="0" w:firstRowFirstColumn="0" w:firstRowLastColumn="0" w:lastRowFirstColumn="0" w:lastRowLastColumn="0"/>
+            </w:pPr>
+            <w:r>
+              <w:t>12</w:t>
+            </w:r>
+          </w:p>
+        </w:tc>
+      </w:tr>
+      <w:tr>
+        <w:trPr>
+          <w:cnfStyle w:val="000000100000" w:firstRow="0" w:lastRow="0" w:firstColumn="0" w:lastColumn="0" w:oddVBand="0" w:evenVBand="0" w:oddHBand="1" w:evenHBand="0" w:firstRowFirstColumn="0" w:firstRowLastColumn="0" w:lastRowFirstColumn="0" w:lastRowLastColumn="0"/>
+        </w:trPr>
+        <w:tc>
+          <w:tcPr>
+            <w:cnfStyle w:val="001000000000" w:firstRow="0" w:lastRow="0" w:firstColumn="1" w:lastColumn="0" w:oddVBand="0" w:evenVBand="0" w:oddHBand="0" w:evenHBand="0" w:firstRowFirstColumn="0" w:firstRowLastColumn="0" w:lastRowFirstColumn="0" w:lastRowLastColumn="0"/>
+            <w:tcW w:w="4680" w:type="dxa"/>
+          </w:tcPr>
+          <w:p>
+            <w:r>
+              <w:t>21</w:t>
+            </w:r>
+          </w:p>
+        </w:tc>
+        <w:tc>
+          <w:tcPr>
+            <w:tcW w:w="4680" w:type="dxa"/>
+          </w:tcPr>
+          <w:p>
+            <w:pPr>
+              <w:cnfStyle w:val="000000100000" w:firstRow="0" w:lastRow="0" w:firstColumn="0" w:lastColumn="0" w:oddVBand="0" w:evenVBand="0" w:oddHBand="1" w:evenHBand="0" w:firstRowFirstColumn="0" w:firstRowLastColumn="0" w:lastRowFirstColumn="0" w:lastRowLastColumn="0"/>
+            </w:pPr>
+            <w:r>
+              <w:t>22</w:t>
+            </w:r>
+          </w:p>
+        </w:tc>
+      </w:tr>
+    </w:tbl>
+    <w:p>
+      <w:r>
+        <w:t>List Table 3 style:</w:t>
+      </w:r>
+    </w:p>
+    <w:tbl>
+      <w:tblPr>
+        <w:tblStyle w:val="ListTable3"/>
+        <w:tblW w:w="0" w:type="auto"/>
+        <w:tblLayout w:type="fixed"/>
+        <w:tblLook w:val="04A0" w:firstRow="1" w:lastRow="0" w:firstColumn="1" w:lastColumn="0" w:noHBand="0" w:noVBand="1"/>
+      </w:tblPr>
+      <w:tblGrid>
+        <w:gridCol w:w="4680"/>
+        <w:gridCol w:w="4680"/>
+      </w:tblGrid>
+      <w:tr>
+        <w:trPr>
+          <w:cnfStyle w:val="100000000000" w:firstRow="1" w:lastRow="0" w:firstColumn="0" w:lastColumn="0" w:oddVBand="0" w:evenVBand="0" w:oddHBand="0" w:evenHBand="0" w:firstRowFirstColumn="0" w:firstRowLastColumn="0" w:lastRowFirstColumn="0" w:lastRowLastColumn="0"/>
+        </w:trPr>
+        <w:tc>
+          <w:tcPr>
+            <w:cnfStyle w:val="001000000100" w:firstRow="0" w:lastRow="0" w:firstColumn="1" w:lastColumn="0" w:oddVBand="0" w:evenVBand="0" w:oddHBand="0" w:evenHBand="0" w:firstRowFirstColumn="1" w:firstRowLastColumn="0" w:lastRowFirstColumn="0" w:lastRowLastColumn="0"/>
+            <w:tcW w:w="4680" w:type="dxa"/>
+          </w:tcPr>
+          <w:p>
+            <w:r>
+              <w:t>11</w:t>
+            </w:r>
+          </w:p>
+        </w:tc>
+        <w:tc>
+          <w:tcPr>
+            <w:tcW w:w="4680" w:type="dxa"/>
+          </w:tcPr>
+          <w:p>
+            <w:pPr>
+              <w:cnfStyle w:val="100000000000" w:firstRow="1" w:lastRow="0" w:firstColumn="0" w:lastColumn="0" w:oddVBand="0" w:evenVBand="0" w:oddHBand="0" w:evenHBand="0" w:firstRowFirstColumn="0" w:firstRowLastColumn="0" w:lastRowFirstColumn="0" w:lastRowLastColumn="0"/>
+            </w:pPr>
+            <w:r>
+              <w:t>12</w:t>
+            </w:r>
+          </w:p>
+        </w:tc>
+      </w:tr>
+      <w:tr>
+        <w:trPr>
+          <w:cnfStyle w:val="000000100000" w:firstRow="0" w:lastRow="0" w:firstColumn="0" w:lastColumn="0" w:oddVBand="0" w:evenVBand="0" w:oddHBand="1" w:evenHBand="0" w:firstRowFirstColumn="0" w:firstRowLastColumn="0" w:lastRowFirstColumn="0" w:lastRowLastColumn="0"/>
+        </w:trPr>
+        <w:tc>
+          <w:tcPr>
+            <w:cnfStyle w:val="001000000000" w:firstRow="0" w:lastRow="0" w:firstColumn="1" w:lastColumn="0" w:oddVBand="0" w:evenVBand="0" w:oddHBand="0" w:evenHBand="0" w:firstRowFirstColumn="0" w:firstRowLastColumn="0" w:lastRowFirstColumn="0" w:lastRowLastColumn="0"/>
+            <w:tcW w:w="4680" w:type="dxa"/>
+          </w:tcPr>
+          <w:p>
+            <w:r>
+              <w:t>21</w:t>
+            </w:r>
+          </w:p>
+        </w:tc>
+        <w:tc>
+          <w:tcPr>
+            <w:tcW w:w="4680" w:type="dxa"/>
+          </w:tcPr>
+          <w:p>
+            <w:pPr>
+              <w:cnfStyle w:val="000000100000" w:firstRow="0" w:lastRow="0" w:firstColumn="0" w:lastColumn="0" w:oddVBand="0" w:evenVBand="0" w:oddHBand="1" w:evenHBand="0" w:firstRowFirstColumn="0" w:firstRowLastColumn="0" w:lastRowFirstColumn="0" w:lastRowLastColumn="0"/>
+            </w:pPr>
+            <w:r>
+              <w:t>22</w:t>
+            </w:r>
+          </w:p>
+        </w:tc>
+      </w:tr>
+    </w:tbl>
+    <w:p>
+      <w:r>
+        <w:t>List Table 4 - Accent 1 style:</w:t>
+      </w:r>
+    </w:p>
+    <w:tbl>
+      <w:tblPr>
+        <w:tblStyle w:val="ListTable4-Accent1"/>
+        <w:tblW w:w="0" w:type="auto"/>
+        <w:tblLayout w:type="fixed"/>
+        <w:tblLook w:val="04A0" w:firstRow="1" w:lastRow="0" w:firstColumn="1" w:lastColumn="0" w:noHBand="0" w:noVBand="1"/>
+      </w:tblPr>
+      <w:tblGrid>
+        <w:gridCol w:w="4680"/>
+        <w:gridCol w:w="4680"/>
+      </w:tblGrid>
+      <w:tr>
+        <w:trPr>
+          <w:cnfStyle w:val="100000000000" w:firstRow="1" w:lastRow="0" w:firstColumn="0" w:lastColumn="0" w:oddVBand="0" w:evenVBand="0" w:oddHBand="0" w:evenHBand="0" w:firstRowFirstColumn="0" w:firstRowLastColumn="0" w:lastRowFirstColumn="0" w:lastRowLastColumn="0"/>
+        </w:trPr>
+        <w:tc>
+          <w:tcPr>
+            <w:cnfStyle w:val="001000000000" w:firstRow="0" w:lastRow="0" w:firstColumn="1" w:lastColumn="0" w:oddVBand="0" w:evenVBand="0" w:oddHBand="0" w:evenHBand="0" w:firstRowFirstColumn="0" w:firstRowLastColumn="0" w:lastRowFirstColumn="0" w:lastRowLastColumn="0"/>
+            <w:tcW w:w="4680" w:type="dxa"/>
+          </w:tcPr>
+          <w:p>
+            <w:r>
+              <w:t>11</w:t>
+            </w:r>
+          </w:p>
+        </w:tc>
+        <w:tc>
+          <w:tcPr>
+            <w:tcW w:w="4680" w:type="dxa"/>
+          </w:tcPr>
+          <w:p>
+            <w:pPr>
+              <w:cnfStyle w:val="100000000000" w:firstRow="1" w:lastRow="0" w:firstColumn="0" w:lastColumn="0" w:oddVBand="0" w:evenVBand="0" w:oddHBand="0" w:evenHBand="0" w:firstRowFirstColumn="0" w:firstRowLastColumn="0" w:lastRowFirstColumn="0" w:lastRowLastColumn="0"/>
+            </w:pPr>
+            <w:r>
+              <w:t>12</w:t>
+            </w:r>
+          </w:p>
+        </w:tc>
+      </w:tr>
+      <w:tr>
+        <w:trPr>
+          <w:cnfStyle w:val="000000100000" w:firstRow="0" w:lastRow="0" w:firstColumn="0" w:lastColumn="0" w:oddVBand="0" w:evenVBand="0" w:oddHBand="1" w:evenHBand="0" w:firstRowFirstColumn="0" w:firstRowLastColumn="0" w:lastRowFirstColumn="0" w:lastRowLastColumn="0"/>
+        </w:trPr>
+        <w:tc>
+          <w:tcPr>
+            <w:cnfStyle w:val="001000000000" w:firstRow="0" w:lastRow="0" w:firstColumn="1" w:lastColumn="0" w:oddVBand="0" w:evenVBand="0" w:oddHBand="0" w:evenHBand="0" w:firstRowFirstColumn="0" w:firstRowLastColumn="0" w:lastRowFirstColumn="0" w:lastRowLastColumn="0"/>
+            <w:tcW w:w="4680" w:type="dxa"/>
+          </w:tcPr>
+          <w:p>
+            <w:r>
+              <w:t>21</w:t>
+            </w:r>
+          </w:p>
+        </w:tc>
+        <w:tc>
+          <w:tcPr>
+            <w:tcW w:w="4680" w:type="dxa"/>
+          </w:tcPr>
+          <w:p>
+            <w:pPr>
+              <w:cnfStyle w:val="000000100000" w:firstRow="0" w:lastRow="0" w:firstColumn="0" w:lastColumn="0" w:oddVBand="0" w:evenVBand="0" w:oddHBand="1" w:evenHBand="0" w:firstRowFirstColumn="0" w:firstRowLastColumn="0" w:lastRowFirstColumn="0" w:lastRowLastColumn="0"/>
+            </w:pPr>
+            <w:r>
+              <w:t>22</w:t>
+            </w:r>
+          </w:p>
+        </w:tc>
+      </w:tr>
+    </w:tbl>
     <w:p/>
     <w:sectPr>
       <w:pgSz w:w="12240" w:h="15840"/>
@@ -369,6 +1819,146 @@
     </w:sectPr>
   </w:body>
 </w:document>
+</file>
+
+<file path=word/numbering.xml><?xml version="1.0" encoding="utf-8"?>
+<w:numbering xmlns:wpc="http://schemas.microsoft.com/office/word/2010/wordprocessingCanvas" xmlns:cx="http://schemas.microsoft.com/office/drawing/2014/chartex" xmlns:cx1="http://schemas.microsoft.com/office/drawing/2015/9/8/chartex" xmlns:cx2="http://schemas.microsoft.com/office/drawing/2015/10/21/chartex" xmlns:cx3="http://schemas.microsoft.com/office/drawing/2016/5/9/chartex" xmlns:cx4="http://schemas.microsoft.com/office/drawing/2016/5/10/chartex" xmlns:cx5="http://schemas.microsoft.com/office/drawing/2016/5/11/chartex" xmlns:cx6="http://schemas.microsoft.com/office/drawing/2016/5/12/chartex" xmlns:cx7="http://schemas.microsoft.com/office/drawing/2016/5/13/chartex" xmlns:cx8="http://schemas.microsoft.com/office/drawing/2016/5/14/chartex" xmlns:mc="http://schemas.openxmlformats.org/markup-compatibility/2006" xmlns:aink="http://schemas.microsoft.com/office/drawing/2016/ink" xmlns:am3d="http://schemas.microsoft.com/office/drawing/2017/model3d" xmlns:o="urn:schemas-microsoft-com:office:office" xmlns:oel="http://schemas.microsoft.com/office/2019/extlst" xmlns:r="http://schemas.openxmlformats.org/officeDocument/2006/relationships" xmlns:m="http://schemas.openxmlformats.org/officeDocument/2006/math" xmlns:v="urn:schemas-microsoft-com:vml" xmlns:wp14="http://schemas.microsoft.com/office/word/2010/wordprocessingDrawing" xmlns:wp="http://schemas.openxmlformats.org/drawingml/2006/wordprocessingDrawing" xmlns:w10="urn:schemas-microsoft-com:office:word" xmlns:w="http://schemas.openxmlformats.org/wordprocessingml/2006/main" xmlns:w14="http://schemas.microsoft.com/office/word/2010/wordml" xmlns:w15="http://schemas.microsoft.com/office/word/2012/wordml" xmlns:w16cex="http://schemas.microsoft.com/office/word/2018/wordml/cex" xmlns:w16cid="http://schemas.microsoft.com/office/word/2016/wordml/cid" xmlns:w16="http://schemas.microsoft.com/office/word/2018/wordml" xmlns:w16du="http://schemas.microsoft.com/office/word/2023/wordml/word16du" xmlns:w16sdtdh="http://schemas.microsoft.com/office/word/2020/wordml/sdtdatahash" xmlns:w16sdtfl="http://schemas.microsoft.com/office/word/2024/wordml/sdtformatlock" xmlns:w16se="http://schemas.microsoft.com/office/word/2015/wordml/symex" xmlns:wpg="http://schemas.microsoft.com/office/word/2010/wordprocessingGroup" xmlns:wpi="http://schemas.microsoft.com/office/word/2010/wordprocessingInk" xmlns:wne="http://schemas.microsoft.com/office/word/2006/wordml" xmlns:wps="http://schemas.microsoft.com/office/word/2010/wordprocessingShape" mc:Ignorable="w14 w15 w16se w16cid w16 w16cex w16sdtdh w16sdtfl w16du wp14">
+  <w:abstractNum w:abstractNumId="0" w15:restartNumberingAfterBreak="0">
+    <w:nsid w:val="FFFFFF7E"/>
+    <w:multiLevelType w:val="singleLevel"/>
+    <w:tmpl w:val="3482D650"/>
+    <w:lvl w:ilvl="0">
+      <w:start w:val="1"/>
+      <w:numFmt w:val="decimal"/>
+      <w:pStyle w:val="ListNumber3"/>
+      <w:lvlText w:val="%1."/>
+      <w:lvlJc w:val="left"/>
+      <w:pPr>
+        <w:tabs>
+          <w:tab w:val="num" w:pos="1080"/>
+        </w:tabs>
+        <w:ind w:left="1080" w:hanging="360"/>
+      </w:pPr>
+    </w:lvl>
+  </w:abstractNum>
+  <w:abstractNum w:abstractNumId="1" w15:restartNumberingAfterBreak="0">
+    <w:nsid w:val="FFFFFF7F"/>
+    <w:multiLevelType w:val="singleLevel"/>
+    <w:tmpl w:val="32626612"/>
+    <w:lvl w:ilvl="0">
+      <w:start w:val="1"/>
+      <w:numFmt w:val="decimal"/>
+      <w:pStyle w:val="ListNumber2"/>
+      <w:lvlText w:val="%1."/>
+      <w:lvlJc w:val="left"/>
+      <w:pPr>
+        <w:tabs>
+          <w:tab w:val="num" w:pos="720"/>
+        </w:tabs>
+        <w:ind w:left="720" w:hanging="360"/>
+      </w:pPr>
+    </w:lvl>
+  </w:abstractNum>
+  <w:abstractNum w:abstractNumId="2" w15:restartNumberingAfterBreak="0">
+    <w:nsid w:val="FFFFFF82"/>
+    <w:multiLevelType w:val="singleLevel"/>
+    <w:tmpl w:val="16B8F66A"/>
+    <w:lvl w:ilvl="0">
+      <w:start w:val="1"/>
+      <w:numFmt w:val="bullet"/>
+      <w:pStyle w:val="ListBullet3"/>
+      <w:lvlText w:val=""/>
+      <w:lvlJc w:val="left"/>
+      <w:pPr>
+        <w:tabs>
+          <w:tab w:val="num" w:pos="1080"/>
+        </w:tabs>
+        <w:ind w:left="1080" w:hanging="360"/>
+      </w:pPr>
+      <w:rPr>
+        <w:rFonts w:ascii="Symbol" w:hAnsi="Symbol" w:hint="default"/>
+      </w:rPr>
+    </w:lvl>
+  </w:abstractNum>
+  <w:abstractNum w:abstractNumId="3" w15:restartNumberingAfterBreak="0">
+    <w:nsid w:val="FFFFFF83"/>
+    <w:multiLevelType w:val="singleLevel"/>
+    <w:tmpl w:val="633EC6B4"/>
+    <w:lvl w:ilvl="0">
+      <w:start w:val="1"/>
+      <w:numFmt w:val="bullet"/>
+      <w:pStyle w:val="ListBullet2"/>
+      <w:lvlText w:val=""/>
+      <w:lvlJc w:val="left"/>
+      <w:pPr>
+        <w:tabs>
+          <w:tab w:val="num" w:pos="720"/>
+        </w:tabs>
+        <w:ind w:left="720" w:hanging="360"/>
+      </w:pPr>
+      <w:rPr>
+        <w:rFonts w:ascii="Symbol" w:hAnsi="Symbol" w:hint="default"/>
+      </w:rPr>
+    </w:lvl>
+  </w:abstractNum>
+  <w:abstractNum w:abstractNumId="4" w15:restartNumberingAfterBreak="0">
+    <w:nsid w:val="FFFFFF88"/>
+    <w:multiLevelType w:val="singleLevel"/>
+    <w:tmpl w:val="94481A82"/>
+    <w:lvl w:ilvl="0">
+      <w:start w:val="1"/>
+      <w:numFmt w:val="decimal"/>
+      <w:pStyle w:val="ListNumber"/>
+      <w:lvlText w:val="%1."/>
+      <w:lvlJc w:val="left"/>
+      <w:pPr>
+        <w:tabs>
+          <w:tab w:val="num" w:pos="360"/>
+        </w:tabs>
+        <w:ind w:left="360" w:hanging="360"/>
+      </w:pPr>
+    </w:lvl>
+  </w:abstractNum>
+  <w:abstractNum w:abstractNumId="5" w15:restartNumberingAfterBreak="0">
+    <w:nsid w:val="FFFFFF89"/>
+    <w:multiLevelType w:val="singleLevel"/>
+    <w:tmpl w:val="ABC2BA66"/>
+    <w:lvl w:ilvl="0">
+      <w:start w:val="1"/>
+      <w:numFmt w:val="bullet"/>
+      <w:pStyle w:val="ListBullet"/>
+      <w:lvlText w:val=""/>
+      <w:lvlJc w:val="left"/>
+      <w:pPr>
+        <w:tabs>
+          <w:tab w:val="num" w:pos="360"/>
+        </w:tabs>
+        <w:ind w:left="360" w:hanging="360"/>
+      </w:pPr>
+      <w:rPr>
+        <w:rFonts w:ascii="Symbol" w:hAnsi="Symbol" w:hint="default"/>
+      </w:rPr>
+    </w:lvl>
+  </w:abstractNum>
+  <w:num w:numId="1" w16cid:durableId="947540805">
+    <w:abstractNumId w:val="5"/>
+  </w:num>
+  <w:num w:numId="2" w16cid:durableId="1986002944">
+    <w:abstractNumId w:val="3"/>
+  </w:num>
+  <w:num w:numId="3" w16cid:durableId="318308418">
+    <w:abstractNumId w:val="2"/>
+  </w:num>
+  <w:num w:numId="4" w16cid:durableId="598220836">
+    <w:abstractNumId w:val="4"/>
+  </w:num>
+  <w:num w:numId="5" w16cid:durableId="240868081">
+    <w:abstractNumId w:val="1"/>
+  </w:num>
+  <w:num w:numId="6" w16cid:durableId="694888737">
+    <w:abstractNumId w:val="0"/>
+  </w:num>
+</w:numbering>
 </file>
 
 <file path=word/styles.xml><?xml version="1.0" encoding="utf-8"?>
@@ -779,7 +2369,7 @@
     <w:link w:val="Heading1Char"/>
     <w:uiPriority w:val="9"/>
     <w:qFormat/>
-    <w:rsid w:val="00892F25"/>
+    <w:rsid w:val="00BD1F16"/>
     <w:pPr>
       <w:keepNext/>
       <w:keepLines/>
@@ -801,7 +2391,7 @@
     <w:uiPriority w:val="9"/>
     <w:unhideWhenUsed/>
     <w:qFormat/>
-    <w:rsid w:val="00892F25"/>
+    <w:rsid w:val="00BD1F16"/>
     <w:pPr>
       <w:keepNext/>
       <w:keepLines/>
@@ -823,7 +2413,7 @@
     <w:uiPriority w:val="9"/>
     <w:unhideWhenUsed/>
     <w:qFormat/>
-    <w:rsid w:val="00892F25"/>
+    <w:rsid w:val="00BD1F16"/>
     <w:pPr>
       <w:keepNext/>
       <w:keepLines/>
@@ -845,7 +2435,7 @@
     <w:uiPriority w:val="9"/>
     <w:unhideWhenUsed/>
     <w:qFormat/>
-    <w:rsid w:val="00892F25"/>
+    <w:rsid w:val="00BD1F16"/>
     <w:pPr>
       <w:keepNext/>
       <w:keepLines/>
@@ -867,7 +2457,7 @@
     <w:uiPriority w:val="9"/>
     <w:unhideWhenUsed/>
     <w:qFormat/>
-    <w:rsid w:val="00892F25"/>
+    <w:rsid w:val="00BD1F16"/>
     <w:pPr>
       <w:keepNext/>
       <w:keepLines/>
@@ -887,7 +2477,7 @@
     <w:uiPriority w:val="9"/>
     <w:unhideWhenUsed/>
     <w:qFormat/>
-    <w:rsid w:val="00892F25"/>
+    <w:rsid w:val="00BD1F16"/>
     <w:pPr>
       <w:keepNext/>
       <w:keepLines/>
@@ -909,7 +2499,7 @@
     <w:uiPriority w:val="9"/>
     <w:unhideWhenUsed/>
     <w:qFormat/>
-    <w:rsid w:val="00892F25"/>
+    <w:rsid w:val="00BD1F16"/>
     <w:pPr>
       <w:keepNext/>
       <w:keepLines/>
@@ -929,7 +2519,7 @@
     <w:uiPriority w:val="9"/>
     <w:unhideWhenUsed/>
     <w:qFormat/>
-    <w:rsid w:val="00892F25"/>
+    <w:rsid w:val="00BD1F16"/>
     <w:pPr>
       <w:keepNext/>
       <w:keepLines/>
@@ -951,7 +2541,7 @@
     <w:uiPriority w:val="9"/>
     <w:unhideWhenUsed/>
     <w:qFormat/>
-    <w:rsid w:val="00892F25"/>
+    <w:rsid w:val="00BD1F16"/>
     <w:pPr>
       <w:keepNext/>
       <w:keepLines/>
@@ -994,7 +2584,7 @@
     <w:basedOn w:val="DefaultParagraphFont"/>
     <w:link w:val="Heading1"/>
     <w:uiPriority w:val="9"/>
-    <w:rsid w:val="00892F25"/>
+    <w:rsid w:val="00BD1F16"/>
     <w:rPr>
       <w:rFonts w:asciiTheme="majorHAnsi" w:eastAsiaTheme="majorEastAsia" w:hAnsiTheme="majorHAnsi" w:cstheme="majorBidi"/>
       <w:color w:val="0F4761" w:themeColor="accent1" w:themeShade="BF"/>
@@ -1007,7 +2597,7 @@
     <w:basedOn w:val="DefaultParagraphFont"/>
     <w:link w:val="Heading2"/>
     <w:uiPriority w:val="9"/>
-    <w:rsid w:val="00892F25"/>
+    <w:rsid w:val="00BD1F16"/>
     <w:rPr>
       <w:rFonts w:asciiTheme="majorHAnsi" w:eastAsiaTheme="majorEastAsia" w:hAnsiTheme="majorHAnsi" w:cstheme="majorBidi"/>
       <w:color w:val="0F4761" w:themeColor="accent1" w:themeShade="BF"/>
@@ -1020,7 +2610,7 @@
     <w:basedOn w:val="DefaultParagraphFont"/>
     <w:link w:val="Heading3"/>
     <w:uiPriority w:val="9"/>
-    <w:rsid w:val="00892F25"/>
+    <w:rsid w:val="00BD1F16"/>
     <w:rPr>
       <w:rFonts w:eastAsiaTheme="majorEastAsia" w:cstheme="majorBidi"/>
       <w:color w:val="0F4761" w:themeColor="accent1" w:themeShade="BF"/>
@@ -1033,7 +2623,7 @@
     <w:basedOn w:val="DefaultParagraphFont"/>
     <w:link w:val="Heading4"/>
     <w:uiPriority w:val="9"/>
-    <w:rsid w:val="00892F25"/>
+    <w:rsid w:val="00BD1F16"/>
     <w:rPr>
       <w:rFonts w:eastAsiaTheme="majorEastAsia" w:cstheme="majorBidi"/>
       <w:i/>
@@ -1046,7 +2636,7 @@
     <w:basedOn w:val="DefaultParagraphFont"/>
     <w:link w:val="Heading5"/>
     <w:uiPriority w:val="9"/>
-    <w:rsid w:val="00892F25"/>
+    <w:rsid w:val="00BD1F16"/>
     <w:rPr>
       <w:rFonts w:eastAsiaTheme="majorEastAsia" w:cstheme="majorBidi"/>
       <w:color w:val="0F4761" w:themeColor="accent1" w:themeShade="BF"/>
@@ -1057,7 +2647,7 @@
     <w:basedOn w:val="DefaultParagraphFont"/>
     <w:link w:val="Heading6"/>
     <w:uiPriority w:val="9"/>
-    <w:rsid w:val="00892F25"/>
+    <w:rsid w:val="00BD1F16"/>
     <w:rPr>
       <w:rFonts w:eastAsiaTheme="majorEastAsia" w:cstheme="majorBidi"/>
       <w:i/>
@@ -1070,7 +2660,7 @@
     <w:basedOn w:val="DefaultParagraphFont"/>
     <w:link w:val="Heading7"/>
     <w:uiPriority w:val="9"/>
-    <w:rsid w:val="00892F25"/>
+    <w:rsid w:val="00BD1F16"/>
     <w:rPr>
       <w:rFonts w:eastAsiaTheme="majorEastAsia" w:cstheme="majorBidi"/>
       <w:color w:val="595959" w:themeColor="text1" w:themeTint="A6"/>
@@ -1081,7 +2671,7 @@
     <w:basedOn w:val="DefaultParagraphFont"/>
     <w:link w:val="Heading8"/>
     <w:uiPriority w:val="9"/>
-    <w:rsid w:val="00892F25"/>
+    <w:rsid w:val="00BD1F16"/>
     <w:rPr>
       <w:rFonts w:eastAsiaTheme="majorEastAsia" w:cstheme="majorBidi"/>
       <w:i/>
@@ -1094,7 +2684,7 @@
     <w:basedOn w:val="DefaultParagraphFont"/>
     <w:link w:val="Heading9"/>
     <w:uiPriority w:val="9"/>
-    <w:rsid w:val="00892F25"/>
+    <w:rsid w:val="00BD1F16"/>
     <w:rPr>
       <w:rFonts w:eastAsiaTheme="majorEastAsia" w:cstheme="majorBidi"/>
       <w:color w:val="272727" w:themeColor="text1" w:themeTint="D8"/>
@@ -1107,7 +2697,7 @@
     <w:link w:val="TitleChar"/>
     <w:uiPriority w:val="10"/>
     <w:qFormat/>
-    <w:rsid w:val="00892F25"/>
+    <w:rsid w:val="00BD1F16"/>
     <w:pPr>
       <w:spacing w:after="80" w:line="240" w:lineRule="auto"/>
       <w:contextualSpacing/>
@@ -1125,7 +2715,7 @@
     <w:basedOn w:val="DefaultParagraphFont"/>
     <w:link w:val="Title"/>
     <w:uiPriority w:val="10"/>
-    <w:rsid w:val="00892F25"/>
+    <w:rsid w:val="00BD1F16"/>
     <w:rPr>
       <w:rFonts w:asciiTheme="majorHAnsi" w:eastAsiaTheme="majorEastAsia" w:hAnsiTheme="majorHAnsi" w:cstheme="majorBidi"/>
       <w:spacing w:val="-10"/>
@@ -1141,7 +2731,7 @@
     <w:link w:val="SubtitleChar"/>
     <w:uiPriority w:val="11"/>
     <w:qFormat/>
-    <w:rsid w:val="00892F25"/>
+    <w:rsid w:val="00BD1F16"/>
     <w:pPr>
       <w:numPr>
         <w:ilvl w:val="1"/>
@@ -1160,7 +2750,7 @@
     <w:basedOn w:val="DefaultParagraphFont"/>
     <w:link w:val="Subtitle"/>
     <w:uiPriority w:val="11"/>
-    <w:rsid w:val="00892F25"/>
+    <w:rsid w:val="00BD1F16"/>
     <w:rPr>
       <w:rFonts w:eastAsiaTheme="majorEastAsia" w:cstheme="majorBidi"/>
       <w:color w:val="595959" w:themeColor="text1" w:themeTint="A6"/>
@@ -1176,7 +2766,7 @@
     <w:link w:val="QuoteChar"/>
     <w:uiPriority w:val="29"/>
     <w:qFormat/>
-    <w:rsid w:val="00892F25"/>
+    <w:rsid w:val="00BD1F16"/>
     <w:pPr>
       <w:spacing w:before="160"/>
       <w:jc w:val="center"/>
@@ -1192,7 +2782,7 @@
     <w:basedOn w:val="DefaultParagraphFont"/>
     <w:link w:val="Quote"/>
     <w:uiPriority w:val="29"/>
-    <w:rsid w:val="00892F25"/>
+    <w:rsid w:val="00BD1F16"/>
     <w:rPr>
       <w:i/>
       <w:iCs/>
@@ -1204,7 +2794,7 @@
     <w:basedOn w:val="Normal"/>
     <w:uiPriority w:val="34"/>
     <w:qFormat/>
-    <w:rsid w:val="00892F25"/>
+    <w:rsid w:val="00BD1F16"/>
     <w:pPr>
       <w:ind w:left="720"/>
       <w:contextualSpacing/>
@@ -1215,7 +2805,7 @@
     <w:basedOn w:val="DefaultParagraphFont"/>
     <w:uiPriority w:val="21"/>
     <w:qFormat/>
-    <w:rsid w:val="00892F25"/>
+    <w:rsid w:val="00BD1F16"/>
     <w:rPr>
       <w:i/>
       <w:iCs/>
@@ -1229,7 +2819,7 @@
     <w:link w:val="IntenseQuoteChar"/>
     <w:uiPriority w:val="30"/>
     <w:qFormat/>
-    <w:rsid w:val="00892F25"/>
+    <w:rsid w:val="00BD1F16"/>
     <w:pPr>
       <w:pBdr>
         <w:top w:val="single" w:sz="4" w:space="10" w:color="0F4761" w:themeColor="accent1" w:themeShade="BF"/>
@@ -1250,7 +2840,7 @@
     <w:basedOn w:val="DefaultParagraphFont"/>
     <w:link w:val="IntenseQuote"/>
     <w:uiPriority w:val="30"/>
-    <w:rsid w:val="00892F25"/>
+    <w:rsid w:val="00BD1F16"/>
     <w:rPr>
       <w:i/>
       <w:iCs/>
@@ -1262,7 +2852,7 @@
     <w:basedOn w:val="DefaultParagraphFont"/>
     <w:uiPriority w:val="32"/>
     <w:qFormat/>
-    <w:rsid w:val="00892F25"/>
+    <w:rsid w:val="00BD1F16"/>
     <w:rPr>
       <w:b/>
       <w:bCs/>
@@ -1275,7 +2865,7 @@
     <w:name w:val="No Spacing"/>
     <w:uiPriority w:val="1"/>
     <w:qFormat/>
-    <w:rsid w:val="00892F25"/>
+    <w:rsid w:val="00BD1F16"/>
     <w:pPr>
       <w:spacing w:after="0" w:line="240" w:lineRule="auto"/>
     </w:pPr>
@@ -1287,7 +2877,7 @@
     <w:uiPriority w:val="35"/>
     <w:unhideWhenUsed/>
     <w:qFormat/>
-    <w:rsid w:val="00892F25"/>
+    <w:rsid w:val="00BD1F16"/>
     <w:pPr>
       <w:spacing w:after="200" w:line="240" w:lineRule="auto"/>
     </w:pPr>
@@ -1306,7 +2896,7 @@
     <w:uiPriority w:val="39"/>
     <w:unhideWhenUsed/>
     <w:qFormat/>
-    <w:rsid w:val="00892F25"/>
+    <w:rsid w:val="00BD1F16"/>
     <w:pPr>
       <w:spacing w:before="240" w:after="0"/>
       <w:outlineLvl w:val="9"/>
@@ -1323,7 +2913,7 @@
     <w:autoRedefine/>
     <w:uiPriority w:val="39"/>
     <w:unhideWhenUsed/>
-    <w:rsid w:val="00892F25"/>
+    <w:rsid w:val="00BD1F16"/>
     <w:pPr>
       <w:spacing w:after="100"/>
     </w:pPr>
@@ -1335,7 +2925,7 @@
     <w:autoRedefine/>
     <w:uiPriority w:val="39"/>
     <w:unhideWhenUsed/>
-    <w:rsid w:val="00892F25"/>
+    <w:rsid w:val="00BD1F16"/>
     <w:pPr>
       <w:spacing w:after="100"/>
       <w:ind w:left="240"/>
@@ -1348,10 +2938,88 @@
     <w:autoRedefine/>
     <w:uiPriority w:val="39"/>
     <w:unhideWhenUsed/>
-    <w:rsid w:val="00892F25"/>
+    <w:rsid w:val="00BD1F16"/>
     <w:pPr>
       <w:spacing w:after="100"/>
       <w:ind w:left="480"/>
+    </w:pPr>
+  </w:style>
+  <w:style w:type="paragraph" w:styleId="TOC4">
+    <w:name w:val="toc 4"/>
+    <w:basedOn w:val="Normal"/>
+    <w:next w:val="Normal"/>
+    <w:autoRedefine/>
+    <w:uiPriority w:val="39"/>
+    <w:unhideWhenUsed/>
+    <w:rsid w:val="00BD1F16"/>
+    <w:pPr>
+      <w:spacing w:after="100"/>
+      <w:ind w:left="720"/>
+    </w:pPr>
+  </w:style>
+  <w:style w:type="paragraph" w:styleId="TOC5">
+    <w:name w:val="toc 5"/>
+    <w:basedOn w:val="Normal"/>
+    <w:next w:val="Normal"/>
+    <w:autoRedefine/>
+    <w:uiPriority w:val="39"/>
+    <w:unhideWhenUsed/>
+    <w:rsid w:val="00BD1F16"/>
+    <w:pPr>
+      <w:spacing w:after="100"/>
+      <w:ind w:left="960"/>
+    </w:pPr>
+  </w:style>
+  <w:style w:type="paragraph" w:styleId="TOC6">
+    <w:name w:val="toc 6"/>
+    <w:basedOn w:val="Normal"/>
+    <w:next w:val="Normal"/>
+    <w:autoRedefine/>
+    <w:uiPriority w:val="39"/>
+    <w:unhideWhenUsed/>
+    <w:rsid w:val="00BD1F16"/>
+    <w:pPr>
+      <w:spacing w:after="100"/>
+      <w:ind w:left="1200"/>
+    </w:pPr>
+  </w:style>
+  <w:style w:type="paragraph" w:styleId="TOC7">
+    <w:name w:val="toc 7"/>
+    <w:basedOn w:val="Normal"/>
+    <w:next w:val="Normal"/>
+    <w:autoRedefine/>
+    <w:uiPriority w:val="39"/>
+    <w:unhideWhenUsed/>
+    <w:rsid w:val="00BD1F16"/>
+    <w:pPr>
+      <w:spacing w:after="100"/>
+      <w:ind w:left="1440"/>
+    </w:pPr>
+  </w:style>
+  <w:style w:type="paragraph" w:styleId="TOC8">
+    <w:name w:val="toc 8"/>
+    <w:basedOn w:val="Normal"/>
+    <w:next w:val="Normal"/>
+    <w:autoRedefine/>
+    <w:uiPriority w:val="39"/>
+    <w:unhideWhenUsed/>
+    <w:rsid w:val="00BD1F16"/>
+    <w:pPr>
+      <w:spacing w:after="100"/>
+      <w:ind w:left="1680"/>
+    </w:pPr>
+  </w:style>
+  <w:style w:type="paragraph" w:styleId="TOC9">
+    <w:name w:val="toc 9"/>
+    <w:basedOn w:val="Normal"/>
+    <w:next w:val="Normal"/>
+    <w:autoRedefine/>
+    <w:uiPriority w:val="39"/>
+    <w:unhideWhenUsed/>
+    <w:rsid w:val="00BD1F16"/>
+    <w:pPr>
+      <w:spacing w:after="100"/>
+      <w:ind w:left="1920"/>
     </w:pPr>
   </w:style>
   <w:style w:type="paragraph" w:styleId="FootnoteText">
@@ -1360,7 +3028,7 @@
     <w:link w:val="FootnoteTextChar"/>
     <w:uiPriority w:val="99"/>
     <w:unhideWhenUsed/>
-    <w:rsid w:val="00892F25"/>
+    <w:rsid w:val="00BD1F16"/>
     <w:pPr>
       <w:spacing w:after="0" w:line="240" w:lineRule="auto"/>
     </w:pPr>
@@ -1374,7 +3042,7 @@
     <w:basedOn w:val="DefaultParagraphFont"/>
     <w:link w:val="FootnoteText"/>
     <w:uiPriority w:val="99"/>
-    <w:rsid w:val="00892F25"/>
+    <w:rsid w:val="00BD1F16"/>
     <w:rPr>
       <w:sz w:val="20"/>
       <w:szCs w:val="20"/>
@@ -1386,7 +3054,7 @@
     <w:link w:val="EndnoteTextChar"/>
     <w:uiPriority w:val="99"/>
     <w:unhideWhenUsed/>
-    <w:rsid w:val="00892F25"/>
+    <w:rsid w:val="00BD1F16"/>
     <w:pPr>
       <w:spacing w:after="0" w:line="240" w:lineRule="auto"/>
     </w:pPr>
@@ -1400,7 +3068,7 @@
     <w:basedOn w:val="DefaultParagraphFont"/>
     <w:link w:val="EndnoteText"/>
     <w:uiPriority w:val="99"/>
-    <w:rsid w:val="00892F25"/>
+    <w:rsid w:val="00BD1F16"/>
     <w:rPr>
       <w:sz w:val="20"/>
       <w:szCs w:val="20"/>
@@ -1412,7 +3080,7 @@
     <w:link w:val="HeaderChar"/>
     <w:uiPriority w:val="99"/>
     <w:unhideWhenUsed/>
-    <w:rsid w:val="00892F25"/>
+    <w:rsid w:val="00BD1F16"/>
     <w:pPr>
       <w:tabs>
         <w:tab w:val="center" w:pos="4680"/>
@@ -1426,7 +3094,7 @@
     <w:basedOn w:val="DefaultParagraphFont"/>
     <w:link w:val="Header"/>
     <w:uiPriority w:val="99"/>
-    <w:rsid w:val="00892F25"/>
+    <w:rsid w:val="00BD1F16"/>
   </w:style>
   <w:style w:type="paragraph" w:styleId="Footer">
     <w:name w:val="footer"/>
@@ -1434,7 +3102,7 @@
     <w:link w:val="FooterChar"/>
     <w:uiPriority w:val="99"/>
     <w:unhideWhenUsed/>
-    <w:rsid w:val="00892F25"/>
+    <w:rsid w:val="00BD1F16"/>
     <w:pPr>
       <w:tabs>
         <w:tab w:val="center" w:pos="4680"/>
@@ -1448,14 +3116,328 @@
     <w:basedOn w:val="DefaultParagraphFont"/>
     <w:link w:val="Footer"/>
     <w:uiPriority w:val="99"/>
-    <w:rsid w:val="00892F25"/>
+    <w:rsid w:val="00BD1F16"/>
+  </w:style>
+  <w:style w:type="paragraph" w:styleId="ListBullet">
+    <w:name w:val="List Bullet"/>
+    <w:basedOn w:val="Normal"/>
+    <w:uiPriority w:val="99"/>
+    <w:unhideWhenUsed/>
+    <w:rsid w:val="00BD1F16"/>
+    <w:pPr>
+      <w:numPr>
+        <w:numId w:val="1"/>
+      </w:numPr>
+      <w:contextualSpacing/>
+    </w:pPr>
+  </w:style>
+  <w:style w:type="paragraph" w:styleId="ListBullet2">
+    <w:name w:val="List Bullet 2"/>
+    <w:basedOn w:val="Normal"/>
+    <w:uiPriority w:val="99"/>
+    <w:unhideWhenUsed/>
+    <w:rsid w:val="00BD1F16"/>
+    <w:pPr>
+      <w:numPr>
+        <w:numId w:val="2"/>
+      </w:numPr>
+      <w:contextualSpacing/>
+    </w:pPr>
+  </w:style>
+  <w:style w:type="paragraph" w:styleId="ListBullet3">
+    <w:name w:val="List Bullet 3"/>
+    <w:basedOn w:val="Normal"/>
+    <w:uiPriority w:val="99"/>
+    <w:unhideWhenUsed/>
+    <w:rsid w:val="00BD1F16"/>
+    <w:pPr>
+      <w:numPr>
+        <w:numId w:val="3"/>
+      </w:numPr>
+      <w:contextualSpacing/>
+    </w:pPr>
+  </w:style>
+  <w:style w:type="paragraph" w:styleId="ListNumber">
+    <w:name w:val="List Number"/>
+    <w:basedOn w:val="Normal"/>
+    <w:uiPriority w:val="99"/>
+    <w:unhideWhenUsed/>
+    <w:rsid w:val="00BD1F16"/>
+    <w:pPr>
+      <w:numPr>
+        <w:numId w:val="4"/>
+      </w:numPr>
+      <w:contextualSpacing/>
+    </w:pPr>
+  </w:style>
+  <w:style w:type="paragraph" w:styleId="ListNumber2">
+    <w:name w:val="List Number 2"/>
+    <w:basedOn w:val="Normal"/>
+    <w:uiPriority w:val="99"/>
+    <w:unhideWhenUsed/>
+    <w:rsid w:val="00BD1F16"/>
+    <w:pPr>
+      <w:numPr>
+        <w:numId w:val="5"/>
+      </w:numPr>
+      <w:contextualSpacing/>
+    </w:pPr>
+  </w:style>
+  <w:style w:type="paragraph" w:styleId="ListNumber3">
+    <w:name w:val="List Number 3"/>
+    <w:basedOn w:val="Normal"/>
+    <w:uiPriority w:val="99"/>
+    <w:unhideWhenUsed/>
+    <w:rsid w:val="00BD1F16"/>
+    <w:pPr>
+      <w:numPr>
+        <w:numId w:val="6"/>
+      </w:numPr>
+      <w:contextualSpacing/>
+    </w:pPr>
+  </w:style>
+  <w:style w:type="paragraph" w:styleId="List">
+    <w:name w:val="List"/>
+    <w:basedOn w:val="Normal"/>
+    <w:uiPriority w:val="99"/>
+    <w:unhideWhenUsed/>
+    <w:rsid w:val="00BD1F16"/>
+    <w:pPr>
+      <w:ind w:left="360" w:hanging="360"/>
+      <w:contextualSpacing/>
+    </w:pPr>
+  </w:style>
+  <w:style w:type="paragraph" w:styleId="ListContinue">
+    <w:name w:val="List Continue"/>
+    <w:basedOn w:val="Normal"/>
+    <w:uiPriority w:val="99"/>
+    <w:unhideWhenUsed/>
+    <w:rsid w:val="00BD1F16"/>
+    <w:pPr>
+      <w:spacing w:after="120"/>
+      <w:ind w:left="360"/>
+      <w:contextualSpacing/>
+    </w:pPr>
+  </w:style>
+  <w:style w:type="paragraph" w:styleId="TableofFigures">
+    <w:name w:val="table of figures"/>
+    <w:basedOn w:val="Normal"/>
+    <w:next w:val="Normal"/>
+    <w:uiPriority w:val="99"/>
+    <w:unhideWhenUsed/>
+    <w:rsid w:val="00BD1F16"/>
+    <w:pPr>
+      <w:spacing w:after="0"/>
+    </w:pPr>
+  </w:style>
+  <w:style w:type="paragraph" w:styleId="HTMLPreformatted">
+    <w:name w:val="HTML Preformatted"/>
+    <w:basedOn w:val="Normal"/>
+    <w:link w:val="HTMLPreformattedChar"/>
+    <w:uiPriority w:val="99"/>
+    <w:unhideWhenUsed/>
+    <w:rsid w:val="00BD1F16"/>
+    <w:pPr>
+      <w:spacing w:after="0" w:line="240" w:lineRule="auto"/>
+    </w:pPr>
+    <w:rPr>
+      <w:rFonts w:ascii="Consolas" w:hAnsi="Consolas"/>
+      <w:sz w:val="20"/>
+      <w:szCs w:val="20"/>
+    </w:rPr>
+  </w:style>
+  <w:style w:type="character" w:customStyle="1" w:styleId="HTMLPreformattedChar">
+    <w:name w:val="HTML Preformatted Char"/>
+    <w:basedOn w:val="DefaultParagraphFont"/>
+    <w:link w:val="HTMLPreformatted"/>
+    <w:uiPriority w:val="99"/>
+    <w:rsid w:val="00BD1F16"/>
+    <w:rPr>
+      <w:rFonts w:ascii="Consolas" w:hAnsi="Consolas"/>
+      <w:sz w:val="20"/>
+      <w:szCs w:val="20"/>
+    </w:rPr>
+  </w:style>
+  <w:style w:type="paragraph" w:styleId="BlockText">
+    <w:name w:val="Block Text"/>
+    <w:basedOn w:val="Normal"/>
+    <w:uiPriority w:val="99"/>
+    <w:unhideWhenUsed/>
+    <w:rsid w:val="00BD1F16"/>
+    <w:pPr>
+      <w:pBdr>
+        <w:top w:val="single" w:sz="2" w:space="10" w:color="156082" w:themeColor="accent1"/>
+        <w:left w:val="single" w:sz="2" w:space="10" w:color="156082" w:themeColor="accent1"/>
+        <w:bottom w:val="single" w:sz="2" w:space="10" w:color="156082" w:themeColor="accent1"/>
+        <w:right w:val="single" w:sz="2" w:space="10" w:color="156082" w:themeColor="accent1"/>
+      </w:pBdr>
+      <w:ind w:left="1152" w:right="1152"/>
+    </w:pPr>
+    <w:rPr>
+      <w:rFonts w:eastAsiaTheme="minorEastAsia"/>
+      <w:i/>
+      <w:iCs/>
+      <w:color w:val="156082" w:themeColor="accent1"/>
+    </w:rPr>
+  </w:style>
+  <w:style w:type="paragraph" w:styleId="BodyText">
+    <w:name w:val="Body Text"/>
+    <w:basedOn w:val="Normal"/>
+    <w:link w:val="BodyTextChar"/>
+    <w:uiPriority w:val="99"/>
+    <w:unhideWhenUsed/>
+    <w:rsid w:val="00BD1F16"/>
+    <w:pPr>
+      <w:spacing w:after="120"/>
+    </w:pPr>
+  </w:style>
+  <w:style w:type="character" w:customStyle="1" w:styleId="BodyTextChar">
+    <w:name w:val="Body Text Char"/>
+    <w:basedOn w:val="DefaultParagraphFont"/>
+    <w:link w:val="BodyText"/>
+    <w:uiPriority w:val="99"/>
+    <w:rsid w:val="00BD1F16"/>
+  </w:style>
+  <w:style w:type="paragraph" w:styleId="PlainText">
+    <w:name w:val="Plain Text"/>
+    <w:basedOn w:val="Normal"/>
+    <w:link w:val="PlainTextChar"/>
+    <w:uiPriority w:val="99"/>
+    <w:unhideWhenUsed/>
+    <w:rsid w:val="00BD1F16"/>
+    <w:pPr>
+      <w:spacing w:after="0" w:line="240" w:lineRule="auto"/>
+    </w:pPr>
+    <w:rPr>
+      <w:rFonts w:ascii="Consolas" w:hAnsi="Consolas"/>
+      <w:sz w:val="21"/>
+      <w:szCs w:val="21"/>
+    </w:rPr>
+  </w:style>
+  <w:style w:type="character" w:customStyle="1" w:styleId="PlainTextChar">
+    <w:name w:val="Plain Text Char"/>
+    <w:basedOn w:val="DefaultParagraphFont"/>
+    <w:link w:val="PlainText"/>
+    <w:uiPriority w:val="99"/>
+    <w:rsid w:val="00BD1F16"/>
+    <w:rPr>
+      <w:rFonts w:ascii="Consolas" w:hAnsi="Consolas"/>
+      <w:sz w:val="21"/>
+      <w:szCs w:val="21"/>
+    </w:rPr>
+  </w:style>
+  <w:style w:type="paragraph" w:styleId="Bibliography">
+    <w:name w:val="Bibliography"/>
+    <w:basedOn w:val="Normal"/>
+    <w:next w:val="Normal"/>
+    <w:uiPriority w:val="37"/>
+    <w:unhideWhenUsed/>
+    <w:rsid w:val="00BD1F16"/>
+  </w:style>
+  <w:style w:type="paragraph" w:styleId="Index1">
+    <w:name w:val="index 1"/>
+    <w:basedOn w:val="Normal"/>
+    <w:next w:val="Normal"/>
+    <w:autoRedefine/>
+    <w:uiPriority w:val="99"/>
+    <w:unhideWhenUsed/>
+    <w:rsid w:val="00BD1F16"/>
+    <w:pPr>
+      <w:spacing w:after="0" w:line="240" w:lineRule="auto"/>
+      <w:ind w:left="240" w:hanging="240"/>
+    </w:pPr>
+  </w:style>
+  <w:style w:type="paragraph" w:styleId="EnvelopeAddress">
+    <w:name w:val="envelope address"/>
+    <w:basedOn w:val="Normal"/>
+    <w:uiPriority w:val="99"/>
+    <w:unhideWhenUsed/>
+    <w:rsid w:val="00BD1F16"/>
+    <w:pPr>
+      <w:framePr w:w="7920" w:h="1980" w:hRule="exact" w:hSpace="180" w:wrap="auto" w:hAnchor="page" w:xAlign="center" w:yAlign="bottom"/>
+      <w:spacing w:after="0" w:line="240" w:lineRule="auto"/>
+      <w:ind w:left="2880"/>
+    </w:pPr>
+    <w:rPr>
+      <w:rFonts w:asciiTheme="majorHAnsi" w:eastAsiaTheme="majorEastAsia" w:hAnsiTheme="majorHAnsi" w:cstheme="majorBidi"/>
+    </w:rPr>
+  </w:style>
+  <w:style w:type="paragraph" w:styleId="Signature">
+    <w:name w:val="Signature"/>
+    <w:basedOn w:val="Normal"/>
+    <w:link w:val="SignatureChar"/>
+    <w:uiPriority w:val="99"/>
+    <w:unhideWhenUsed/>
+    <w:rsid w:val="00BD1F16"/>
+    <w:pPr>
+      <w:spacing w:after="0" w:line="240" w:lineRule="auto"/>
+      <w:ind w:left="4320"/>
+    </w:pPr>
+  </w:style>
+  <w:style w:type="character" w:customStyle="1" w:styleId="SignatureChar">
+    <w:name w:val="Signature Char"/>
+    <w:basedOn w:val="DefaultParagraphFont"/>
+    <w:link w:val="Signature"/>
+    <w:uiPriority w:val="99"/>
+    <w:rsid w:val="00BD1F16"/>
+  </w:style>
+  <w:style w:type="paragraph" w:styleId="Salutation">
+    <w:name w:val="Salutation"/>
+    <w:basedOn w:val="Normal"/>
+    <w:next w:val="Normal"/>
+    <w:link w:val="SalutationChar"/>
+    <w:uiPriority w:val="99"/>
+    <w:unhideWhenUsed/>
+    <w:rsid w:val="00BD1F16"/>
+  </w:style>
+  <w:style w:type="character" w:customStyle="1" w:styleId="SalutationChar">
+    <w:name w:val="Salutation Char"/>
+    <w:basedOn w:val="DefaultParagraphFont"/>
+    <w:link w:val="Salutation"/>
+    <w:uiPriority w:val="99"/>
+    <w:rsid w:val="00BD1F16"/>
+  </w:style>
+  <w:style w:type="paragraph" w:styleId="Closing">
+    <w:name w:val="Closing"/>
+    <w:basedOn w:val="Normal"/>
+    <w:link w:val="ClosingChar"/>
+    <w:uiPriority w:val="99"/>
+    <w:unhideWhenUsed/>
+    <w:rsid w:val="00BD1F16"/>
+    <w:pPr>
+      <w:spacing w:after="0" w:line="240" w:lineRule="auto"/>
+      <w:ind w:left="4320"/>
+    </w:pPr>
+  </w:style>
+  <w:style w:type="character" w:customStyle="1" w:styleId="ClosingChar">
+    <w:name w:val="Closing Char"/>
+    <w:basedOn w:val="DefaultParagraphFont"/>
+    <w:link w:val="Closing"/>
+    <w:uiPriority w:val="99"/>
+    <w:rsid w:val="00BD1F16"/>
+  </w:style>
+  <w:style w:type="paragraph" w:styleId="Date">
+    <w:name w:val="Date"/>
+    <w:basedOn w:val="Normal"/>
+    <w:next w:val="Normal"/>
+    <w:link w:val="DateChar"/>
+    <w:uiPriority w:val="99"/>
+    <w:unhideWhenUsed/>
+    <w:rsid w:val="00BD1F16"/>
+  </w:style>
+  <w:style w:type="character" w:customStyle="1" w:styleId="DateChar">
+    <w:name w:val="Date Char"/>
+    <w:basedOn w:val="DefaultParagraphFont"/>
+    <w:link w:val="Date"/>
+    <w:uiPriority w:val="99"/>
+    <w:rsid w:val="00BD1F16"/>
   </w:style>
   <w:style w:type="character" w:styleId="Strong">
     <w:name w:val="Strong"/>
     <w:basedOn w:val="DefaultParagraphFont"/>
     <w:uiPriority w:val="22"/>
     <w:qFormat/>
-    <w:rsid w:val="00892F25"/>
+    <w:rsid w:val="00BD1F16"/>
     <w:rPr>
       <w:b/>
       <w:bCs/>
@@ -1466,7 +3448,7 @@
     <w:basedOn w:val="DefaultParagraphFont"/>
     <w:uiPriority w:val="20"/>
     <w:qFormat/>
-    <w:rsid w:val="00892F25"/>
+    <w:rsid w:val="00BD1F16"/>
     <w:rPr>
       <w:i/>
       <w:iCs/>
@@ -1477,7 +3459,7 @@
     <w:basedOn w:val="DefaultParagraphFont"/>
     <w:uiPriority w:val="19"/>
     <w:qFormat/>
-    <w:rsid w:val="00892F25"/>
+    <w:rsid w:val="00BD1F16"/>
     <w:rPr>
       <w:i/>
       <w:iCs/>
@@ -1489,7 +3471,7 @@
     <w:basedOn w:val="DefaultParagraphFont"/>
     <w:uiPriority w:val="99"/>
     <w:unhideWhenUsed/>
-    <w:rsid w:val="00892F25"/>
+    <w:rsid w:val="00BD1F16"/>
     <w:rPr>
       <w:color w:val="467886" w:themeColor="hyperlink"/>
       <w:u w:val="single"/>
@@ -1500,16 +3482,99 @@
     <w:basedOn w:val="DefaultParagraphFont"/>
     <w:uiPriority w:val="99"/>
     <w:unhideWhenUsed/>
-    <w:rsid w:val="00892F25"/>
+    <w:rsid w:val="00BD1F16"/>
     <w:rPr>
       <w:vertAlign w:val="superscript"/>
     </w:rPr>
+  </w:style>
+  <w:style w:type="character" w:styleId="EndnoteReference">
+    <w:name w:val="endnote reference"/>
+    <w:basedOn w:val="DefaultParagraphFont"/>
+    <w:uiPriority w:val="99"/>
+    <w:unhideWhenUsed/>
+    <w:rsid w:val="00BD1F16"/>
+    <w:rPr>
+      <w:vertAlign w:val="superscript"/>
+    </w:rPr>
+  </w:style>
+  <w:style w:type="character" w:styleId="PlaceholderText">
+    <w:name w:val="Placeholder Text"/>
+    <w:basedOn w:val="DefaultParagraphFont"/>
+    <w:uiPriority w:val="99"/>
+    <w:semiHidden/>
+    <w:rsid w:val="00BD1F16"/>
+    <w:rPr>
+      <w:color w:val="666666"/>
+    </w:rPr>
+  </w:style>
+  <w:style w:type="character" w:styleId="BookTitle">
+    <w:name w:val="Book Title"/>
+    <w:basedOn w:val="DefaultParagraphFont"/>
+    <w:uiPriority w:val="33"/>
+    <w:qFormat/>
+    <w:rsid w:val="00BD1F16"/>
+    <w:rPr>
+      <w:b/>
+      <w:bCs/>
+      <w:i/>
+      <w:iCs/>
+      <w:spacing w:val="5"/>
+    </w:rPr>
+  </w:style>
+  <w:style w:type="character" w:styleId="SubtleReference">
+    <w:name w:val="Subtle Reference"/>
+    <w:basedOn w:val="DefaultParagraphFont"/>
+    <w:uiPriority w:val="31"/>
+    <w:qFormat/>
+    <w:rsid w:val="00BD1F16"/>
+    <w:rPr>
+      <w:smallCaps/>
+      <w:color w:val="5A5A5A" w:themeColor="text1" w:themeTint="A5"/>
+    </w:rPr>
+  </w:style>
+  <w:style w:type="character" w:styleId="FollowedHyperlink">
+    <w:name w:val="FollowedHyperlink"/>
+    <w:basedOn w:val="DefaultParagraphFont"/>
+    <w:uiPriority w:val="99"/>
+    <w:unhideWhenUsed/>
+    <w:rsid w:val="00BD1F16"/>
+    <w:rPr>
+      <w:color w:val="96607D" w:themeColor="followedHyperlink"/>
+      <w:u w:val="single"/>
+    </w:rPr>
+  </w:style>
+  <w:style w:type="character" w:styleId="HTMLCode">
+    <w:name w:val="HTML Code"/>
+    <w:basedOn w:val="DefaultParagraphFont"/>
+    <w:uiPriority w:val="99"/>
+    <w:unhideWhenUsed/>
+    <w:rsid w:val="00BD1F16"/>
+    <w:rPr>
+      <w:rFonts w:ascii="Consolas" w:hAnsi="Consolas"/>
+      <w:noProof/>
+      <w:sz w:val="20"/>
+      <w:szCs w:val="20"/>
+    </w:rPr>
+  </w:style>
+  <w:style w:type="character" w:styleId="PageNumber">
+    <w:name w:val="page number"/>
+    <w:basedOn w:val="DefaultParagraphFont"/>
+    <w:uiPriority w:val="99"/>
+    <w:unhideWhenUsed/>
+    <w:rsid w:val="00BD1F16"/>
+  </w:style>
+  <w:style w:type="character" w:styleId="LineNumber">
+    <w:name w:val="line number"/>
+    <w:basedOn w:val="DefaultParagraphFont"/>
+    <w:uiPriority w:val="99"/>
+    <w:unhideWhenUsed/>
+    <w:rsid w:val="00BD1F16"/>
   </w:style>
   <w:style w:type="table" w:styleId="TableGrid">
     <w:name w:val="Table Grid"/>
     <w:basedOn w:val="TableNormal"/>
     <w:uiPriority w:val="39"/>
-    <w:rsid w:val="00892F25"/>
+    <w:rsid w:val="00BD1F16"/>
     <w:pPr>
       <w:spacing w:after="0" w:line="240" w:lineRule="auto"/>
     </w:pPr>
@@ -1523,6 +3588,1133 @@
         <w:insideV w:val="single" w:sz="4" w:space="0" w:color="auto"/>
       </w:tblBorders>
     </w:tblPr>
+  </w:style>
+  <w:style w:type="table" w:styleId="TableGridLight">
+    <w:name w:val="Grid Table Light"/>
+    <w:basedOn w:val="TableNormal"/>
+    <w:uiPriority w:val="40"/>
+    <w:rsid w:val="00BD1F16"/>
+    <w:pPr>
+      <w:spacing w:after="0" w:line="240" w:lineRule="auto"/>
+    </w:pPr>
+    <w:tblPr>
+      <w:tblBorders>
+        <w:top w:val="single" w:sz="4" w:space="0" w:color="BFBFBF" w:themeColor="background1" w:themeShade="BF"/>
+        <w:left w:val="single" w:sz="4" w:space="0" w:color="BFBFBF" w:themeColor="background1" w:themeShade="BF"/>
+        <w:bottom w:val="single" w:sz="4" w:space="0" w:color="BFBFBF" w:themeColor="background1" w:themeShade="BF"/>
+        <w:right w:val="single" w:sz="4" w:space="0" w:color="BFBFBF" w:themeColor="background1" w:themeShade="BF"/>
+        <w:insideH w:val="single" w:sz="4" w:space="0" w:color="BFBFBF" w:themeColor="background1" w:themeShade="BF"/>
+        <w:insideV w:val="single" w:sz="4" w:space="0" w:color="BFBFBF" w:themeColor="background1" w:themeShade="BF"/>
+      </w:tblBorders>
+    </w:tblPr>
+  </w:style>
+  <w:style w:type="table" w:styleId="PlainTable1">
+    <w:name w:val="Plain Table 1"/>
+    <w:basedOn w:val="TableNormal"/>
+    <w:uiPriority w:val="41"/>
+    <w:rsid w:val="00BD1F16"/>
+    <w:pPr>
+      <w:spacing w:after="0" w:line="240" w:lineRule="auto"/>
+    </w:pPr>
+    <w:tblPr>
+      <w:tblStyleRowBandSize w:val="1"/>
+      <w:tblStyleColBandSize w:val="1"/>
+      <w:tblBorders>
+        <w:top w:val="single" w:sz="4" w:space="0" w:color="BFBFBF" w:themeColor="background1" w:themeShade="BF"/>
+        <w:left w:val="single" w:sz="4" w:space="0" w:color="BFBFBF" w:themeColor="background1" w:themeShade="BF"/>
+        <w:bottom w:val="single" w:sz="4" w:space="0" w:color="BFBFBF" w:themeColor="background1" w:themeShade="BF"/>
+        <w:right w:val="single" w:sz="4" w:space="0" w:color="BFBFBF" w:themeColor="background1" w:themeShade="BF"/>
+        <w:insideH w:val="single" w:sz="4" w:space="0" w:color="BFBFBF" w:themeColor="background1" w:themeShade="BF"/>
+        <w:insideV w:val="single" w:sz="4" w:space="0" w:color="BFBFBF" w:themeColor="background1" w:themeShade="BF"/>
+      </w:tblBorders>
+    </w:tblPr>
+    <w:tblStylePr w:type="firstRow">
+      <w:rPr>
+        <w:b/>
+        <w:bCs/>
+      </w:rPr>
+    </w:tblStylePr>
+    <w:tblStylePr w:type="lastRow">
+      <w:rPr>
+        <w:b/>
+        <w:bCs/>
+      </w:rPr>
+      <w:tblPr/>
+      <w:tcPr>
+        <w:tcBorders>
+          <w:top w:val="double" w:sz="4" w:space="0" w:color="BFBFBF" w:themeColor="background1" w:themeShade="BF"/>
+        </w:tcBorders>
+      </w:tcPr>
+    </w:tblStylePr>
+    <w:tblStylePr w:type="firstCol">
+      <w:rPr>
+        <w:b/>
+        <w:bCs/>
+      </w:rPr>
+    </w:tblStylePr>
+    <w:tblStylePr w:type="lastCol">
+      <w:rPr>
+        <w:b/>
+        <w:bCs/>
+      </w:rPr>
+    </w:tblStylePr>
+    <w:tblStylePr w:type="band1Vert">
+      <w:tblPr/>
+      <w:tcPr>
+        <w:shd w:val="clear" w:color="auto" w:fill="F2F2F2" w:themeFill="background1" w:themeFillShade="F2"/>
+      </w:tcPr>
+    </w:tblStylePr>
+    <w:tblStylePr w:type="band1Horz">
+      <w:tblPr/>
+      <w:tcPr>
+        <w:shd w:val="clear" w:color="auto" w:fill="F2F2F2" w:themeFill="background1" w:themeFillShade="F2"/>
+      </w:tcPr>
+    </w:tblStylePr>
+  </w:style>
+  <w:style w:type="table" w:styleId="PlainTable2">
+    <w:name w:val="Plain Table 2"/>
+    <w:basedOn w:val="TableNormal"/>
+    <w:uiPriority w:val="42"/>
+    <w:rsid w:val="00BD1F16"/>
+    <w:pPr>
+      <w:spacing w:after="0" w:line="240" w:lineRule="auto"/>
+    </w:pPr>
+    <w:tblPr>
+      <w:tblStyleRowBandSize w:val="1"/>
+      <w:tblStyleColBandSize w:val="1"/>
+      <w:tblBorders>
+        <w:top w:val="single" w:sz="4" w:space="0" w:color="7F7F7F" w:themeColor="text1" w:themeTint="80"/>
+        <w:bottom w:val="single" w:sz="4" w:space="0" w:color="7F7F7F" w:themeColor="text1" w:themeTint="80"/>
+      </w:tblBorders>
+    </w:tblPr>
+    <w:tblStylePr w:type="firstRow">
+      <w:rPr>
+        <w:b/>
+        <w:bCs/>
+      </w:rPr>
+      <w:tblPr/>
+      <w:tcPr>
+        <w:tcBorders>
+          <w:bottom w:val="single" w:sz="4" w:space="0" w:color="7F7F7F" w:themeColor="text1" w:themeTint="80"/>
+        </w:tcBorders>
+      </w:tcPr>
+    </w:tblStylePr>
+    <w:tblStylePr w:type="lastRow">
+      <w:rPr>
+        <w:b/>
+        <w:bCs/>
+      </w:rPr>
+      <w:tblPr/>
+      <w:tcPr>
+        <w:tcBorders>
+          <w:top w:val="single" w:sz="4" w:space="0" w:color="7F7F7F" w:themeColor="text1" w:themeTint="80"/>
+        </w:tcBorders>
+      </w:tcPr>
+    </w:tblStylePr>
+    <w:tblStylePr w:type="firstCol">
+      <w:rPr>
+        <w:b/>
+        <w:bCs/>
+      </w:rPr>
+    </w:tblStylePr>
+    <w:tblStylePr w:type="lastCol">
+      <w:rPr>
+        <w:b/>
+        <w:bCs/>
+      </w:rPr>
+    </w:tblStylePr>
+    <w:tblStylePr w:type="band1Vert">
+      <w:tblPr/>
+      <w:tcPr>
+        <w:tcBorders>
+          <w:left w:val="single" w:sz="4" w:space="0" w:color="7F7F7F" w:themeColor="text1" w:themeTint="80"/>
+          <w:right w:val="single" w:sz="4" w:space="0" w:color="7F7F7F" w:themeColor="text1" w:themeTint="80"/>
+        </w:tcBorders>
+      </w:tcPr>
+    </w:tblStylePr>
+    <w:tblStylePr w:type="band2Vert">
+      <w:tblPr/>
+      <w:tcPr>
+        <w:tcBorders>
+          <w:left w:val="single" w:sz="4" w:space="0" w:color="7F7F7F" w:themeColor="text1" w:themeTint="80"/>
+          <w:right w:val="single" w:sz="4" w:space="0" w:color="7F7F7F" w:themeColor="text1" w:themeTint="80"/>
+        </w:tcBorders>
+      </w:tcPr>
+    </w:tblStylePr>
+    <w:tblStylePr w:type="band1Horz">
+      <w:tblPr/>
+      <w:tcPr>
+        <w:tcBorders>
+          <w:top w:val="single" w:sz="4" w:space="0" w:color="7F7F7F" w:themeColor="text1" w:themeTint="80"/>
+          <w:bottom w:val="single" w:sz="4" w:space="0" w:color="7F7F7F" w:themeColor="text1" w:themeTint="80"/>
+        </w:tcBorders>
+      </w:tcPr>
+    </w:tblStylePr>
+  </w:style>
+  <w:style w:type="table" w:styleId="PlainTable3">
+    <w:name w:val="Plain Table 3"/>
+    <w:basedOn w:val="TableNormal"/>
+    <w:uiPriority w:val="43"/>
+    <w:rsid w:val="00BD1F16"/>
+    <w:pPr>
+      <w:spacing w:after="0" w:line="240" w:lineRule="auto"/>
+    </w:pPr>
+    <w:tblPr>
+      <w:tblStyleRowBandSize w:val="1"/>
+      <w:tblStyleColBandSize w:val="1"/>
+    </w:tblPr>
+    <w:tblStylePr w:type="firstRow">
+      <w:rPr>
+        <w:b/>
+        <w:bCs/>
+        <w:caps/>
+      </w:rPr>
+      <w:tblPr/>
+      <w:tcPr>
+        <w:tcBorders>
+          <w:bottom w:val="single" w:sz="4" w:space="0" w:color="7F7F7F" w:themeColor="text1" w:themeTint="80"/>
+        </w:tcBorders>
+      </w:tcPr>
+    </w:tblStylePr>
+    <w:tblStylePr w:type="lastRow">
+      <w:rPr>
+        <w:b/>
+        <w:bCs/>
+        <w:caps/>
+      </w:rPr>
+      <w:tblPr/>
+      <w:tcPr>
+        <w:tcBorders>
+          <w:top w:val="nil"/>
+        </w:tcBorders>
+      </w:tcPr>
+    </w:tblStylePr>
+    <w:tblStylePr w:type="firstCol">
+      <w:rPr>
+        <w:b/>
+        <w:bCs/>
+        <w:caps/>
+      </w:rPr>
+      <w:tblPr/>
+      <w:tcPr>
+        <w:tcBorders>
+          <w:right w:val="single" w:sz="4" w:space="0" w:color="7F7F7F" w:themeColor="text1" w:themeTint="80"/>
+        </w:tcBorders>
+      </w:tcPr>
+    </w:tblStylePr>
+    <w:tblStylePr w:type="lastCol">
+      <w:rPr>
+        <w:b/>
+        <w:bCs/>
+        <w:caps/>
+      </w:rPr>
+      <w:tblPr/>
+      <w:tcPr>
+        <w:tcBorders>
+          <w:left w:val="nil"/>
+        </w:tcBorders>
+      </w:tcPr>
+    </w:tblStylePr>
+    <w:tblStylePr w:type="band1Vert">
+      <w:tblPr/>
+      <w:tcPr>
+        <w:shd w:val="clear" w:color="auto" w:fill="F2F2F2" w:themeFill="background1" w:themeFillShade="F2"/>
+      </w:tcPr>
+    </w:tblStylePr>
+    <w:tblStylePr w:type="band1Horz">
+      <w:tblPr/>
+      <w:tcPr>
+        <w:shd w:val="clear" w:color="auto" w:fill="F2F2F2" w:themeFill="background1" w:themeFillShade="F2"/>
+      </w:tcPr>
+    </w:tblStylePr>
+    <w:tblStylePr w:type="neCell">
+      <w:tblPr/>
+      <w:tcPr>
+        <w:tcBorders>
+          <w:left w:val="nil"/>
+        </w:tcBorders>
+      </w:tcPr>
+    </w:tblStylePr>
+    <w:tblStylePr w:type="nwCell">
+      <w:tblPr/>
+      <w:tcPr>
+        <w:tcBorders>
+          <w:right w:val="nil"/>
+        </w:tcBorders>
+      </w:tcPr>
+    </w:tblStylePr>
+  </w:style>
+  <w:style w:type="table" w:styleId="PlainTable4">
+    <w:name w:val="Plain Table 4"/>
+    <w:basedOn w:val="TableNormal"/>
+    <w:uiPriority w:val="44"/>
+    <w:rsid w:val="00BD1F16"/>
+    <w:pPr>
+      <w:spacing w:after="0" w:line="240" w:lineRule="auto"/>
+    </w:pPr>
+    <w:tblPr>
+      <w:tblStyleRowBandSize w:val="1"/>
+      <w:tblStyleColBandSize w:val="1"/>
+    </w:tblPr>
+    <w:tblStylePr w:type="firstRow">
+      <w:rPr>
+        <w:b/>
+        <w:bCs/>
+      </w:rPr>
+    </w:tblStylePr>
+    <w:tblStylePr w:type="lastRow">
+      <w:rPr>
+        <w:b/>
+        <w:bCs/>
+      </w:rPr>
+    </w:tblStylePr>
+    <w:tblStylePr w:type="firstCol">
+      <w:rPr>
+        <w:b/>
+        <w:bCs/>
+      </w:rPr>
+    </w:tblStylePr>
+    <w:tblStylePr w:type="lastCol">
+      <w:rPr>
+        <w:b/>
+        <w:bCs/>
+      </w:rPr>
+    </w:tblStylePr>
+    <w:tblStylePr w:type="band1Vert">
+      <w:tblPr/>
+      <w:tcPr>
+        <w:shd w:val="clear" w:color="auto" w:fill="F2F2F2" w:themeFill="background1" w:themeFillShade="F2"/>
+      </w:tcPr>
+    </w:tblStylePr>
+    <w:tblStylePr w:type="band1Horz">
+      <w:tblPr/>
+      <w:tcPr>
+        <w:shd w:val="clear" w:color="auto" w:fill="F2F2F2" w:themeFill="background1" w:themeFillShade="F2"/>
+      </w:tcPr>
+    </w:tblStylePr>
+  </w:style>
+  <w:style w:type="table" w:styleId="PlainTable5">
+    <w:name w:val="Plain Table 5"/>
+    <w:basedOn w:val="TableNormal"/>
+    <w:uiPriority w:val="45"/>
+    <w:rsid w:val="00BD1F16"/>
+    <w:pPr>
+      <w:spacing w:after="0" w:line="240" w:lineRule="auto"/>
+    </w:pPr>
+    <w:tblPr>
+      <w:tblStyleRowBandSize w:val="1"/>
+      <w:tblStyleColBandSize w:val="1"/>
+    </w:tblPr>
+    <w:tblStylePr w:type="firstRow">
+      <w:rPr>
+        <w:rFonts w:asciiTheme="majorHAnsi" w:eastAsiaTheme="majorEastAsia" w:hAnsiTheme="majorHAnsi" w:cstheme="majorBidi"/>
+        <w:i/>
+        <w:iCs/>
+        <w:sz w:val="26"/>
+      </w:rPr>
+      <w:tblPr/>
+      <w:tcPr>
+        <w:tcBorders>
+          <w:bottom w:val="single" w:sz="4" w:space="0" w:color="7F7F7F" w:themeColor="text1" w:themeTint="80"/>
+        </w:tcBorders>
+        <w:shd w:val="clear" w:color="auto" w:fill="FFFFFF" w:themeFill="background1"/>
+      </w:tcPr>
+    </w:tblStylePr>
+    <w:tblStylePr w:type="lastRow">
+      <w:rPr>
+        <w:rFonts w:asciiTheme="majorHAnsi" w:eastAsiaTheme="majorEastAsia" w:hAnsiTheme="majorHAnsi" w:cstheme="majorBidi"/>
+        <w:i/>
+        <w:iCs/>
+        <w:sz w:val="26"/>
+      </w:rPr>
+      <w:tblPr/>
+      <w:tcPr>
+        <w:tcBorders>
+          <w:top w:val="single" w:sz="4" w:space="0" w:color="7F7F7F" w:themeColor="text1" w:themeTint="80"/>
+        </w:tcBorders>
+        <w:shd w:val="clear" w:color="auto" w:fill="FFFFFF" w:themeFill="background1"/>
+      </w:tcPr>
+    </w:tblStylePr>
+    <w:tblStylePr w:type="firstCol">
+      <w:pPr>
+        <w:jc w:val="right"/>
+      </w:pPr>
+      <w:rPr>
+        <w:rFonts w:asciiTheme="majorHAnsi" w:eastAsiaTheme="majorEastAsia" w:hAnsiTheme="majorHAnsi" w:cstheme="majorBidi"/>
+        <w:i/>
+        <w:iCs/>
+        <w:sz w:val="26"/>
+      </w:rPr>
+      <w:tblPr/>
+      <w:tcPr>
+        <w:tcBorders>
+          <w:right w:val="single" w:sz="4" w:space="0" w:color="7F7F7F" w:themeColor="text1" w:themeTint="80"/>
+        </w:tcBorders>
+        <w:shd w:val="clear" w:color="auto" w:fill="FFFFFF" w:themeFill="background1"/>
+      </w:tcPr>
+    </w:tblStylePr>
+    <w:tblStylePr w:type="lastCol">
+      <w:rPr>
+        <w:rFonts w:asciiTheme="majorHAnsi" w:eastAsiaTheme="majorEastAsia" w:hAnsiTheme="majorHAnsi" w:cstheme="majorBidi"/>
+        <w:i/>
+        <w:iCs/>
+        <w:sz w:val="26"/>
+      </w:rPr>
+      <w:tblPr/>
+      <w:tcPr>
+        <w:tcBorders>
+          <w:left w:val="single" w:sz="4" w:space="0" w:color="7F7F7F" w:themeColor="text1" w:themeTint="80"/>
+        </w:tcBorders>
+        <w:shd w:val="clear" w:color="auto" w:fill="FFFFFF" w:themeFill="background1"/>
+      </w:tcPr>
+    </w:tblStylePr>
+    <w:tblStylePr w:type="band1Vert">
+      <w:tblPr/>
+      <w:tcPr>
+        <w:shd w:val="clear" w:color="auto" w:fill="F2F2F2" w:themeFill="background1" w:themeFillShade="F2"/>
+      </w:tcPr>
+    </w:tblStylePr>
+    <w:tblStylePr w:type="band1Horz">
+      <w:tblPr/>
+      <w:tcPr>
+        <w:shd w:val="clear" w:color="auto" w:fill="F2F2F2" w:themeFill="background1" w:themeFillShade="F2"/>
+      </w:tcPr>
+    </w:tblStylePr>
+    <w:tblStylePr w:type="neCell">
+      <w:tblPr/>
+      <w:tcPr>
+        <w:tcBorders>
+          <w:left w:val="nil"/>
+        </w:tcBorders>
+      </w:tcPr>
+    </w:tblStylePr>
+    <w:tblStylePr w:type="nwCell">
+      <w:tblPr/>
+      <w:tcPr>
+        <w:tcBorders>
+          <w:right w:val="nil"/>
+        </w:tcBorders>
+      </w:tcPr>
+    </w:tblStylePr>
+    <w:tblStylePr w:type="seCell">
+      <w:tblPr/>
+      <w:tcPr>
+        <w:tcBorders>
+          <w:left w:val="nil"/>
+        </w:tcBorders>
+      </w:tcPr>
+    </w:tblStylePr>
+    <w:tblStylePr w:type="swCell">
+      <w:tblPr/>
+      <w:tcPr>
+        <w:tcBorders>
+          <w:right w:val="nil"/>
+        </w:tcBorders>
+      </w:tcPr>
+    </w:tblStylePr>
+  </w:style>
+  <w:style w:type="table" w:styleId="GridTable1Light">
+    <w:name w:val="Grid Table 1 Light"/>
+    <w:basedOn w:val="TableNormal"/>
+    <w:uiPriority w:val="46"/>
+    <w:rsid w:val="00BD1F16"/>
+    <w:pPr>
+      <w:spacing w:after="0" w:line="240" w:lineRule="auto"/>
+    </w:pPr>
+    <w:tblPr>
+      <w:tblStyleRowBandSize w:val="1"/>
+      <w:tblStyleColBandSize w:val="1"/>
+      <w:tblBorders>
+        <w:top w:val="single" w:sz="4" w:space="0" w:color="999999" w:themeColor="text1" w:themeTint="66"/>
+        <w:left w:val="single" w:sz="4" w:space="0" w:color="999999" w:themeColor="text1" w:themeTint="66"/>
+        <w:bottom w:val="single" w:sz="4" w:space="0" w:color="999999" w:themeColor="text1" w:themeTint="66"/>
+        <w:right w:val="single" w:sz="4" w:space="0" w:color="999999" w:themeColor="text1" w:themeTint="66"/>
+        <w:insideH w:val="single" w:sz="4" w:space="0" w:color="999999" w:themeColor="text1" w:themeTint="66"/>
+        <w:insideV w:val="single" w:sz="4" w:space="0" w:color="999999" w:themeColor="text1" w:themeTint="66"/>
+      </w:tblBorders>
+    </w:tblPr>
+    <w:tblStylePr w:type="firstRow">
+      <w:rPr>
+        <w:b/>
+        <w:bCs/>
+      </w:rPr>
+      <w:tblPr/>
+      <w:tcPr>
+        <w:tcBorders>
+          <w:bottom w:val="single" w:sz="12" w:space="0" w:color="666666" w:themeColor="text1" w:themeTint="99"/>
+        </w:tcBorders>
+      </w:tcPr>
+    </w:tblStylePr>
+    <w:tblStylePr w:type="lastRow">
+      <w:rPr>
+        <w:b/>
+        <w:bCs/>
+      </w:rPr>
+      <w:tblPr/>
+      <w:tcPr>
+        <w:tcBorders>
+          <w:top w:val="double" w:sz="2" w:space="0" w:color="666666" w:themeColor="text1" w:themeTint="99"/>
+        </w:tcBorders>
+      </w:tcPr>
+    </w:tblStylePr>
+    <w:tblStylePr w:type="firstCol">
+      <w:rPr>
+        <w:b/>
+        <w:bCs/>
+      </w:rPr>
+    </w:tblStylePr>
+    <w:tblStylePr w:type="lastCol">
+      <w:rPr>
+        <w:b/>
+        <w:bCs/>
+      </w:rPr>
+    </w:tblStylePr>
+  </w:style>
+  <w:style w:type="table" w:styleId="GridTable2">
+    <w:name w:val="Grid Table 2"/>
+    <w:basedOn w:val="TableNormal"/>
+    <w:uiPriority w:val="47"/>
+    <w:rsid w:val="00BD1F16"/>
+    <w:pPr>
+      <w:spacing w:after="0" w:line="240" w:lineRule="auto"/>
+    </w:pPr>
+    <w:tblPr>
+      <w:tblStyleRowBandSize w:val="1"/>
+      <w:tblStyleColBandSize w:val="1"/>
+      <w:tblBorders>
+        <w:top w:val="single" w:sz="2" w:space="0" w:color="666666" w:themeColor="text1" w:themeTint="99"/>
+        <w:bottom w:val="single" w:sz="2" w:space="0" w:color="666666" w:themeColor="text1" w:themeTint="99"/>
+        <w:insideH w:val="single" w:sz="2" w:space="0" w:color="666666" w:themeColor="text1" w:themeTint="99"/>
+        <w:insideV w:val="single" w:sz="2" w:space="0" w:color="666666" w:themeColor="text1" w:themeTint="99"/>
+      </w:tblBorders>
+    </w:tblPr>
+    <w:tblStylePr w:type="firstRow">
+      <w:rPr>
+        <w:b/>
+        <w:bCs/>
+      </w:rPr>
+      <w:tblPr/>
+      <w:tcPr>
+        <w:tcBorders>
+          <w:top w:val="nil"/>
+          <w:bottom w:val="single" w:sz="12" w:space="0" w:color="666666" w:themeColor="text1" w:themeTint="99"/>
+          <w:insideH w:val="nil"/>
+          <w:insideV w:val="nil"/>
+        </w:tcBorders>
+        <w:shd w:val="clear" w:color="auto" w:fill="FFFFFF" w:themeFill="background1"/>
+      </w:tcPr>
+    </w:tblStylePr>
+    <w:tblStylePr w:type="lastRow">
+      <w:rPr>
+        <w:b/>
+        <w:bCs/>
+      </w:rPr>
+      <w:tblPr/>
+      <w:tcPr>
+        <w:tcBorders>
+          <w:top w:val="double" w:sz="2" w:space="0" w:color="666666" w:themeColor="text1" w:themeTint="99"/>
+          <w:bottom w:val="nil"/>
+          <w:insideH w:val="nil"/>
+          <w:insideV w:val="nil"/>
+        </w:tcBorders>
+        <w:shd w:val="clear" w:color="auto" w:fill="FFFFFF" w:themeFill="background1"/>
+      </w:tcPr>
+    </w:tblStylePr>
+    <w:tblStylePr w:type="firstCol">
+      <w:rPr>
+        <w:b/>
+        <w:bCs/>
+      </w:rPr>
+    </w:tblStylePr>
+    <w:tblStylePr w:type="lastCol">
+      <w:rPr>
+        <w:b/>
+        <w:bCs/>
+      </w:rPr>
+    </w:tblStylePr>
+    <w:tblStylePr w:type="band1Vert">
+      <w:tblPr/>
+      <w:tcPr>
+        <w:shd w:val="clear" w:color="auto" w:fill="CCCCCC" w:themeFill="text1" w:themeFillTint="33"/>
+      </w:tcPr>
+    </w:tblStylePr>
+    <w:tblStylePr w:type="band1Horz">
+      <w:tblPr/>
+      <w:tcPr>
+        <w:shd w:val="clear" w:color="auto" w:fill="CCCCCC" w:themeFill="text1" w:themeFillTint="33"/>
+      </w:tcPr>
+    </w:tblStylePr>
+  </w:style>
+  <w:style w:type="table" w:styleId="GridTable4">
+    <w:name w:val="Grid Table 4"/>
+    <w:basedOn w:val="TableNormal"/>
+    <w:uiPriority w:val="49"/>
+    <w:rsid w:val="00BD1F16"/>
+    <w:pPr>
+      <w:spacing w:after="0" w:line="240" w:lineRule="auto"/>
+    </w:pPr>
+    <w:tblPr>
+      <w:tblStyleRowBandSize w:val="1"/>
+      <w:tblStyleColBandSize w:val="1"/>
+      <w:tblBorders>
+        <w:top w:val="single" w:sz="4" w:space="0" w:color="666666" w:themeColor="text1" w:themeTint="99"/>
+        <w:left w:val="single" w:sz="4" w:space="0" w:color="666666" w:themeColor="text1" w:themeTint="99"/>
+        <w:bottom w:val="single" w:sz="4" w:space="0" w:color="666666" w:themeColor="text1" w:themeTint="99"/>
+        <w:right w:val="single" w:sz="4" w:space="0" w:color="666666" w:themeColor="text1" w:themeTint="99"/>
+        <w:insideH w:val="single" w:sz="4" w:space="0" w:color="666666" w:themeColor="text1" w:themeTint="99"/>
+        <w:insideV w:val="single" w:sz="4" w:space="0" w:color="666666" w:themeColor="text1" w:themeTint="99"/>
+      </w:tblBorders>
+    </w:tblPr>
+    <w:tblStylePr w:type="firstRow">
+      <w:rPr>
+        <w:b/>
+        <w:bCs/>
+        <w:color w:val="FFFFFF" w:themeColor="background1"/>
+      </w:rPr>
+      <w:tblPr/>
+      <w:tcPr>
+        <w:tcBorders>
+          <w:top w:val="single" w:sz="4" w:space="0" w:color="000000" w:themeColor="text1"/>
+          <w:left w:val="single" w:sz="4" w:space="0" w:color="000000" w:themeColor="text1"/>
+          <w:bottom w:val="single" w:sz="4" w:space="0" w:color="000000" w:themeColor="text1"/>
+          <w:right w:val="single" w:sz="4" w:space="0" w:color="000000" w:themeColor="text1"/>
+          <w:insideH w:val="nil"/>
+          <w:insideV w:val="nil"/>
+        </w:tcBorders>
+        <w:shd w:val="clear" w:color="auto" w:fill="000000" w:themeFill="text1"/>
+      </w:tcPr>
+    </w:tblStylePr>
+    <w:tblStylePr w:type="lastRow">
+      <w:rPr>
+        <w:b/>
+        <w:bCs/>
+      </w:rPr>
+      <w:tblPr/>
+      <w:tcPr>
+        <w:tcBorders>
+          <w:top w:val="double" w:sz="4" w:space="0" w:color="000000" w:themeColor="text1"/>
+        </w:tcBorders>
+      </w:tcPr>
+    </w:tblStylePr>
+    <w:tblStylePr w:type="firstCol">
+      <w:rPr>
+        <w:b/>
+        <w:bCs/>
+      </w:rPr>
+    </w:tblStylePr>
+    <w:tblStylePr w:type="lastCol">
+      <w:rPr>
+        <w:b/>
+        <w:bCs/>
+      </w:rPr>
+    </w:tblStylePr>
+    <w:tblStylePr w:type="band1Vert">
+      <w:tblPr/>
+      <w:tcPr>
+        <w:shd w:val="clear" w:color="auto" w:fill="CCCCCC" w:themeFill="text1" w:themeFillTint="33"/>
+      </w:tcPr>
+    </w:tblStylePr>
+    <w:tblStylePr w:type="band1Horz">
+      <w:tblPr/>
+      <w:tcPr>
+        <w:shd w:val="clear" w:color="auto" w:fill="CCCCCC" w:themeFill="text1" w:themeFillTint="33"/>
+      </w:tcPr>
+    </w:tblStylePr>
+  </w:style>
+  <w:style w:type="table" w:styleId="GridTable4-Accent1">
+    <w:name w:val="Grid Table 4 Accent 1"/>
+    <w:basedOn w:val="TableNormal"/>
+    <w:uiPriority w:val="49"/>
+    <w:rsid w:val="00BD1F16"/>
+    <w:pPr>
+      <w:spacing w:after="0" w:line="240" w:lineRule="auto"/>
+    </w:pPr>
+    <w:tblPr>
+      <w:tblStyleRowBandSize w:val="1"/>
+      <w:tblStyleColBandSize w:val="1"/>
+      <w:tblBorders>
+        <w:top w:val="single" w:sz="4" w:space="0" w:color="45B0E1" w:themeColor="accent1" w:themeTint="99"/>
+        <w:left w:val="single" w:sz="4" w:space="0" w:color="45B0E1" w:themeColor="accent1" w:themeTint="99"/>
+        <w:bottom w:val="single" w:sz="4" w:space="0" w:color="45B0E1" w:themeColor="accent1" w:themeTint="99"/>
+        <w:right w:val="single" w:sz="4" w:space="0" w:color="45B0E1" w:themeColor="accent1" w:themeTint="99"/>
+        <w:insideH w:val="single" w:sz="4" w:space="0" w:color="45B0E1" w:themeColor="accent1" w:themeTint="99"/>
+        <w:insideV w:val="single" w:sz="4" w:space="0" w:color="45B0E1" w:themeColor="accent1" w:themeTint="99"/>
+      </w:tblBorders>
+    </w:tblPr>
+    <w:tblStylePr w:type="firstRow">
+      <w:rPr>
+        <w:b/>
+        <w:bCs/>
+        <w:color w:val="FFFFFF" w:themeColor="background1"/>
+      </w:rPr>
+      <w:tblPr/>
+      <w:tcPr>
+        <w:tcBorders>
+          <w:top w:val="single" w:sz="4" w:space="0" w:color="156082" w:themeColor="accent1"/>
+          <w:left w:val="single" w:sz="4" w:space="0" w:color="156082" w:themeColor="accent1"/>
+          <w:bottom w:val="single" w:sz="4" w:space="0" w:color="156082" w:themeColor="accent1"/>
+          <w:right w:val="single" w:sz="4" w:space="0" w:color="156082" w:themeColor="accent1"/>
+          <w:insideH w:val="nil"/>
+          <w:insideV w:val="nil"/>
+        </w:tcBorders>
+        <w:shd w:val="clear" w:color="auto" w:fill="156082" w:themeFill="accent1"/>
+      </w:tcPr>
+    </w:tblStylePr>
+    <w:tblStylePr w:type="lastRow">
+      <w:rPr>
+        <w:b/>
+        <w:bCs/>
+      </w:rPr>
+      <w:tblPr/>
+      <w:tcPr>
+        <w:tcBorders>
+          <w:top w:val="double" w:sz="4" w:space="0" w:color="156082" w:themeColor="accent1"/>
+        </w:tcBorders>
+      </w:tcPr>
+    </w:tblStylePr>
+    <w:tblStylePr w:type="firstCol">
+      <w:rPr>
+        <w:b/>
+        <w:bCs/>
+      </w:rPr>
+    </w:tblStylePr>
+    <w:tblStylePr w:type="lastCol">
+      <w:rPr>
+        <w:b/>
+        <w:bCs/>
+      </w:rPr>
+    </w:tblStylePr>
+    <w:tblStylePr w:type="band1Vert">
+      <w:tblPr/>
+      <w:tcPr>
+        <w:shd w:val="clear" w:color="auto" w:fill="C1E4F5" w:themeFill="accent1" w:themeFillTint="33"/>
+      </w:tcPr>
+    </w:tblStylePr>
+    <w:tblStylePr w:type="band1Horz">
+      <w:tblPr/>
+      <w:tcPr>
+        <w:shd w:val="clear" w:color="auto" w:fill="C1E4F5" w:themeFill="accent1" w:themeFillTint="33"/>
+      </w:tcPr>
+    </w:tblStylePr>
+  </w:style>
+  <w:style w:type="table" w:styleId="GridTable5Dark">
+    <w:name w:val="Grid Table 5 Dark"/>
+    <w:basedOn w:val="TableNormal"/>
+    <w:uiPriority w:val="50"/>
+    <w:rsid w:val="00BD1F16"/>
+    <w:pPr>
+      <w:spacing w:after="0" w:line="240" w:lineRule="auto"/>
+    </w:pPr>
+    <w:tblPr>
+      <w:tblStyleRowBandSize w:val="1"/>
+      <w:tblStyleColBandSize w:val="1"/>
+      <w:tblBorders>
+        <w:top w:val="single" w:sz="4" w:space="0" w:color="FFFFFF" w:themeColor="background1"/>
+        <w:left w:val="single" w:sz="4" w:space="0" w:color="FFFFFF" w:themeColor="background1"/>
+        <w:bottom w:val="single" w:sz="4" w:space="0" w:color="FFFFFF" w:themeColor="background1"/>
+        <w:right w:val="single" w:sz="4" w:space="0" w:color="FFFFFF" w:themeColor="background1"/>
+        <w:insideH w:val="single" w:sz="4" w:space="0" w:color="FFFFFF" w:themeColor="background1"/>
+        <w:insideV w:val="single" w:sz="4" w:space="0" w:color="FFFFFF" w:themeColor="background1"/>
+      </w:tblBorders>
+    </w:tblPr>
+    <w:tcPr>
+      <w:shd w:val="clear" w:color="auto" w:fill="CCCCCC" w:themeFill="text1" w:themeFillTint="33"/>
+    </w:tcPr>
+    <w:tblStylePr w:type="firstRow">
+      <w:rPr>
+        <w:b/>
+        <w:bCs/>
+        <w:color w:val="FFFFFF" w:themeColor="background1"/>
+      </w:rPr>
+      <w:tblPr/>
+      <w:tcPr>
+        <w:tcBorders>
+          <w:top w:val="single" w:sz="4" w:space="0" w:color="FFFFFF" w:themeColor="background1"/>
+          <w:left w:val="single" w:sz="4" w:space="0" w:color="FFFFFF" w:themeColor="background1"/>
+          <w:right w:val="single" w:sz="4" w:space="0" w:color="FFFFFF" w:themeColor="background1"/>
+          <w:insideH w:val="nil"/>
+          <w:insideV w:val="nil"/>
+        </w:tcBorders>
+        <w:shd w:val="clear" w:color="auto" w:fill="000000" w:themeFill="text1"/>
+      </w:tcPr>
+    </w:tblStylePr>
+    <w:tblStylePr w:type="lastRow">
+      <w:rPr>
+        <w:b/>
+        <w:bCs/>
+        <w:color w:val="FFFFFF" w:themeColor="background1"/>
+      </w:rPr>
+      <w:tblPr/>
+      <w:tcPr>
+        <w:tcBorders>
+          <w:left w:val="single" w:sz="4" w:space="0" w:color="FFFFFF" w:themeColor="background1"/>
+          <w:bottom w:val="single" w:sz="4" w:space="0" w:color="FFFFFF" w:themeColor="background1"/>
+          <w:right w:val="single" w:sz="4" w:space="0" w:color="FFFFFF" w:themeColor="background1"/>
+          <w:insideH w:val="nil"/>
+          <w:insideV w:val="nil"/>
+        </w:tcBorders>
+        <w:shd w:val="clear" w:color="auto" w:fill="000000" w:themeFill="text1"/>
+      </w:tcPr>
+    </w:tblStylePr>
+    <w:tblStylePr w:type="firstCol">
+      <w:rPr>
+        <w:b/>
+        <w:bCs/>
+        <w:color w:val="FFFFFF" w:themeColor="background1"/>
+      </w:rPr>
+      <w:tblPr/>
+      <w:tcPr>
+        <w:tcBorders>
+          <w:top w:val="single" w:sz="4" w:space="0" w:color="FFFFFF" w:themeColor="background1"/>
+          <w:left w:val="single" w:sz="4" w:space="0" w:color="FFFFFF" w:themeColor="background1"/>
+          <w:bottom w:val="single" w:sz="4" w:space="0" w:color="FFFFFF" w:themeColor="background1"/>
+          <w:insideV w:val="nil"/>
+        </w:tcBorders>
+        <w:shd w:val="clear" w:color="auto" w:fill="000000" w:themeFill="text1"/>
+      </w:tcPr>
+    </w:tblStylePr>
+    <w:tblStylePr w:type="lastCol">
+      <w:rPr>
+        <w:b/>
+        <w:bCs/>
+        <w:color w:val="FFFFFF" w:themeColor="background1"/>
+      </w:rPr>
+      <w:tblPr/>
+      <w:tcPr>
+        <w:tcBorders>
+          <w:top w:val="single" w:sz="4" w:space="0" w:color="FFFFFF" w:themeColor="background1"/>
+          <w:bottom w:val="single" w:sz="4" w:space="0" w:color="FFFFFF" w:themeColor="background1"/>
+          <w:right w:val="single" w:sz="4" w:space="0" w:color="FFFFFF" w:themeColor="background1"/>
+          <w:insideV w:val="nil"/>
+        </w:tcBorders>
+        <w:shd w:val="clear" w:color="auto" w:fill="000000" w:themeFill="text1"/>
+      </w:tcPr>
+    </w:tblStylePr>
+    <w:tblStylePr w:type="band1Vert">
+      <w:tblPr/>
+      <w:tcPr>
+        <w:shd w:val="clear" w:color="auto" w:fill="999999" w:themeFill="text1" w:themeFillTint="66"/>
+      </w:tcPr>
+    </w:tblStylePr>
+    <w:tblStylePr w:type="band1Horz">
+      <w:tblPr/>
+      <w:tcPr>
+        <w:shd w:val="clear" w:color="auto" w:fill="999999" w:themeFill="text1" w:themeFillTint="66"/>
+      </w:tcPr>
+    </w:tblStylePr>
+  </w:style>
+  <w:style w:type="table" w:styleId="ListTable1Light">
+    <w:name w:val="List Table 1 Light"/>
+    <w:basedOn w:val="TableNormal"/>
+    <w:uiPriority w:val="46"/>
+    <w:rsid w:val="00BD1F16"/>
+    <w:pPr>
+      <w:spacing w:after="0" w:line="240" w:lineRule="auto"/>
+    </w:pPr>
+    <w:tblPr>
+      <w:tblStyleRowBandSize w:val="1"/>
+      <w:tblStyleColBandSize w:val="1"/>
+    </w:tblPr>
+    <w:tblStylePr w:type="firstRow">
+      <w:rPr>
+        <w:b/>
+        <w:bCs/>
+      </w:rPr>
+      <w:tblPr/>
+      <w:tcPr>
+        <w:tcBorders>
+          <w:bottom w:val="single" w:sz="4" w:space="0" w:color="666666" w:themeColor="text1" w:themeTint="99"/>
+        </w:tcBorders>
+      </w:tcPr>
+    </w:tblStylePr>
+    <w:tblStylePr w:type="lastRow">
+      <w:rPr>
+        <w:b/>
+        <w:bCs/>
+      </w:rPr>
+      <w:tblPr/>
+      <w:tcPr>
+        <w:tcBorders>
+          <w:top w:val="single" w:sz="4" w:space="0" w:color="666666" w:themeColor="text1" w:themeTint="99"/>
+        </w:tcBorders>
+      </w:tcPr>
+    </w:tblStylePr>
+    <w:tblStylePr w:type="firstCol">
+      <w:rPr>
+        <w:b/>
+        <w:bCs/>
+      </w:rPr>
+    </w:tblStylePr>
+    <w:tblStylePr w:type="lastCol">
+      <w:rPr>
+        <w:b/>
+        <w:bCs/>
+      </w:rPr>
+    </w:tblStylePr>
+    <w:tblStylePr w:type="band1Vert">
+      <w:tblPr/>
+      <w:tcPr>
+        <w:shd w:val="clear" w:color="auto" w:fill="CCCCCC" w:themeFill="text1" w:themeFillTint="33"/>
+      </w:tcPr>
+    </w:tblStylePr>
+    <w:tblStylePr w:type="band1Horz">
+      <w:tblPr/>
+      <w:tcPr>
+        <w:shd w:val="clear" w:color="auto" w:fill="CCCCCC" w:themeFill="text1" w:themeFillTint="33"/>
+      </w:tcPr>
+    </w:tblStylePr>
+  </w:style>
+  <w:style w:type="table" w:styleId="ListTable2">
+    <w:name w:val="List Table 2"/>
+    <w:basedOn w:val="TableNormal"/>
+    <w:uiPriority w:val="47"/>
+    <w:rsid w:val="00BD1F16"/>
+    <w:pPr>
+      <w:spacing w:after="0" w:line="240" w:lineRule="auto"/>
+    </w:pPr>
+    <w:tblPr>
+      <w:tblStyleRowBandSize w:val="1"/>
+      <w:tblStyleColBandSize w:val="1"/>
+      <w:tblBorders>
+        <w:top w:val="single" w:sz="4" w:space="0" w:color="666666" w:themeColor="text1" w:themeTint="99"/>
+        <w:bottom w:val="single" w:sz="4" w:space="0" w:color="666666" w:themeColor="text1" w:themeTint="99"/>
+        <w:insideH w:val="single" w:sz="4" w:space="0" w:color="666666" w:themeColor="text1" w:themeTint="99"/>
+      </w:tblBorders>
+    </w:tblPr>
+    <w:tblStylePr w:type="firstRow">
+      <w:rPr>
+        <w:b/>
+        <w:bCs/>
+      </w:rPr>
+    </w:tblStylePr>
+    <w:tblStylePr w:type="lastRow">
+      <w:rPr>
+        <w:b/>
+        <w:bCs/>
+      </w:rPr>
+    </w:tblStylePr>
+    <w:tblStylePr w:type="firstCol">
+      <w:rPr>
+        <w:b/>
+        <w:bCs/>
+      </w:rPr>
+    </w:tblStylePr>
+    <w:tblStylePr w:type="lastCol">
+      <w:rPr>
+        <w:b/>
+        <w:bCs/>
+      </w:rPr>
+    </w:tblStylePr>
+    <w:tblStylePr w:type="band1Vert">
+      <w:tblPr/>
+      <w:tcPr>
+        <w:shd w:val="clear" w:color="auto" w:fill="CCCCCC" w:themeFill="text1" w:themeFillTint="33"/>
+      </w:tcPr>
+    </w:tblStylePr>
+    <w:tblStylePr w:type="band1Horz">
+      <w:tblPr/>
+      <w:tcPr>
+        <w:shd w:val="clear" w:color="auto" w:fill="CCCCCC" w:themeFill="text1" w:themeFillTint="33"/>
+      </w:tcPr>
+    </w:tblStylePr>
+  </w:style>
+  <w:style w:type="table" w:styleId="ListTable3">
+    <w:name w:val="List Table 3"/>
+    <w:basedOn w:val="TableNormal"/>
+    <w:uiPriority w:val="48"/>
+    <w:rsid w:val="00BD1F16"/>
+    <w:pPr>
+      <w:spacing w:after="0" w:line="240" w:lineRule="auto"/>
+    </w:pPr>
+    <w:tblPr>
+      <w:tblStyleRowBandSize w:val="1"/>
+      <w:tblStyleColBandSize w:val="1"/>
+      <w:tblBorders>
+        <w:top w:val="single" w:sz="4" w:space="0" w:color="000000" w:themeColor="text1"/>
+        <w:left w:val="single" w:sz="4" w:space="0" w:color="000000" w:themeColor="text1"/>
+        <w:bottom w:val="single" w:sz="4" w:space="0" w:color="000000" w:themeColor="text1"/>
+        <w:right w:val="single" w:sz="4" w:space="0" w:color="000000" w:themeColor="text1"/>
+      </w:tblBorders>
+    </w:tblPr>
+    <w:tblStylePr w:type="firstRow">
+      <w:rPr>
+        <w:b/>
+        <w:bCs/>
+        <w:color w:val="FFFFFF" w:themeColor="background1"/>
+      </w:rPr>
+      <w:tblPr/>
+      <w:tcPr>
+        <w:shd w:val="clear" w:color="auto" w:fill="000000" w:themeFill="text1"/>
+      </w:tcPr>
+    </w:tblStylePr>
+    <w:tblStylePr w:type="lastRow">
+      <w:rPr>
+        <w:b/>
+        <w:bCs/>
+      </w:rPr>
+      <w:tblPr/>
+      <w:tcPr>
+        <w:tcBorders>
+          <w:top w:val="double" w:sz="4" w:space="0" w:color="000000" w:themeColor="text1"/>
+        </w:tcBorders>
+        <w:shd w:val="clear" w:color="auto" w:fill="FFFFFF" w:themeFill="background1"/>
+      </w:tcPr>
+    </w:tblStylePr>
+    <w:tblStylePr w:type="firstCol">
+      <w:rPr>
+        <w:b/>
+        <w:bCs/>
+      </w:rPr>
+      <w:tblPr/>
+      <w:tcPr>
+        <w:tcBorders>
+          <w:right w:val="nil"/>
+        </w:tcBorders>
+        <w:shd w:val="clear" w:color="auto" w:fill="FFFFFF" w:themeFill="background1"/>
+      </w:tcPr>
+    </w:tblStylePr>
+    <w:tblStylePr w:type="lastCol">
+      <w:rPr>
+        <w:b/>
+        <w:bCs/>
+      </w:rPr>
+      <w:tblPr/>
+      <w:tcPr>
+        <w:tcBorders>
+          <w:left w:val="nil"/>
+        </w:tcBorders>
+        <w:shd w:val="clear" w:color="auto" w:fill="FFFFFF" w:themeFill="background1"/>
+      </w:tcPr>
+    </w:tblStylePr>
+    <w:tblStylePr w:type="band1Vert">
+      <w:tblPr/>
+      <w:tcPr>
+        <w:tcBorders>
+          <w:left w:val="single" w:sz="4" w:space="0" w:color="000000" w:themeColor="text1"/>
+          <w:right w:val="single" w:sz="4" w:space="0" w:color="000000" w:themeColor="text1"/>
+        </w:tcBorders>
+      </w:tcPr>
+    </w:tblStylePr>
+    <w:tblStylePr w:type="band1Horz">
+      <w:tblPr/>
+      <w:tcPr>
+        <w:tcBorders>
+          <w:top w:val="single" w:sz="4" w:space="0" w:color="000000" w:themeColor="text1"/>
+          <w:bottom w:val="single" w:sz="4" w:space="0" w:color="000000" w:themeColor="text1"/>
+          <w:insideH w:val="nil"/>
+        </w:tcBorders>
+      </w:tcPr>
+    </w:tblStylePr>
+    <w:tblStylePr w:type="neCell">
+      <w:tblPr/>
+      <w:tcPr>
+        <w:tcBorders>
+          <w:left w:val="nil"/>
+          <w:bottom w:val="nil"/>
+        </w:tcBorders>
+      </w:tcPr>
+    </w:tblStylePr>
+    <w:tblStylePr w:type="nwCell">
+      <w:tblPr/>
+      <w:tcPr>
+        <w:tcBorders>
+          <w:bottom w:val="nil"/>
+          <w:right w:val="nil"/>
+        </w:tcBorders>
+      </w:tcPr>
+    </w:tblStylePr>
+    <w:tblStylePr w:type="seCell">
+      <w:tblPr/>
+      <w:tcPr>
+        <w:tcBorders>
+          <w:top w:val="double" w:sz="4" w:space="0" w:color="000000" w:themeColor="text1"/>
+          <w:left w:val="nil"/>
+        </w:tcBorders>
+      </w:tcPr>
+    </w:tblStylePr>
+    <w:tblStylePr w:type="swCell">
+      <w:tblPr/>
+      <w:tcPr>
+        <w:tcBorders>
+          <w:top w:val="double" w:sz="4" w:space="0" w:color="000000" w:themeColor="text1"/>
+          <w:right w:val="nil"/>
+        </w:tcBorders>
+      </w:tcPr>
+    </w:tblStylePr>
+  </w:style>
+  <w:style w:type="table" w:styleId="ListTable4-Accent1">
+    <w:name w:val="List Table 4 Accent 1"/>
+    <w:basedOn w:val="TableNormal"/>
+    <w:uiPriority w:val="49"/>
+    <w:rsid w:val="00BD1F16"/>
+    <w:pPr>
+      <w:spacing w:after="0" w:line="240" w:lineRule="auto"/>
+    </w:pPr>
+    <w:tblPr>
+      <w:tblStyleRowBandSize w:val="1"/>
+      <w:tblStyleColBandSize w:val="1"/>
+      <w:tblBorders>
+        <w:top w:val="single" w:sz="4" w:space="0" w:color="45B0E1" w:themeColor="accent1" w:themeTint="99"/>
+        <w:left w:val="single" w:sz="4" w:space="0" w:color="45B0E1" w:themeColor="accent1" w:themeTint="99"/>
+        <w:bottom w:val="single" w:sz="4" w:space="0" w:color="45B0E1" w:themeColor="accent1" w:themeTint="99"/>
+        <w:right w:val="single" w:sz="4" w:space="0" w:color="45B0E1" w:themeColor="accent1" w:themeTint="99"/>
+        <w:insideH w:val="single" w:sz="4" w:space="0" w:color="45B0E1" w:themeColor="accent1" w:themeTint="99"/>
+      </w:tblBorders>
+    </w:tblPr>
+    <w:tblStylePr w:type="firstRow">
+      <w:rPr>
+        <w:b/>
+        <w:bCs/>
+        <w:color w:val="FFFFFF" w:themeColor="background1"/>
+      </w:rPr>
+      <w:tblPr/>
+      <w:tcPr>
+        <w:tcBorders>
+          <w:top w:val="single" w:sz="4" w:space="0" w:color="156082" w:themeColor="accent1"/>
+          <w:left w:val="single" w:sz="4" w:space="0" w:color="156082" w:themeColor="accent1"/>
+          <w:bottom w:val="single" w:sz="4" w:space="0" w:color="156082" w:themeColor="accent1"/>
+          <w:right w:val="single" w:sz="4" w:space="0" w:color="156082" w:themeColor="accent1"/>
+          <w:insideH w:val="nil"/>
+        </w:tcBorders>
+        <w:shd w:val="clear" w:color="auto" w:fill="156082" w:themeFill="accent1"/>
+      </w:tcPr>
+    </w:tblStylePr>
+    <w:tblStylePr w:type="lastRow">
+      <w:rPr>
+        <w:b/>
+        <w:bCs/>
+      </w:rPr>
+      <w:tblPr/>
+      <w:tcPr>
+        <w:tcBorders>
+          <w:top w:val="double" w:sz="4" w:space="0" w:color="45B0E1" w:themeColor="accent1" w:themeTint="99"/>
+        </w:tcBorders>
+      </w:tcPr>
+    </w:tblStylePr>
+    <w:tblStylePr w:type="firstCol">
+      <w:rPr>
+        <w:b/>
+        <w:bCs/>
+      </w:rPr>
+    </w:tblStylePr>
+    <w:tblStylePr w:type="lastCol">
+      <w:rPr>
+        <w:b/>
+        <w:bCs/>
+      </w:rPr>
+    </w:tblStylePr>
+    <w:tblStylePr w:type="band1Vert">
+      <w:tblPr/>
+      <w:tcPr>
+        <w:shd w:val="clear" w:color="auto" w:fill="C1E4F5" w:themeFill="accent1" w:themeFillTint="33"/>
+      </w:tcPr>
+    </w:tblStylePr>
+    <w:tblStylePr w:type="band1Horz">
+      <w:tblPr/>
+      <w:tcPr>
+        <w:shd w:val="clear" w:color="auto" w:fill="C1E4F5" w:themeFill="accent1" w:themeFillTint="33"/>
+      </w:tcPr>
+    </w:tblStylePr>
   </w:style>
 </w:styles>
 </file>

</xml_diff>